<commit_message>
Update return template and standard examples to v2
</commit_message>
<xml_diff>
--- a/codex-skill/assets/return-template.docx
+++ b/codex-skill/assets/return-template.docx
@@ -111,7 +111,7 @@
           <w:sz w:val="28"/>
           <w:szCs w:val="28"/>
         </w:rPr>
-        <w:t>下記、A、Bの</w:t>
+        <w:t>下記、A、B、Cの</w:t>
       </w:r>
       <w:r>
         <w:rPr>
@@ -248,7 +248,7 @@
           <w:sz w:val="21"/>
           <w:szCs w:val="21"/>
         </w:rPr>
-        <w:t>Bは文末に記載</w:t>
+        <w:t>B,Cは文末に記載</w:t>
       </w:r>
       <w:r>
         <w:rPr>
@@ -344,6 +344,15 @@
                 <w:szCs w:val="21"/>
               </w:rPr>
             </w:pPr>
+            <w:r>
+              <w:rPr>
+                <w:rFonts w:asciiTheme="minorHAnsi" w:eastAsiaTheme="minorHAnsi" w:hAnsiTheme="minorHAnsi" w:hint="eastAsia"/>
+                <w:color w:val="FF0000"/>
+                <w:sz w:val="21"/>
+                <w:szCs w:val="21"/>
+              </w:rPr>
+              <w:t>すべての書類で同一の研究課題名としてください。</w:t>
+            </w:r>
           </w:p>
         </w:tc>
       </w:tr>
@@ -542,7 +551,70 @@
                 <w:sz w:val="21"/>
                 <w:szCs w:val="21"/>
               </w:rPr>
-              <w:t>前回の申請では個人情報管理責任者が設置されていました。本項目に追記するか、変更・削除する場合は「変更対比表」に記載して下さい。</w:t>
+              <w:t>個人情報管理責任者</w:t>
+            </w:r>
+            <w:r>
+              <w:rPr>
+                <w:rFonts w:asciiTheme="minorHAnsi" w:eastAsiaTheme="minorHAnsi" w:hAnsiTheme="minorHAnsi" w:hint="eastAsia"/>
+                <w:color w:val="FF0000"/>
+                <w:sz w:val="21"/>
+                <w:szCs w:val="21"/>
+              </w:rPr>
+              <w:t>を研究責任者と別に</w:t>
+            </w:r>
+            <w:r>
+              <w:rPr>
+                <w:rFonts w:asciiTheme="minorHAnsi" w:eastAsiaTheme="minorHAnsi" w:hAnsiTheme="minorHAnsi" w:hint="eastAsia"/>
+                <w:color w:val="FF0000"/>
+                <w:sz w:val="21"/>
+                <w:szCs w:val="21"/>
+              </w:rPr>
+              <w:t>設置</w:t>
+            </w:r>
+            <w:r>
+              <w:rPr>
+                <w:rFonts w:asciiTheme="minorHAnsi" w:eastAsiaTheme="minorHAnsi" w:hAnsiTheme="minorHAnsi" w:hint="eastAsia"/>
+                <w:color w:val="FF0000"/>
+                <w:sz w:val="21"/>
+                <w:szCs w:val="21"/>
+              </w:rPr>
+              <w:t>する場合は、ここに記載してください。その場合、</w:t>
+            </w:r>
+            <w:r>
+              <w:rPr>
+                <w:rFonts w:asciiTheme="minorHAnsi" w:eastAsiaTheme="minorHAnsi" w:hAnsiTheme="minorHAnsi"/>
+                <w:color w:val="FF0000"/>
+                <w:sz w:val="21"/>
+                <w:szCs w:val="21"/>
+              </w:rPr>
+              <w:t>”</w:t>
+            </w:r>
+            <w:r>
+              <w:rPr>
+                <w:rFonts w:asciiTheme="minorHAnsi" w:eastAsiaTheme="minorHAnsi" w:hAnsiTheme="minorHAnsi"/>
+                <w:color w:val="FF0000"/>
+                <w:sz w:val="21"/>
+                <w:szCs w:val="21"/>
+              </w:rPr>
+              <w:t>25. 個人情報等の取り扱い</w:t>
+            </w:r>
+            <w:r>
+              <w:rPr>
+                <w:rFonts w:asciiTheme="minorHAnsi" w:eastAsiaTheme="minorHAnsi" w:hAnsiTheme="minorHAnsi"/>
+                <w:color w:val="FF0000"/>
+                <w:sz w:val="21"/>
+                <w:szCs w:val="21"/>
+              </w:rPr>
+              <w:t>”</w:t>
+            </w:r>
+            <w:r>
+              <w:rPr>
+                <w:rFonts w:asciiTheme="minorHAnsi" w:eastAsiaTheme="minorHAnsi" w:hAnsiTheme="minorHAnsi" w:hint="eastAsia"/>
+                <w:color w:val="FF0000"/>
+                <w:sz w:val="21"/>
+                <w:szCs w:val="21"/>
+              </w:rPr>
+              <w:t>でも個人情報管理責任者を選択してください。</w:t>
             </w:r>
           </w:p>
         </w:tc>
@@ -607,22 +679,59 @@
               <w:ind w:leftChars="-29" w:left="-64"/>
               <w:contextualSpacing/>
               <w:mirrorIndents/>
-              <w:jc w:val="both"/>
-              <w:rPr>
-                <w:rFonts w:asciiTheme="minorHAnsi" w:eastAsiaTheme="minorHAnsi" w:hAnsiTheme="minorHAnsi"/>
-                <w:color w:val="FF0000"/>
-                <w:sz w:val="21"/>
-                <w:szCs w:val="21"/>
-              </w:rPr>
-            </w:pPr>
-            <w:r>
-              <w:rPr>
-                <w:rFonts w:asciiTheme="minorHAnsi" w:eastAsiaTheme="minorHAnsi" w:hAnsiTheme="minorHAnsi" w:hint="eastAsia"/>
-                <w:color w:val="FF0000"/>
-                <w:sz w:val="21"/>
-                <w:szCs w:val="21"/>
-              </w:rPr>
-              <w:t>研究責任者以外で連絡を必要とする担当者を記載してください。研究責任者以外または研究責任者の</w:t>
+              <w:rPr>
+                <w:rFonts w:asciiTheme="minorHAnsi" w:eastAsiaTheme="minorHAnsi" w:hAnsiTheme="minorHAnsi"/>
+                <w:color w:val="FF0000"/>
+                <w:sz w:val="21"/>
+                <w:szCs w:val="21"/>
+              </w:rPr>
+            </w:pPr>
+            <w:r>
+              <w:rPr>
+                <w:rFonts w:asciiTheme="minorHAnsi" w:eastAsiaTheme="minorHAnsi" w:hAnsiTheme="minorHAnsi" w:hint="eastAsia"/>
+                <w:color w:val="FF0000"/>
+                <w:sz w:val="21"/>
+                <w:szCs w:val="21"/>
+              </w:rPr>
+              <w:t>研究責任者</w:t>
+            </w:r>
+            <w:r>
+              <w:rPr>
+                <w:rFonts w:asciiTheme="minorHAnsi" w:eastAsiaTheme="minorHAnsi" w:hAnsiTheme="minorHAnsi" w:hint="eastAsia"/>
+                <w:b/>
+                <w:bCs/>
+                <w:color w:val="FF0000"/>
+                <w:sz w:val="21"/>
+                <w:szCs w:val="21"/>
+              </w:rPr>
+              <w:t>以外</w:t>
+            </w:r>
+            <w:r>
+              <w:rPr>
+                <w:rFonts w:asciiTheme="minorHAnsi" w:eastAsiaTheme="minorHAnsi" w:hAnsiTheme="minorHAnsi" w:hint="eastAsia"/>
+                <w:color w:val="FF0000"/>
+                <w:sz w:val="21"/>
+                <w:szCs w:val="21"/>
+              </w:rPr>
+              <w:t>で連絡を必要とする担当者を記載してください。</w:t>
+            </w:r>
+            <w:r>
+              <w:rPr>
+                <w:rFonts w:asciiTheme="minorHAnsi" w:eastAsiaTheme="minorHAnsi" w:hAnsiTheme="minorHAnsi"/>
+                <w:color w:val="FF0000"/>
+                <w:sz w:val="21"/>
+                <w:szCs w:val="21"/>
+              </w:rPr>
+              <w:br/>
+            </w:r>
+            <w:r>
+              <w:rPr>
+                <w:rFonts w:asciiTheme="minorHAnsi" w:eastAsiaTheme="minorHAnsi" w:hAnsiTheme="minorHAnsi" w:hint="eastAsia"/>
+                <w:color w:val="FF0000"/>
+                <w:sz w:val="21"/>
+                <w:szCs w:val="21"/>
+              </w:rPr>
+              <w:t>研究責任者以外または研究責任者の</w:t>
             </w:r>
             <w:r>
               <w:rPr>
@@ -640,7 +749,34 @@
                 <w:sz w:val="21"/>
                 <w:szCs w:val="21"/>
               </w:rPr>
-              <w:t>以外のメールアドレスに連絡が必要な場合にご記載ください。いない場合は空欄で構いません。</w:t>
+              <w:t>以外のメールアドレスに連絡が必要な場合にご記載ください。</w:t>
+            </w:r>
+            <w:r>
+              <w:rPr>
+                <w:rFonts w:asciiTheme="minorHAnsi" w:eastAsiaTheme="minorHAnsi" w:hAnsiTheme="minorHAnsi"/>
+                <w:color w:val="FF0000"/>
+                <w:sz w:val="21"/>
+                <w:szCs w:val="21"/>
+              </w:rPr>
+              <w:br/>
+            </w:r>
+            <w:r>
+              <w:rPr>
+                <w:rFonts w:asciiTheme="minorHAnsi" w:eastAsiaTheme="minorHAnsi" w:hAnsiTheme="minorHAnsi" w:hint="eastAsia"/>
+                <w:color w:val="FF0000"/>
+                <w:sz w:val="21"/>
+                <w:szCs w:val="21"/>
+              </w:rPr>
+              <w:t>特に</w:t>
+            </w:r>
+            <w:r>
+              <w:rPr>
+                <w:rFonts w:asciiTheme="minorHAnsi" w:eastAsiaTheme="minorHAnsi" w:hAnsiTheme="minorHAnsi" w:hint="eastAsia"/>
+                <w:color w:val="FF0000"/>
+                <w:sz w:val="21"/>
+                <w:szCs w:val="21"/>
+              </w:rPr>
+              <w:t>ない場合は空欄で構いません。</w:t>
             </w:r>
           </w:p>
         </w:tc>
@@ -1194,6 +1330,15 @@
                 <w:szCs w:val="21"/>
               </w:rPr>
             </w:pPr>
+            <w:r>
+              <w:rPr>
+                <w:rFonts w:asciiTheme="minorHAnsi" w:eastAsiaTheme="minorHAnsi" w:hAnsiTheme="minorHAnsi" w:hint="eastAsia"/>
+                <w:color w:val="FF0000"/>
+                <w:sz w:val="21"/>
+                <w:szCs w:val="21"/>
+              </w:rPr>
+              <w:t>目的と意義を分けて記載してください。</w:t>
+            </w:r>
           </w:p>
         </w:tc>
       </w:tr>
@@ -1287,24 +1432,17 @@
                 <w:sz w:val="21"/>
                 <w:szCs w:val="21"/>
               </w:rPr>
-              <w:t>全体の予定数はいくつでしょうか？全員昭和での患者さんに思えますので、</w:t>
-            </w:r>
-          </w:p>
-          <w:p>
-            <w:pPr>
-              <w:snapToGrid w:val="0"/>
-              <w:spacing w:after="0" w:line="240" w:lineRule="auto"/>
-              <w:ind w:leftChars="-29" w:left="-64"/>
-              <w:contextualSpacing/>
-              <w:mirrorIndents/>
-              <w:jc w:val="both"/>
-              <w:rPr>
-                <w:rFonts w:asciiTheme="minorHAnsi" w:eastAsiaTheme="minorHAnsi" w:hAnsiTheme="minorHAnsi"/>
+              <w:t>本研究の昭和医大がで実施する</w:t>
+            </w:r>
+            <w:r>
+              <w:rPr>
+                <w:rFonts w:asciiTheme="minorHAnsi" w:eastAsiaTheme="minorHAnsi" w:hAnsiTheme="minorHAnsi" w:hint="eastAsia"/>
                 <w:color w:val="EE0000"/>
                 <w:sz w:val="21"/>
                 <w:szCs w:val="21"/>
               </w:rPr>
-            </w:pPr>
+              <w:t>予定数</w:t>
+            </w:r>
             <w:r>
               <w:rPr>
                 <w:rFonts w:asciiTheme="minorHAnsi" w:eastAsiaTheme="minorHAnsi" w:hAnsiTheme="minorHAnsi" w:hint="eastAsia"/>
@@ -1312,7 +1450,7 @@
                 <w:sz w:val="21"/>
                 <w:szCs w:val="21"/>
               </w:rPr>
-              <w:t>下記のような記載になるのではと思っています。</w:t>
+              <w:t>と、多施設共同研究の場合は、全体の数を記載してください。</w:t>
             </w:r>
           </w:p>
           <w:p>
@@ -1337,7 +1475,7 @@
                 <w:sz w:val="21"/>
                 <w:szCs w:val="21"/>
               </w:rPr>
-              <w:t>昭和医科大学における予定対象者数： 300</w:t>
+              <w:t>例</w:t>
             </w:r>
           </w:p>
           <w:p>
@@ -1362,7 +1500,50 @@
                 <w:sz w:val="21"/>
                 <w:szCs w:val="21"/>
               </w:rPr>
-              <w:t>多機関共同研究の場合全体の予定対象者数：300</w:t>
+              <w:t>昭和医科大学における予定対象者数： 30</w:t>
+            </w:r>
+          </w:p>
+          <w:p>
+            <w:pPr>
+              <w:snapToGrid w:val="0"/>
+              <w:spacing w:after="0" w:line="240" w:lineRule="auto"/>
+              <w:ind w:leftChars="-29" w:left="-64"/>
+              <w:contextualSpacing/>
+              <w:mirrorIndents/>
+              <w:jc w:val="both"/>
+              <w:rPr>
+                <w:rFonts w:asciiTheme="minorHAnsi" w:eastAsiaTheme="minorHAnsi" w:hAnsiTheme="minorHAnsi"/>
+                <w:color w:val="EE0000"/>
+                <w:sz w:val="21"/>
+                <w:szCs w:val="21"/>
+              </w:rPr>
+            </w:pPr>
+            <w:r>
+              <w:rPr>
+                <w:rFonts w:asciiTheme="minorHAnsi" w:eastAsiaTheme="minorHAnsi" w:hAnsiTheme="minorHAnsi" w:hint="eastAsia"/>
+                <w:color w:val="EE0000"/>
+                <w:sz w:val="21"/>
+                <w:szCs w:val="21"/>
+              </w:rPr>
+              <w:t>多機関共同研究の場合全体の予定対象者数：</w:t>
+            </w:r>
+            <w:r>
+              <w:rPr>
+                <w:rFonts w:asciiTheme="minorHAnsi" w:eastAsiaTheme="minorHAnsi" w:hAnsiTheme="minorHAnsi" w:hint="eastAsia"/>
+                <w:color w:val="EE0000"/>
+                <w:sz w:val="21"/>
+                <w:szCs w:val="21"/>
+              </w:rPr>
+              <w:t>9</w:t>
+            </w:r>
+            <w:r>
+              <w:rPr>
+                <w:rFonts w:asciiTheme="minorHAnsi" w:eastAsiaTheme="minorHAnsi" w:hAnsiTheme="minorHAnsi" w:hint="eastAsia"/>
+                <w:color w:val="EE0000"/>
+                <w:sz w:val="21"/>
+                <w:szCs w:val="21"/>
+              </w:rPr>
+              <w:t>0</w:t>
             </w:r>
           </w:p>
           <w:p>
@@ -1514,6 +1695,73 @@
                 <w:sz w:val="21"/>
                 <w:szCs w:val="21"/>
               </w:rPr>
+              <w:t>選択基準：</w:t>
+            </w:r>
+          </w:p>
+          <w:p>
+            <w:pPr>
+              <w:snapToGrid w:val="0"/>
+              <w:spacing w:after="0" w:line="240" w:lineRule="auto"/>
+              <w:ind w:leftChars="-29" w:left="-64"/>
+              <w:contextualSpacing/>
+              <w:mirrorIndents/>
+              <w:jc w:val="both"/>
+              <w:rPr>
+                <w:rFonts w:asciiTheme="minorHAnsi" w:eastAsiaTheme="minorHAnsi" w:hAnsiTheme="minorHAnsi"/>
+                <w:color w:val="FF0000"/>
+                <w:sz w:val="21"/>
+                <w:szCs w:val="21"/>
+              </w:rPr>
+            </w:pPr>
+            <w:r>
+              <w:rPr>
+                <w:rFonts w:asciiTheme="minorHAnsi" w:eastAsiaTheme="minorHAnsi" w:hAnsiTheme="minorHAnsi" w:hint="eastAsia"/>
+                <w:color w:val="FF0000"/>
+                <w:sz w:val="21"/>
+                <w:szCs w:val="21"/>
+              </w:rPr>
+              <w:t>どのような条件の人が本研究の対象となるかを記載する部分です。</w:t>
+            </w:r>
+          </w:p>
+          <w:p>
+            <w:pPr>
+              <w:snapToGrid w:val="0"/>
+              <w:spacing w:after="0" w:line="240" w:lineRule="auto"/>
+              <w:ind w:leftChars="-29" w:left="-64"/>
+              <w:contextualSpacing/>
+              <w:mirrorIndents/>
+              <w:jc w:val="both"/>
+              <w:rPr>
+                <w:rFonts w:asciiTheme="minorHAnsi" w:eastAsiaTheme="minorHAnsi" w:hAnsiTheme="minorHAnsi"/>
+                <w:color w:val="FF0000"/>
+                <w:sz w:val="21"/>
+                <w:szCs w:val="21"/>
+              </w:rPr>
+            </w:pPr>
+          </w:p>
+          <w:p>
+            <w:pPr>
+              <w:snapToGrid w:val="0"/>
+              <w:spacing w:after="0" w:line="240" w:lineRule="auto"/>
+              <w:ind w:leftChars="-29" w:left="-64"/>
+              <w:contextualSpacing/>
+              <w:mirrorIndents/>
+              <w:jc w:val="both"/>
+              <w:rPr>
+                <w:rFonts w:asciiTheme="minorHAnsi" w:eastAsiaTheme="minorHAnsi" w:hAnsiTheme="minorHAnsi"/>
+                <w:color w:val="FF0000"/>
+                <w:sz w:val="21"/>
+                <w:szCs w:val="21"/>
+              </w:rPr>
+            </w:pPr>
+            <w:r>
+              <w:rPr>
+                <w:rFonts w:asciiTheme="minorHAnsi" w:eastAsiaTheme="minorHAnsi" w:hAnsiTheme="minorHAnsi" w:hint="eastAsia"/>
+                <w:color w:val="FF0000"/>
+                <w:sz w:val="21"/>
+                <w:szCs w:val="21"/>
+              </w:rPr>
+              <w:lastRenderedPageBreak/>
               <w:t>除外基準：</w:t>
             </w:r>
           </w:p>
@@ -1541,6 +1789,385 @@
               </w:rPr>
               <w:t>除外基準は、選択基準に合致する研究対象者候補のうち、特定の条件により研究対象から除外するための基準です。</w:t>
             </w:r>
+          </w:p>
+          <w:p>
+            <w:pPr>
+              <w:snapToGrid w:val="0"/>
+              <w:spacing w:after="0" w:line="240" w:lineRule="auto"/>
+              <w:ind w:leftChars="-29" w:left="-64"/>
+              <w:contextualSpacing/>
+              <w:mirrorIndents/>
+              <w:jc w:val="both"/>
+              <w:rPr>
+                <w:rFonts w:asciiTheme="minorHAnsi" w:eastAsiaTheme="minorHAnsi" w:hAnsiTheme="minorHAnsi"/>
+                <w:color w:val="FF0000"/>
+                <w:sz w:val="21"/>
+                <w:szCs w:val="21"/>
+              </w:rPr>
+            </w:pPr>
+            <w:r>
+              <w:rPr>
+                <w:rFonts w:asciiTheme="minorHAnsi" w:eastAsiaTheme="minorHAnsi" w:hAnsiTheme="minorHAnsi" w:hint="eastAsia"/>
+                <w:color w:val="FF0000"/>
+                <w:sz w:val="21"/>
+                <w:szCs w:val="21"/>
+              </w:rPr>
+              <w:t>記載例）</w:t>
+            </w:r>
+          </w:p>
+          <w:p>
+            <w:pPr>
+              <w:snapToGrid w:val="0"/>
+              <w:spacing w:after="0" w:line="240" w:lineRule="auto"/>
+              <w:ind w:leftChars="-29" w:left="-64"/>
+              <w:contextualSpacing/>
+              <w:mirrorIndents/>
+              <w:jc w:val="both"/>
+              <w:rPr>
+                <w:rFonts w:asciiTheme="minorHAnsi" w:eastAsiaTheme="minorHAnsi" w:hAnsiTheme="minorHAnsi"/>
+                <w:color w:val="FF0000"/>
+                <w:sz w:val="21"/>
+                <w:szCs w:val="21"/>
+              </w:rPr>
+            </w:pPr>
+            <w:r>
+              <w:rPr>
+                <w:rFonts w:asciiTheme="minorHAnsi" w:eastAsiaTheme="minorHAnsi" w:hAnsiTheme="minorHAnsi" w:hint="eastAsia"/>
+                <w:color w:val="FF0000"/>
+                <w:sz w:val="21"/>
+                <w:szCs w:val="21"/>
+              </w:rPr>
+              <w:t>・</w:t>
+            </w:r>
+            <w:r>
+              <w:rPr>
+                <w:rFonts w:asciiTheme="minorHAnsi" w:eastAsiaTheme="minorHAnsi" w:hAnsiTheme="minorHAnsi" w:hint="eastAsia"/>
+                <w:color w:val="FF0000"/>
+                <w:sz w:val="21"/>
+                <w:szCs w:val="21"/>
+              </w:rPr>
+              <w:t>選択基準</w:t>
+            </w:r>
+          </w:p>
+          <w:p>
+            <w:pPr>
+              <w:snapToGrid w:val="0"/>
+              <w:spacing w:after="0" w:line="240" w:lineRule="auto"/>
+              <w:ind w:leftChars="-29" w:left="-64"/>
+              <w:contextualSpacing/>
+              <w:mirrorIndents/>
+              <w:jc w:val="both"/>
+              <w:rPr>
+                <w:rFonts w:asciiTheme="minorHAnsi" w:eastAsiaTheme="minorHAnsi" w:hAnsiTheme="minorHAnsi"/>
+                <w:color w:val="FF0000"/>
+                <w:sz w:val="21"/>
+                <w:szCs w:val="21"/>
+              </w:rPr>
+            </w:pPr>
+            <w:r>
+              <w:rPr>
+                <w:rFonts w:asciiTheme="minorHAnsi" w:eastAsiaTheme="minorHAnsi" w:hAnsiTheme="minorHAnsi" w:hint="eastAsia"/>
+                <w:color w:val="FF0000"/>
+                <w:sz w:val="21"/>
+                <w:szCs w:val="21"/>
+              </w:rPr>
+              <w:t>以下のすべてを満たす患者を対象とする。</w:t>
+            </w:r>
+          </w:p>
+          <w:p>
+            <w:pPr>
+              <w:snapToGrid w:val="0"/>
+              <w:spacing w:after="0" w:line="240" w:lineRule="auto"/>
+              <w:ind w:leftChars="-29" w:left="-64"/>
+              <w:contextualSpacing/>
+              <w:mirrorIndents/>
+              <w:jc w:val="both"/>
+              <w:rPr>
+                <w:rFonts w:asciiTheme="minorHAnsi" w:eastAsiaTheme="minorHAnsi" w:hAnsiTheme="minorHAnsi"/>
+                <w:color w:val="FF0000"/>
+                <w:sz w:val="21"/>
+                <w:szCs w:val="21"/>
+              </w:rPr>
+            </w:pPr>
+            <w:r>
+              <w:rPr>
+                <w:rFonts w:asciiTheme="minorHAnsi" w:eastAsiaTheme="minorHAnsi" w:hAnsiTheme="minorHAnsi"/>
+                <w:color w:val="FF0000"/>
+                <w:sz w:val="21"/>
+                <w:szCs w:val="21"/>
+              </w:rPr>
+              <w:t xml:space="preserve">1. </w:t>
+            </w:r>
+            <w:r>
+              <w:rPr>
+                <w:rFonts w:asciiTheme="minorHAnsi" w:eastAsiaTheme="minorHAnsi" w:hAnsiTheme="minorHAnsi" w:hint="eastAsia"/>
+                <w:color w:val="FF0000"/>
+                <w:sz w:val="21"/>
+                <w:szCs w:val="21"/>
+              </w:rPr>
+              <w:t>高血圧と診断されている患者。</w:t>
+            </w:r>
+          </w:p>
+          <w:p>
+            <w:pPr>
+              <w:snapToGrid w:val="0"/>
+              <w:spacing w:after="0" w:line="240" w:lineRule="auto"/>
+              <w:ind w:leftChars="-29" w:left="-64"/>
+              <w:contextualSpacing/>
+              <w:mirrorIndents/>
+              <w:jc w:val="both"/>
+              <w:rPr>
+                <w:rFonts w:asciiTheme="minorHAnsi" w:eastAsiaTheme="minorHAnsi" w:hAnsiTheme="minorHAnsi"/>
+                <w:color w:val="FF0000"/>
+                <w:sz w:val="21"/>
+                <w:szCs w:val="21"/>
+              </w:rPr>
+            </w:pPr>
+            <w:r>
+              <w:rPr>
+                <w:rFonts w:asciiTheme="minorHAnsi" w:eastAsiaTheme="minorHAnsi" w:hAnsiTheme="minorHAnsi"/>
+                <w:color w:val="FF0000"/>
+                <w:sz w:val="21"/>
+                <w:szCs w:val="21"/>
+              </w:rPr>
+              <w:t xml:space="preserve">2. </w:t>
+            </w:r>
+            <w:r>
+              <w:rPr>
+                <w:rFonts w:asciiTheme="minorHAnsi" w:eastAsiaTheme="minorHAnsi" w:hAnsiTheme="minorHAnsi" w:hint="eastAsia"/>
+                <w:color w:val="FF0000"/>
+                <w:sz w:val="21"/>
+                <w:szCs w:val="21"/>
+              </w:rPr>
+              <w:t>同意取得時の年齢が</w:t>
+            </w:r>
+            <w:r>
+              <w:rPr>
+                <w:rFonts w:asciiTheme="minorHAnsi" w:eastAsiaTheme="minorHAnsi" w:hAnsiTheme="minorHAnsi"/>
+                <w:color w:val="FF0000"/>
+                <w:sz w:val="21"/>
+                <w:szCs w:val="21"/>
+              </w:rPr>
+              <w:t>18</w:t>
+            </w:r>
+            <w:r>
+              <w:rPr>
+                <w:rFonts w:asciiTheme="minorHAnsi" w:eastAsiaTheme="minorHAnsi" w:hAnsiTheme="minorHAnsi" w:hint="eastAsia"/>
+                <w:color w:val="FF0000"/>
+                <w:sz w:val="21"/>
+                <w:szCs w:val="21"/>
+              </w:rPr>
+              <w:t>歳以上の患者。</w:t>
+            </w:r>
+          </w:p>
+          <w:p>
+            <w:pPr>
+              <w:snapToGrid w:val="0"/>
+              <w:spacing w:after="0" w:line="240" w:lineRule="auto"/>
+              <w:ind w:leftChars="-29" w:left="-64"/>
+              <w:contextualSpacing/>
+              <w:mirrorIndents/>
+              <w:jc w:val="both"/>
+              <w:rPr>
+                <w:rFonts w:asciiTheme="minorHAnsi" w:eastAsiaTheme="minorHAnsi" w:hAnsiTheme="minorHAnsi"/>
+                <w:color w:val="FF0000"/>
+                <w:sz w:val="21"/>
+                <w:szCs w:val="21"/>
+              </w:rPr>
+            </w:pPr>
+            <w:r>
+              <w:rPr>
+                <w:rFonts w:asciiTheme="minorHAnsi" w:eastAsiaTheme="minorHAnsi" w:hAnsiTheme="minorHAnsi"/>
+                <w:color w:val="FF0000"/>
+                <w:sz w:val="21"/>
+                <w:szCs w:val="21"/>
+              </w:rPr>
+              <w:t xml:space="preserve">3. </w:t>
+            </w:r>
+            <w:r>
+              <w:rPr>
+                <w:rFonts w:asciiTheme="minorHAnsi" w:eastAsiaTheme="minorHAnsi" w:hAnsiTheme="minorHAnsi" w:hint="eastAsia"/>
+                <w:color w:val="FF0000"/>
+                <w:sz w:val="21"/>
+                <w:szCs w:val="21"/>
+              </w:rPr>
+              <w:t>本研究への参加について、本人の文書同意が得られた患者。</w:t>
+            </w:r>
+          </w:p>
+          <w:p>
+            <w:pPr>
+              <w:snapToGrid w:val="0"/>
+              <w:spacing w:after="0" w:line="240" w:lineRule="auto"/>
+              <w:ind w:leftChars="-29" w:left="-64"/>
+              <w:contextualSpacing/>
+              <w:mirrorIndents/>
+              <w:jc w:val="both"/>
+              <w:rPr>
+                <w:rFonts w:asciiTheme="minorHAnsi" w:eastAsiaTheme="minorHAnsi" w:hAnsiTheme="minorHAnsi"/>
+                <w:color w:val="FF0000"/>
+                <w:sz w:val="21"/>
+                <w:szCs w:val="21"/>
+              </w:rPr>
+            </w:pPr>
+          </w:p>
+          <w:p>
+            <w:pPr>
+              <w:snapToGrid w:val="0"/>
+              <w:spacing w:after="0" w:line="240" w:lineRule="auto"/>
+              <w:ind w:leftChars="-29" w:left="-64"/>
+              <w:contextualSpacing/>
+              <w:mirrorIndents/>
+              <w:jc w:val="both"/>
+              <w:rPr>
+                <w:rFonts w:asciiTheme="minorHAnsi" w:eastAsiaTheme="minorHAnsi" w:hAnsiTheme="minorHAnsi"/>
+                <w:color w:val="FF0000"/>
+                <w:sz w:val="21"/>
+                <w:szCs w:val="21"/>
+              </w:rPr>
+            </w:pPr>
+            <w:r>
+              <w:rPr>
+                <w:rFonts w:asciiTheme="minorHAnsi" w:eastAsiaTheme="minorHAnsi" w:hAnsiTheme="minorHAnsi" w:hint="eastAsia"/>
+                <w:color w:val="FF0000"/>
+                <w:sz w:val="21"/>
+                <w:szCs w:val="21"/>
+              </w:rPr>
+              <w:t>・</w:t>
+            </w:r>
+            <w:r>
+              <w:rPr>
+                <w:rFonts w:asciiTheme="minorHAnsi" w:eastAsiaTheme="minorHAnsi" w:hAnsiTheme="minorHAnsi" w:hint="eastAsia"/>
+                <w:color w:val="FF0000"/>
+                <w:sz w:val="21"/>
+                <w:szCs w:val="21"/>
+              </w:rPr>
+              <w:t>除外基準</w:t>
+            </w:r>
+          </w:p>
+          <w:p>
+            <w:pPr>
+              <w:snapToGrid w:val="0"/>
+              <w:spacing w:after="0" w:line="240" w:lineRule="auto"/>
+              <w:ind w:leftChars="-29" w:left="-64"/>
+              <w:contextualSpacing/>
+              <w:mirrorIndents/>
+              <w:jc w:val="both"/>
+              <w:rPr>
+                <w:rFonts w:asciiTheme="minorHAnsi" w:eastAsiaTheme="minorHAnsi" w:hAnsiTheme="minorHAnsi"/>
+                <w:color w:val="FF0000"/>
+                <w:sz w:val="21"/>
+                <w:szCs w:val="21"/>
+              </w:rPr>
+            </w:pPr>
+            <w:r>
+              <w:rPr>
+                <w:rFonts w:asciiTheme="minorHAnsi" w:eastAsiaTheme="minorHAnsi" w:hAnsiTheme="minorHAnsi" w:hint="eastAsia"/>
+                <w:color w:val="FF0000"/>
+                <w:sz w:val="21"/>
+                <w:szCs w:val="21"/>
+              </w:rPr>
+              <w:t>以下のいずれかに該当する患者は除外する。</w:t>
+            </w:r>
+          </w:p>
+          <w:p>
+            <w:pPr>
+              <w:snapToGrid w:val="0"/>
+              <w:spacing w:after="0" w:line="240" w:lineRule="auto"/>
+              <w:ind w:leftChars="-29" w:left="-64"/>
+              <w:contextualSpacing/>
+              <w:mirrorIndents/>
+              <w:jc w:val="both"/>
+              <w:rPr>
+                <w:rFonts w:asciiTheme="minorHAnsi" w:eastAsiaTheme="minorHAnsi" w:hAnsiTheme="minorHAnsi"/>
+                <w:color w:val="FF0000"/>
+                <w:sz w:val="21"/>
+                <w:szCs w:val="21"/>
+              </w:rPr>
+            </w:pPr>
+            <w:r>
+              <w:rPr>
+                <w:rFonts w:asciiTheme="minorHAnsi" w:eastAsiaTheme="minorHAnsi" w:hAnsiTheme="minorHAnsi"/>
+                <w:color w:val="FF0000"/>
+                <w:sz w:val="21"/>
+                <w:szCs w:val="21"/>
+              </w:rPr>
+              <w:t xml:space="preserve">1. </w:t>
+            </w:r>
+            <w:r>
+              <w:rPr>
+                <w:rFonts w:asciiTheme="minorHAnsi" w:eastAsiaTheme="minorHAnsi" w:hAnsiTheme="minorHAnsi" w:hint="eastAsia"/>
+                <w:color w:val="FF0000"/>
+                <w:sz w:val="21"/>
+                <w:szCs w:val="21"/>
+              </w:rPr>
+              <w:t>研究薬の成分に対する過敏症の既往がある患者。</w:t>
+            </w:r>
+          </w:p>
+          <w:p>
+            <w:pPr>
+              <w:snapToGrid w:val="0"/>
+              <w:spacing w:after="0" w:line="240" w:lineRule="auto"/>
+              <w:ind w:leftChars="-29" w:left="-64"/>
+              <w:contextualSpacing/>
+              <w:mirrorIndents/>
+              <w:jc w:val="both"/>
+              <w:rPr>
+                <w:rFonts w:asciiTheme="minorHAnsi" w:eastAsiaTheme="minorHAnsi" w:hAnsiTheme="minorHAnsi"/>
+                <w:color w:val="FF0000"/>
+                <w:sz w:val="21"/>
+                <w:szCs w:val="21"/>
+              </w:rPr>
+            </w:pPr>
+            <w:r>
+              <w:rPr>
+                <w:rFonts w:asciiTheme="minorHAnsi" w:eastAsiaTheme="minorHAnsi" w:hAnsiTheme="minorHAnsi"/>
+                <w:color w:val="FF0000"/>
+                <w:sz w:val="21"/>
+                <w:szCs w:val="21"/>
+              </w:rPr>
+              <w:t xml:space="preserve">2. </w:t>
+            </w:r>
+            <w:r>
+              <w:rPr>
+                <w:rFonts w:asciiTheme="minorHAnsi" w:eastAsiaTheme="minorHAnsi" w:hAnsiTheme="minorHAnsi" w:hint="eastAsia"/>
+                <w:color w:val="FF0000"/>
+                <w:sz w:val="21"/>
+                <w:szCs w:val="21"/>
+              </w:rPr>
+              <w:t>研究薬との併用が禁忌とされる薬剤を継続する必要がある患者。</w:t>
+            </w:r>
+          </w:p>
+          <w:p>
+            <w:pPr>
+              <w:snapToGrid w:val="0"/>
+              <w:spacing w:after="0" w:line="240" w:lineRule="auto"/>
+              <w:ind w:leftChars="-29" w:left="-64"/>
+              <w:contextualSpacing/>
+              <w:mirrorIndents/>
+              <w:jc w:val="both"/>
+              <w:rPr>
+                <w:rFonts w:asciiTheme="minorHAnsi" w:eastAsiaTheme="minorHAnsi" w:hAnsiTheme="minorHAnsi"/>
+                <w:color w:val="FF0000"/>
+                <w:sz w:val="21"/>
+                <w:szCs w:val="21"/>
+              </w:rPr>
+            </w:pPr>
+          </w:p>
+          <w:p>
+            <w:pPr>
+              <w:snapToGrid w:val="0"/>
+              <w:spacing w:after="0" w:line="240" w:lineRule="auto"/>
+              <w:ind w:leftChars="-29" w:left="-64"/>
+              <w:contextualSpacing/>
+              <w:mirrorIndents/>
+              <w:jc w:val="both"/>
+              <w:rPr>
+                <w:rFonts w:asciiTheme="minorHAnsi" w:eastAsiaTheme="minorHAnsi" w:hAnsiTheme="minorHAnsi"/>
+                <w:color w:val="FF0000"/>
+                <w:sz w:val="21"/>
+                <w:szCs w:val="21"/>
+              </w:rPr>
+            </w:pPr>
           </w:p>
         </w:tc>
       </w:tr>
@@ -1582,6 +2209,7 @@
                 <w:sz w:val="21"/>
                 <w:szCs w:val="21"/>
               </w:rPr>
+              <w:lastRenderedPageBreak/>
               <w:t>1</w:t>
             </w:r>
             <w:r>
@@ -1627,6 +2255,239 @@
                 <w:szCs w:val="21"/>
               </w:rPr>
             </w:pPr>
+            <w:r>
+              <w:rPr>
+                <w:rFonts w:asciiTheme="minorHAnsi" w:eastAsiaTheme="minorHAnsi" w:hAnsiTheme="minorHAnsi" w:hint="eastAsia"/>
+                <w:color w:val="FF0000"/>
+                <w:sz w:val="21"/>
+                <w:szCs w:val="21"/>
+              </w:rPr>
+              <w:t>「研究の科学的合理性の根拠」は、「なぜこの研究が必要で、この方法なら知りたいことを確かめられるのか」を説明する項目です。</w:t>
+            </w:r>
+          </w:p>
+          <w:p>
+            <w:pPr>
+              <w:snapToGrid w:val="0"/>
+              <w:spacing w:after="0" w:line="240" w:lineRule="auto"/>
+              <w:ind w:leftChars="-29" w:left="-64"/>
+              <w:contextualSpacing/>
+              <w:mirrorIndents/>
+              <w:jc w:val="both"/>
+              <w:rPr>
+                <w:rFonts w:asciiTheme="minorHAnsi" w:eastAsiaTheme="minorHAnsi" w:hAnsiTheme="minorHAnsi"/>
+                <w:color w:val="FF0000"/>
+                <w:sz w:val="21"/>
+                <w:szCs w:val="21"/>
+              </w:rPr>
+            </w:pPr>
+            <w:r>
+              <w:rPr>
+                <w:rFonts w:asciiTheme="minorHAnsi" w:eastAsiaTheme="minorHAnsi" w:hAnsiTheme="minorHAnsi" w:hint="eastAsia"/>
+                <w:color w:val="FF0000"/>
+                <w:sz w:val="21"/>
+                <w:szCs w:val="21"/>
+              </w:rPr>
+              <w:t>次の</w:t>
+            </w:r>
+            <w:r>
+              <w:rPr>
+                <w:rFonts w:asciiTheme="minorHAnsi" w:eastAsiaTheme="minorHAnsi" w:hAnsiTheme="minorHAnsi"/>
+                <w:color w:val="FF0000"/>
+                <w:sz w:val="21"/>
+                <w:szCs w:val="21"/>
+              </w:rPr>
+              <w:t>3</w:t>
+            </w:r>
+            <w:r>
+              <w:rPr>
+                <w:rFonts w:asciiTheme="minorHAnsi" w:eastAsiaTheme="minorHAnsi" w:hAnsiTheme="minorHAnsi" w:hint="eastAsia"/>
+                <w:color w:val="FF0000"/>
+                <w:sz w:val="21"/>
+                <w:szCs w:val="21"/>
+              </w:rPr>
+              <w:t>点を、短くつなげて書くと整理できます。</w:t>
+            </w:r>
+          </w:p>
+          <w:p>
+            <w:pPr>
+              <w:snapToGrid w:val="0"/>
+              <w:spacing w:after="0" w:line="240" w:lineRule="auto"/>
+              <w:ind w:leftChars="-29" w:left="-64"/>
+              <w:contextualSpacing/>
+              <w:mirrorIndents/>
+              <w:jc w:val="both"/>
+              <w:rPr>
+                <w:rFonts w:asciiTheme="minorHAnsi" w:eastAsiaTheme="minorHAnsi" w:hAnsiTheme="minorHAnsi"/>
+                <w:color w:val="FF0000"/>
+                <w:sz w:val="21"/>
+                <w:szCs w:val="21"/>
+              </w:rPr>
+            </w:pPr>
+            <w:r>
+              <w:rPr>
+                <w:rFonts w:asciiTheme="minorHAnsi" w:eastAsiaTheme="minorHAnsi" w:hAnsiTheme="minorHAnsi"/>
+                <w:color w:val="FF0000"/>
+                <w:sz w:val="21"/>
+                <w:szCs w:val="21"/>
+              </w:rPr>
+              <w:t xml:space="preserve">- </w:t>
+            </w:r>
+            <w:r>
+              <w:rPr>
+                <w:rFonts w:asciiTheme="minorHAnsi" w:eastAsiaTheme="minorHAnsi" w:hAnsiTheme="minorHAnsi" w:hint="eastAsia"/>
+                <w:color w:val="FF0000"/>
+                <w:sz w:val="21"/>
+                <w:szCs w:val="21"/>
+              </w:rPr>
+              <w:t>わかっていること：これまでの研究で何がわかっているか。</w:t>
+            </w:r>
+          </w:p>
+          <w:p>
+            <w:pPr>
+              <w:snapToGrid w:val="0"/>
+              <w:spacing w:after="0" w:line="240" w:lineRule="auto"/>
+              <w:ind w:leftChars="-29" w:left="-64"/>
+              <w:contextualSpacing/>
+              <w:mirrorIndents/>
+              <w:jc w:val="both"/>
+              <w:rPr>
+                <w:rFonts w:asciiTheme="minorHAnsi" w:eastAsiaTheme="minorHAnsi" w:hAnsiTheme="minorHAnsi"/>
+                <w:color w:val="FF0000"/>
+                <w:sz w:val="21"/>
+                <w:szCs w:val="21"/>
+              </w:rPr>
+            </w:pPr>
+            <w:r>
+              <w:rPr>
+                <w:rFonts w:asciiTheme="minorHAnsi" w:eastAsiaTheme="minorHAnsi" w:hAnsiTheme="minorHAnsi"/>
+                <w:color w:val="FF0000"/>
+                <w:sz w:val="21"/>
+                <w:szCs w:val="21"/>
+              </w:rPr>
+              <w:t xml:space="preserve">- </w:t>
+            </w:r>
+            <w:r>
+              <w:rPr>
+                <w:rFonts w:asciiTheme="minorHAnsi" w:eastAsiaTheme="minorHAnsi" w:hAnsiTheme="minorHAnsi" w:hint="eastAsia"/>
+                <w:color w:val="FF0000"/>
+                <w:sz w:val="21"/>
+                <w:szCs w:val="21"/>
+              </w:rPr>
+              <w:t>わかっていないこと：何がまだ不明か。</w:t>
+            </w:r>
+          </w:p>
+          <w:p>
+            <w:pPr>
+              <w:snapToGrid w:val="0"/>
+              <w:spacing w:after="0" w:line="240" w:lineRule="auto"/>
+              <w:ind w:leftChars="-29" w:left="-64"/>
+              <w:contextualSpacing/>
+              <w:mirrorIndents/>
+              <w:jc w:val="both"/>
+              <w:rPr>
+                <w:rFonts w:asciiTheme="minorHAnsi" w:eastAsiaTheme="minorHAnsi" w:hAnsiTheme="minorHAnsi"/>
+                <w:color w:val="FF0000"/>
+                <w:sz w:val="21"/>
+                <w:szCs w:val="21"/>
+              </w:rPr>
+            </w:pPr>
+            <w:r>
+              <w:rPr>
+                <w:rFonts w:asciiTheme="minorHAnsi" w:eastAsiaTheme="minorHAnsi" w:hAnsiTheme="minorHAnsi"/>
+                <w:color w:val="FF0000"/>
+                <w:sz w:val="21"/>
+                <w:szCs w:val="21"/>
+              </w:rPr>
+              <w:t xml:space="preserve">- </w:t>
+            </w:r>
+            <w:r>
+              <w:rPr>
+                <w:rFonts w:asciiTheme="minorHAnsi" w:eastAsiaTheme="minorHAnsi" w:hAnsiTheme="minorHAnsi" w:hint="eastAsia"/>
+                <w:color w:val="FF0000"/>
+                <w:sz w:val="21"/>
+                <w:szCs w:val="21"/>
+              </w:rPr>
+              <w:t>確かめる方法：どの対象者を、どのように調べれば、その疑問に答えられるか。</w:t>
+            </w:r>
+          </w:p>
+          <w:p>
+            <w:pPr>
+              <w:snapToGrid w:val="0"/>
+              <w:spacing w:after="0" w:line="240" w:lineRule="auto"/>
+              <w:ind w:leftChars="-29" w:left="-64"/>
+              <w:contextualSpacing/>
+              <w:mirrorIndents/>
+              <w:jc w:val="both"/>
+              <w:rPr>
+                <w:rFonts w:asciiTheme="minorHAnsi" w:eastAsiaTheme="minorHAnsi" w:hAnsiTheme="minorHAnsi" w:hint="eastAsia"/>
+                <w:color w:val="FF0000"/>
+                <w:sz w:val="21"/>
+                <w:szCs w:val="21"/>
+              </w:rPr>
+            </w:pPr>
+            <w:r>
+              <w:rPr>
+                <w:rFonts w:asciiTheme="minorHAnsi" w:eastAsiaTheme="minorHAnsi" w:hAnsiTheme="minorHAnsi" w:hint="eastAsia"/>
+                <w:color w:val="FF0000"/>
+                <w:sz w:val="21"/>
+                <w:szCs w:val="21"/>
+              </w:rPr>
+              <w:t>「</w:t>
+            </w:r>
+            <w:r>
+              <w:rPr>
+                <w:rFonts w:asciiTheme="minorHAnsi" w:eastAsiaTheme="minorHAnsi" w:hAnsiTheme="minorHAnsi" w:hint="eastAsia"/>
+                <w:color w:val="FF0000"/>
+                <w:sz w:val="21"/>
+                <w:szCs w:val="21"/>
+              </w:rPr>
+              <w:t>将来</w:t>
+            </w:r>
+            <w:r>
+              <w:rPr>
+                <w:rFonts w:asciiTheme="minorHAnsi" w:eastAsiaTheme="minorHAnsi" w:hAnsiTheme="minorHAnsi" w:hint="eastAsia"/>
+                <w:color w:val="FF0000"/>
+                <w:sz w:val="21"/>
+                <w:szCs w:val="21"/>
+              </w:rPr>
+              <w:t>役に立つ研究です」だけでなく、研究の疑問と</w:t>
+            </w:r>
+            <w:r>
+              <w:rPr>
+                <w:rFonts w:asciiTheme="minorHAnsi" w:eastAsiaTheme="minorHAnsi" w:hAnsiTheme="minorHAnsi" w:hint="eastAsia"/>
+                <w:color w:val="FF0000"/>
+                <w:sz w:val="21"/>
+                <w:szCs w:val="21"/>
+              </w:rPr>
+              <w:t>明らかにしたいことと、今回の</w:t>
+            </w:r>
+            <w:r>
+              <w:rPr>
+                <w:rFonts w:asciiTheme="minorHAnsi" w:eastAsiaTheme="minorHAnsi" w:hAnsiTheme="minorHAnsi" w:hint="eastAsia"/>
+                <w:color w:val="FF0000"/>
+                <w:sz w:val="21"/>
+                <w:szCs w:val="21"/>
+              </w:rPr>
+              <w:t>方法が結びついている理由を書く</w:t>
+            </w:r>
+            <w:r>
+              <w:rPr>
+                <w:rFonts w:asciiTheme="minorHAnsi" w:eastAsiaTheme="minorHAnsi" w:hAnsiTheme="minorHAnsi" w:hint="eastAsia"/>
+                <w:color w:val="FF0000"/>
+                <w:sz w:val="21"/>
+                <w:szCs w:val="21"/>
+              </w:rPr>
+              <w:t>欄</w:t>
+            </w:r>
+            <w:r>
+              <w:rPr>
+                <w:rFonts w:asciiTheme="minorHAnsi" w:eastAsiaTheme="minorHAnsi" w:hAnsiTheme="minorHAnsi" w:hint="eastAsia"/>
+                <w:color w:val="FF0000"/>
+                <w:sz w:val="21"/>
+                <w:szCs w:val="21"/>
+              </w:rPr>
+              <w:t>、と考えてください。</w:t>
+            </w:r>
           </w:p>
         </w:tc>
       </w:tr>
@@ -1668,7 +2529,6 @@
                 <w:sz w:val="21"/>
                 <w:szCs w:val="21"/>
               </w:rPr>
-              <w:lastRenderedPageBreak/>
               <w:t>1</w:t>
             </w:r>
             <w:r>
@@ -1807,7 +2667,79 @@
                 <w:sz w:val="21"/>
                 <w:szCs w:val="21"/>
               </w:rPr>
-              <w:t>研究目的を達成するために取得する情報等を項目化して記載して下さい。患者背景や既往歴等を研究に使用する場合はもれなく記載して下さい。</w:t>
+              <w:t>研究目的を達成するために取得する情報等を</w:t>
+            </w:r>
+            <w:r>
+              <w:rPr>
+                <w:rFonts w:asciiTheme="minorHAnsi" w:eastAsiaTheme="minorHAnsi" w:hAnsiTheme="minorHAnsi" w:hint="eastAsia"/>
+                <w:color w:val="FF0000"/>
+                <w:sz w:val="21"/>
+                <w:szCs w:val="21"/>
+              </w:rPr>
+              <w:t>「</w:t>
+            </w:r>
+            <w:r>
+              <w:rPr>
+                <w:rFonts w:asciiTheme="minorHAnsi" w:eastAsiaTheme="minorHAnsi" w:hAnsiTheme="minorHAnsi" w:hint="eastAsia"/>
+                <w:color w:val="FF0000"/>
+                <w:sz w:val="21"/>
+                <w:szCs w:val="21"/>
+              </w:rPr>
+              <w:t>項目化</w:t>
+            </w:r>
+            <w:r>
+              <w:rPr>
+                <w:rFonts w:asciiTheme="minorHAnsi" w:eastAsiaTheme="minorHAnsi" w:hAnsiTheme="minorHAnsi" w:hint="eastAsia"/>
+                <w:color w:val="FF0000"/>
+                <w:sz w:val="21"/>
+                <w:szCs w:val="21"/>
+              </w:rPr>
+              <w:t>」</w:t>
+            </w:r>
+            <w:r>
+              <w:rPr>
+                <w:rFonts w:asciiTheme="minorHAnsi" w:eastAsiaTheme="minorHAnsi" w:hAnsiTheme="minorHAnsi" w:hint="eastAsia"/>
+                <w:color w:val="FF0000"/>
+                <w:sz w:val="21"/>
+                <w:szCs w:val="21"/>
+              </w:rPr>
+              <w:t>して記載して下さい。患者背景や既往歴等を研究に使用する場合は</w:t>
+            </w:r>
+            <w:r>
+              <w:rPr>
+                <w:rFonts w:asciiTheme="minorHAnsi" w:eastAsiaTheme="minorHAnsi" w:hAnsiTheme="minorHAnsi" w:hint="eastAsia"/>
+                <w:color w:val="FF0000"/>
+                <w:sz w:val="21"/>
+                <w:szCs w:val="21"/>
+              </w:rPr>
+              <w:t>、全て</w:t>
+            </w:r>
+            <w:r>
+              <w:rPr>
+                <w:rFonts w:asciiTheme="minorHAnsi" w:eastAsiaTheme="minorHAnsi" w:hAnsiTheme="minorHAnsi" w:hint="eastAsia"/>
+                <w:color w:val="FF0000"/>
+                <w:sz w:val="21"/>
+                <w:szCs w:val="21"/>
+              </w:rPr>
+              <w:t>もれなく記載して下さい。</w:t>
+            </w:r>
+            <w:r>
+              <w:rPr>
+                <w:rFonts w:asciiTheme="minorHAnsi" w:eastAsiaTheme="minorHAnsi" w:hAnsiTheme="minorHAnsi"/>
+                <w:color w:val="FF0000"/>
+                <w:sz w:val="21"/>
+                <w:szCs w:val="21"/>
+              </w:rPr>
+              <w:br/>
+            </w:r>
+            <w:r>
+              <w:rPr>
+                <w:rFonts w:asciiTheme="minorHAnsi" w:eastAsiaTheme="minorHAnsi" w:hAnsiTheme="minorHAnsi" w:hint="eastAsia"/>
+                <w:color w:val="FF0000"/>
+                <w:sz w:val="21"/>
+                <w:szCs w:val="21"/>
+              </w:rPr>
+              <w:t>ここに記載のない項目は、研究にも発表にも使うことはできません。</w:t>
             </w:r>
           </w:p>
         </w:tc>
@@ -1889,12 +2821,21 @@
               <w:mirrorIndents/>
               <w:jc w:val="both"/>
               <w:rPr>
-                <w:rFonts w:asciiTheme="minorHAnsi" w:eastAsiaTheme="minorHAnsi" w:hAnsiTheme="minorHAnsi"/>
-                <w:color w:val="FF0000"/>
-                <w:sz w:val="21"/>
-                <w:szCs w:val="21"/>
-              </w:rPr>
-            </w:pPr>
+                <w:rFonts w:asciiTheme="minorHAnsi" w:eastAsiaTheme="minorHAnsi" w:hAnsiTheme="minorHAnsi" w:hint="eastAsia"/>
+                <w:color w:val="FF0000"/>
+                <w:sz w:val="21"/>
+                <w:szCs w:val="21"/>
+              </w:rPr>
+            </w:pPr>
+            <w:r>
+              <w:rPr>
+                <w:rFonts w:asciiTheme="minorHAnsi" w:eastAsiaTheme="minorHAnsi" w:hAnsiTheme="minorHAnsi" w:hint="eastAsia"/>
+                <w:color w:val="FF0000"/>
+                <w:sz w:val="21"/>
+                <w:szCs w:val="21"/>
+              </w:rPr>
+              <w:t>統計解析に必要な期間まで含めて研究期間です。</w:t>
+            </w:r>
           </w:p>
         </w:tc>
       </w:tr>
@@ -2064,7 +3005,6 @@
               <w:ind w:leftChars="-29" w:left="-64"/>
               <w:contextualSpacing/>
               <w:mirrorIndents/>
-              <w:jc w:val="both"/>
               <w:rPr>
                 <w:rFonts w:asciiTheme="minorHAnsi" w:eastAsiaTheme="minorHAnsi" w:hAnsiTheme="minorHAnsi"/>
                 <w:color w:val="FF0000"/>
@@ -2098,23 +3038,21 @@
               <w:ind w:leftChars="-29" w:left="-64"/>
               <w:contextualSpacing/>
               <w:mirrorIndents/>
-              <w:jc w:val="both"/>
-              <w:rPr>
-                <w:rFonts w:asciiTheme="minorHAnsi" w:eastAsiaTheme="minorHAnsi" w:hAnsiTheme="minorHAnsi"/>
-                <w:color w:val="FF0000"/>
-                <w:sz w:val="21"/>
-                <w:szCs w:val="21"/>
-              </w:rPr>
-            </w:pPr>
-          </w:p>
-          <w:p>
-            <w:pPr>
-              <w:snapToGrid w:val="0"/>
-              <w:spacing w:after="0" w:line="240" w:lineRule="auto"/>
-              <w:ind w:leftChars="-29" w:left="-64"/>
-              <w:contextualSpacing/>
-              <w:mirrorIndents/>
-              <w:jc w:val="both"/>
+              <w:rPr>
+                <w:rFonts w:asciiTheme="minorHAnsi" w:eastAsiaTheme="minorHAnsi" w:hAnsiTheme="minorHAnsi"/>
+                <w:color w:val="FF0000"/>
+                <w:sz w:val="21"/>
+                <w:szCs w:val="21"/>
+              </w:rPr>
+            </w:pPr>
+          </w:p>
+          <w:p>
+            <w:pPr>
+              <w:snapToGrid w:val="0"/>
+              <w:spacing w:after="0" w:line="240" w:lineRule="auto"/>
+              <w:ind w:leftChars="-29" w:left="-64"/>
+              <w:contextualSpacing/>
+              <w:mirrorIndents/>
               <w:rPr>
                 <w:rFonts w:asciiTheme="minorHAnsi" w:eastAsiaTheme="minorHAnsi" w:hAnsiTheme="minorHAnsi"/>
                 <w:color w:val="FF0000"/>
@@ -2167,64 +3105,105 @@
               <w:ind w:leftChars="-29" w:left="-64"/>
               <w:contextualSpacing/>
               <w:mirrorIndents/>
-              <w:jc w:val="both"/>
-              <w:rPr>
-                <w:rFonts w:asciiTheme="minorHAnsi" w:eastAsiaTheme="minorHAnsi" w:hAnsiTheme="minorHAnsi"/>
-                <w:color w:val="FF0000"/>
-                <w:sz w:val="21"/>
-                <w:szCs w:val="21"/>
-              </w:rPr>
-            </w:pPr>
-          </w:p>
-          <w:p>
-            <w:pPr>
-              <w:snapToGrid w:val="0"/>
-              <w:spacing w:after="0" w:line="240" w:lineRule="auto"/>
-              <w:ind w:leftChars="-29" w:left="-64"/>
-              <w:contextualSpacing/>
-              <w:mirrorIndents/>
-              <w:jc w:val="both"/>
-              <w:rPr>
-                <w:rFonts w:asciiTheme="minorHAnsi" w:eastAsiaTheme="minorHAnsi" w:hAnsiTheme="minorHAnsi"/>
-                <w:color w:val="FF0000"/>
-                <w:sz w:val="21"/>
-                <w:szCs w:val="21"/>
-              </w:rPr>
-            </w:pPr>
-            <w:r>
-              <w:rPr>
-                <w:rFonts w:asciiTheme="minorHAnsi" w:eastAsiaTheme="minorHAnsi" w:hAnsiTheme="minorHAnsi" w:hint="eastAsia"/>
-                <w:color w:val="FF0000"/>
-                <w:sz w:val="21"/>
-                <w:szCs w:val="21"/>
-              </w:rPr>
-              <w:t>・「既存の仮名加工情報」は研究開始の時点ですでに「仮名加工情報」となっている情報を利用するときに選択できます。該当するかどうかご再考ください。本研究で取得する診療録は該当しませんのでご注意ください。</w:t>
-            </w:r>
-          </w:p>
-          <w:p>
-            <w:pPr>
-              <w:snapToGrid w:val="0"/>
-              <w:spacing w:after="0" w:line="240" w:lineRule="auto"/>
-              <w:ind w:leftChars="-29" w:left="-64"/>
-              <w:contextualSpacing/>
-              <w:mirrorIndents/>
-              <w:jc w:val="both"/>
-              <w:rPr>
-                <w:rFonts w:asciiTheme="minorHAnsi" w:eastAsiaTheme="minorHAnsi" w:hAnsiTheme="minorHAnsi"/>
-                <w:color w:val="FF0000"/>
-                <w:sz w:val="21"/>
-                <w:szCs w:val="21"/>
-              </w:rPr>
-            </w:pPr>
-          </w:p>
-          <w:p>
-            <w:pPr>
-              <w:snapToGrid w:val="0"/>
-              <w:spacing w:after="0" w:line="240" w:lineRule="auto"/>
-              <w:ind w:leftChars="-29" w:left="-64"/>
-              <w:contextualSpacing/>
-              <w:mirrorIndents/>
-              <w:jc w:val="both"/>
+              <w:rPr>
+                <w:rFonts w:asciiTheme="minorHAnsi" w:eastAsiaTheme="minorHAnsi" w:hAnsiTheme="minorHAnsi"/>
+                <w:color w:val="FF0000"/>
+                <w:sz w:val="21"/>
+                <w:szCs w:val="21"/>
+              </w:rPr>
+            </w:pPr>
+          </w:p>
+          <w:p>
+            <w:pPr>
+              <w:snapToGrid w:val="0"/>
+              <w:spacing w:after="0" w:line="240" w:lineRule="auto"/>
+              <w:ind w:leftChars="-29" w:left="-64"/>
+              <w:contextualSpacing/>
+              <w:mirrorIndents/>
+              <w:rPr>
+                <w:rFonts w:asciiTheme="minorHAnsi" w:eastAsiaTheme="minorHAnsi" w:hAnsiTheme="minorHAnsi"/>
+                <w:color w:val="FF0000"/>
+                <w:sz w:val="21"/>
+                <w:szCs w:val="21"/>
+              </w:rPr>
+            </w:pPr>
+            <w:r>
+              <w:rPr>
+                <w:rFonts w:asciiTheme="minorHAnsi" w:eastAsiaTheme="minorHAnsi" w:hAnsiTheme="minorHAnsi" w:hint="eastAsia"/>
+                <w:color w:val="FF0000"/>
+                <w:sz w:val="21"/>
+                <w:szCs w:val="21"/>
+              </w:rPr>
+              <w:t>・「既存の仮名加工情報」は研究開始の時点ですでに「仮名加工情報」となっている情報を利用するときに選択</w:t>
+            </w:r>
+            <w:r>
+              <w:rPr>
+                <w:rFonts w:asciiTheme="minorHAnsi" w:eastAsiaTheme="minorHAnsi" w:hAnsiTheme="minorHAnsi" w:hint="eastAsia"/>
+                <w:color w:val="FF0000"/>
+                <w:sz w:val="21"/>
+                <w:szCs w:val="21"/>
+              </w:rPr>
+              <w:t>します。研究の手順で仮名加工する場合は、</w:t>
+            </w:r>
+            <w:r>
+              <w:rPr>
+                <w:rFonts w:asciiTheme="minorHAnsi" w:eastAsiaTheme="minorHAnsi" w:hAnsiTheme="minorHAnsi" w:hint="eastAsia"/>
+                <w:color w:val="FF0000"/>
+                <w:sz w:val="21"/>
+                <w:szCs w:val="21"/>
+              </w:rPr>
+              <w:t>該当しません。</w:t>
+            </w:r>
+            <w:r>
+              <w:rPr>
+                <w:rFonts w:asciiTheme="minorHAnsi" w:eastAsiaTheme="minorHAnsi" w:hAnsiTheme="minorHAnsi" w:hint="eastAsia"/>
+                <w:color w:val="FF0000"/>
+                <w:sz w:val="21"/>
+                <w:szCs w:val="21"/>
+              </w:rPr>
+              <w:t>該当するかどうかご再考ください。</w:t>
+            </w:r>
+            <w:r>
+              <w:rPr>
+                <w:rFonts w:asciiTheme="minorHAnsi" w:eastAsiaTheme="minorHAnsi" w:hAnsiTheme="minorHAnsi"/>
+                <w:color w:val="FF0000"/>
+                <w:sz w:val="21"/>
+                <w:szCs w:val="21"/>
+              </w:rPr>
+              <w:br/>
+            </w:r>
+            <w:r>
+              <w:rPr>
+                <w:rFonts w:asciiTheme="minorHAnsi" w:eastAsiaTheme="minorHAnsi" w:hAnsiTheme="minorHAnsi" w:hint="eastAsia"/>
+                <w:color w:val="FF0000"/>
+                <w:sz w:val="21"/>
+                <w:szCs w:val="21"/>
+              </w:rPr>
+              <w:t>本研究で取得する診療録は該当しませんのでご注意ください。</w:t>
+            </w:r>
+          </w:p>
+          <w:p>
+            <w:pPr>
+              <w:snapToGrid w:val="0"/>
+              <w:spacing w:after="0" w:line="240" w:lineRule="auto"/>
+              <w:ind w:leftChars="-29" w:left="-64"/>
+              <w:contextualSpacing/>
+              <w:mirrorIndents/>
+              <w:rPr>
+                <w:rFonts w:asciiTheme="minorHAnsi" w:eastAsiaTheme="minorHAnsi" w:hAnsiTheme="minorHAnsi"/>
+                <w:color w:val="FF0000"/>
+                <w:sz w:val="21"/>
+                <w:szCs w:val="21"/>
+              </w:rPr>
+            </w:pPr>
+          </w:p>
+          <w:p>
+            <w:pPr>
+              <w:snapToGrid w:val="0"/>
+              <w:spacing w:after="0" w:line="240" w:lineRule="auto"/>
+              <w:ind w:leftChars="-29" w:left="-64"/>
+              <w:contextualSpacing/>
+              <w:mirrorIndents/>
               <w:rPr>
                 <w:rFonts w:asciiTheme="minorHAnsi" w:eastAsiaTheme="minorHAnsi" w:hAnsiTheme="minorHAnsi"/>
                 <w:color w:val="FF0000"/>
@@ -2267,23 +3246,21 @@
               <w:ind w:leftChars="-29" w:left="-64"/>
               <w:contextualSpacing/>
               <w:mirrorIndents/>
-              <w:jc w:val="both"/>
-              <w:rPr>
-                <w:rFonts w:asciiTheme="minorHAnsi" w:eastAsiaTheme="minorHAnsi" w:hAnsiTheme="minorHAnsi"/>
-                <w:color w:val="FF0000"/>
-                <w:sz w:val="21"/>
-                <w:szCs w:val="21"/>
-              </w:rPr>
-            </w:pPr>
-          </w:p>
-          <w:p>
-            <w:pPr>
-              <w:snapToGrid w:val="0"/>
-              <w:spacing w:after="0" w:line="240" w:lineRule="auto"/>
-              <w:ind w:leftChars="-29" w:left="-64"/>
-              <w:contextualSpacing/>
-              <w:mirrorIndents/>
-              <w:jc w:val="both"/>
+              <w:rPr>
+                <w:rFonts w:asciiTheme="minorHAnsi" w:eastAsiaTheme="minorHAnsi" w:hAnsiTheme="minorHAnsi"/>
+                <w:color w:val="FF0000"/>
+                <w:sz w:val="21"/>
+                <w:szCs w:val="21"/>
+              </w:rPr>
+            </w:pPr>
+          </w:p>
+          <w:p>
+            <w:pPr>
+              <w:snapToGrid w:val="0"/>
+              <w:spacing w:after="0" w:line="240" w:lineRule="auto"/>
+              <w:ind w:leftChars="-29" w:left="-64"/>
+              <w:contextualSpacing/>
+              <w:mirrorIndents/>
               <w:rPr>
                 <w:rFonts w:asciiTheme="minorHAnsi" w:eastAsiaTheme="minorHAnsi" w:hAnsiTheme="minorHAnsi"/>
                 <w:color w:val="FF0000"/>
@@ -2308,7 +3285,6 @@
               <w:ind w:leftChars="-29" w:left="-64"/>
               <w:contextualSpacing/>
               <w:mirrorIndents/>
-              <w:jc w:val="both"/>
               <w:rPr>
                 <w:rFonts w:asciiTheme="minorHAnsi" w:eastAsiaTheme="minorHAnsi" w:hAnsiTheme="minorHAnsi"/>
                 <w:color w:val="FF0000"/>
@@ -2333,7 +3309,6 @@
               <w:ind w:leftChars="-29" w:left="-64"/>
               <w:contextualSpacing/>
               <w:mirrorIndents/>
-              <w:jc w:val="both"/>
               <w:rPr>
                 <w:rFonts w:asciiTheme="minorHAnsi" w:eastAsiaTheme="minorHAnsi" w:hAnsiTheme="minorHAnsi"/>
                 <w:color w:val="FF0000"/>
@@ -2380,7 +3355,6 @@
               <w:ind w:leftChars="-29" w:left="-64"/>
               <w:contextualSpacing/>
               <w:mirrorIndents/>
-              <w:jc w:val="both"/>
               <w:rPr>
                 <w:rFonts w:asciiTheme="minorHAnsi" w:eastAsiaTheme="minorHAnsi" w:hAnsiTheme="minorHAnsi"/>
                 <w:color w:val="FF0000"/>
@@ -2438,6 +3412,7 @@
                 <w:sz w:val="21"/>
                 <w:szCs w:val="21"/>
               </w:rPr>
+              <w:lastRenderedPageBreak/>
               <w:t>2</w:t>
             </w:r>
             <w:r>
@@ -2717,7 +3692,6 @@
               <w:ind w:leftChars="-29" w:left="-64"/>
               <w:contextualSpacing/>
               <w:mirrorIndents/>
-              <w:jc w:val="both"/>
               <w:rPr>
                 <w:rFonts w:asciiTheme="minorHAnsi" w:eastAsiaTheme="minorHAnsi" w:hAnsiTheme="minorHAnsi"/>
                 <w:color w:val="EE0000"/>
@@ -2741,7 +3715,25 @@
                 <w:sz w:val="21"/>
                 <w:szCs w:val="21"/>
               </w:rPr>
-              <w:t>インフォームドアセントは不要ではないでしょうか？</w:t>
+              <w:t>インフォームド</w:t>
+            </w:r>
+            <w:r>
+              <w:rPr>
+                <w:rFonts w:asciiTheme="minorHAnsi" w:eastAsiaTheme="minorHAnsi" w:hAnsiTheme="minorHAnsi" w:hint="eastAsia"/>
+                <w:color w:val="EE0000"/>
+                <w:sz w:val="21"/>
+                <w:szCs w:val="21"/>
+              </w:rPr>
+              <w:t>・</w:t>
+            </w:r>
+            <w:r>
+              <w:rPr>
+                <w:rFonts w:asciiTheme="minorHAnsi" w:eastAsiaTheme="minorHAnsi" w:hAnsiTheme="minorHAnsi" w:hint="eastAsia"/>
+                <w:color w:val="EE0000"/>
+                <w:sz w:val="21"/>
+                <w:szCs w:val="21"/>
+              </w:rPr>
+              <w:t>アセントは不要ではないでしょうか？</w:t>
             </w:r>
           </w:p>
           <w:p>
@@ -2754,7 +3746,6 @@
               <w:ind w:leftChars="-29" w:left="-64"/>
               <w:contextualSpacing/>
               <w:mirrorIndents/>
-              <w:jc w:val="both"/>
               <w:rPr>
                 <w:rFonts w:asciiTheme="minorHAnsi" w:eastAsiaTheme="minorHAnsi" w:hAnsiTheme="minorHAnsi"/>
                 <w:color w:val="EE0000"/>
@@ -2769,15 +3760,33 @@
                 <w:sz w:val="21"/>
                 <w:szCs w:val="21"/>
               </w:rPr>
-              <w:t>インフォームドアセントは判断能力が不十分により、通常の同意説明文書により同意取得ができない、</w:t>
-            </w:r>
-            <w:r>
-              <w:rPr>
-                <w:rFonts w:asciiTheme="minorHAnsi" w:eastAsiaTheme="minorHAnsi" w:hAnsiTheme="minorHAnsi"/>
+              <w:t>インフォームド</w:t>
+            </w:r>
+            <w:r>
+              <w:rPr>
+                <w:rFonts w:asciiTheme="minorHAnsi" w:eastAsiaTheme="minorHAnsi" w:hAnsiTheme="minorHAnsi" w:hint="eastAsia"/>
                 <w:color w:val="EE0000"/>
                 <w:sz w:val="21"/>
                 <w:szCs w:val="21"/>
               </w:rPr>
+              <w:t>・</w:t>
+            </w:r>
+            <w:r>
+              <w:rPr>
+                <w:rFonts w:asciiTheme="minorHAnsi" w:eastAsiaTheme="minorHAnsi" w:hAnsiTheme="minorHAnsi" w:hint="eastAsia"/>
+                <w:color w:val="EE0000"/>
+                <w:sz w:val="21"/>
+                <w:szCs w:val="21"/>
+              </w:rPr>
+              <w:t>アセントは判断能力が不十分により、通常の同意説明文書により同意取得ができない、</w:t>
+            </w:r>
+            <w:r>
+              <w:rPr>
+                <w:rFonts w:asciiTheme="minorHAnsi" w:eastAsiaTheme="minorHAnsi" w:hAnsiTheme="minorHAnsi"/>
+                <w:color w:val="EE0000"/>
+                <w:sz w:val="21"/>
+                <w:szCs w:val="21"/>
+              </w:rPr>
               <w:t>16</w:t>
             </w:r>
             <w:r>
@@ -2787,7 +3796,61 @@
                 <w:sz w:val="21"/>
                 <w:szCs w:val="21"/>
               </w:rPr>
-              <w:t>歳以上の小児や、障害をもった成人等への同意補助になります。不要と考えますが、もし必要でしたら、インフォームドアセント文書の作成をお願いします。</w:t>
+              <w:t>歳以上の小児や、障害をもった成人等への同意補助になります。</w:t>
+            </w:r>
+            <w:r>
+              <w:rPr>
+                <w:rFonts w:asciiTheme="minorHAnsi" w:eastAsiaTheme="minorHAnsi" w:hAnsiTheme="minorHAnsi"/>
+                <w:color w:val="EE0000"/>
+                <w:sz w:val="21"/>
+                <w:szCs w:val="21"/>
+              </w:rPr>
+              <w:br/>
+            </w:r>
+            <w:r>
+              <w:rPr>
+                <w:rFonts w:asciiTheme="minorHAnsi" w:eastAsiaTheme="minorHAnsi" w:hAnsiTheme="minorHAnsi" w:hint="eastAsia"/>
+                <w:color w:val="EE0000"/>
+                <w:sz w:val="21"/>
+                <w:szCs w:val="21"/>
+              </w:rPr>
+              <w:t>もし必要でしたら、インフォームド</w:t>
+            </w:r>
+            <w:r>
+              <w:rPr>
+                <w:rFonts w:asciiTheme="minorHAnsi" w:eastAsiaTheme="minorHAnsi" w:hAnsiTheme="minorHAnsi" w:hint="eastAsia"/>
+                <w:color w:val="EE0000"/>
+                <w:sz w:val="21"/>
+                <w:szCs w:val="21"/>
+              </w:rPr>
+              <w:t>・</w:t>
+            </w:r>
+            <w:r>
+              <w:rPr>
+                <w:rFonts w:asciiTheme="minorHAnsi" w:eastAsiaTheme="minorHAnsi" w:hAnsiTheme="minorHAnsi" w:hint="eastAsia"/>
+                <w:color w:val="EE0000"/>
+                <w:sz w:val="21"/>
+                <w:szCs w:val="21"/>
+              </w:rPr>
+              <w:t>アセント文書の作成</w:t>
+            </w:r>
+            <w:r>
+              <w:rPr>
+                <w:rFonts w:asciiTheme="minorHAnsi" w:eastAsiaTheme="minorHAnsi" w:hAnsiTheme="minorHAnsi" w:hint="eastAsia"/>
+                <w:color w:val="EE0000"/>
+                <w:sz w:val="21"/>
+                <w:szCs w:val="21"/>
+              </w:rPr>
+              <w:t>と添付</w:t>
+            </w:r>
+            <w:r>
+              <w:rPr>
+                <w:rFonts w:asciiTheme="minorHAnsi" w:eastAsiaTheme="minorHAnsi" w:hAnsiTheme="minorHAnsi" w:hint="eastAsia"/>
+                <w:color w:val="EE0000"/>
+                <w:sz w:val="21"/>
+                <w:szCs w:val="21"/>
+              </w:rPr>
+              <w:t>をお願いします。</w:t>
             </w:r>
           </w:p>
         </w:tc>
@@ -2830,7 +3893,6 @@
                 <w:sz w:val="21"/>
                 <w:szCs w:val="21"/>
               </w:rPr>
-              <w:lastRenderedPageBreak/>
               <w:t>24. 代諾者の選定</w:t>
             </w:r>
           </w:p>
@@ -2867,7 +3929,16 @@
                 <w:sz w:val="21"/>
                 <w:szCs w:val="21"/>
               </w:rPr>
-              <w:t>代諾者を置かない場合は、「同意文書・同意撤回文書」から代諾者用の署名欄を削除するほうが安心です。</w:t>
+              <w:t>代諾者を置かない場合は、「同意文書・同意撤回文書」から代諾者用の署名欄を削除</w:t>
+            </w:r>
+            <w:r>
+              <w:rPr>
+                <w:rFonts w:asciiTheme="minorHAnsi" w:eastAsiaTheme="minorHAnsi" w:hAnsiTheme="minorHAnsi" w:hint="eastAsia"/>
+                <w:color w:val="EE0000"/>
+                <w:sz w:val="21"/>
+                <w:szCs w:val="21"/>
+              </w:rPr>
+              <w:t>してください。</w:t>
             </w:r>
           </w:p>
         </w:tc>
@@ -2946,8 +4017,173 @@
                 <w:sz w:val="21"/>
                 <w:szCs w:val="21"/>
               </w:rPr>
-              <w:t>対応表について「作成しない」でお間違いないでしょうか。同意撤回を受けるためには対応表が必要です。ご確認ください。</w:t>
-            </w:r>
+              <w:t>対応表について「作成しない」でお間違いないでしょうか。</w:t>
+            </w:r>
+            <w:r>
+              <w:rPr>
+                <w:rFonts w:asciiTheme="minorHAnsi" w:eastAsiaTheme="minorHAnsi" w:hAnsiTheme="minorHAnsi" w:hint="eastAsia"/>
+                <w:color w:val="FF0000"/>
+                <w:sz w:val="21"/>
+                <w:szCs w:val="21"/>
+              </w:rPr>
+              <w:t>本研究で</w:t>
+            </w:r>
+            <w:r>
+              <w:rPr>
+                <w:rFonts w:asciiTheme="minorHAnsi" w:eastAsiaTheme="minorHAnsi" w:hAnsiTheme="minorHAnsi" w:hint="eastAsia"/>
+                <w:color w:val="FF0000"/>
+                <w:sz w:val="21"/>
+                <w:szCs w:val="21"/>
+              </w:rPr>
+              <w:t>同意撤回を受けるためには対応表が必要です。ご確認ください。</w:t>
+            </w:r>
+            <w:r>
+              <w:rPr>
+                <w:rFonts w:asciiTheme="minorHAnsi" w:eastAsiaTheme="minorHAnsi" w:hAnsiTheme="minorHAnsi"/>
+                <w:color w:val="FF0000"/>
+                <w:sz w:val="21"/>
+                <w:szCs w:val="21"/>
+              </w:rPr>
+              <w:br/>
+            </w:r>
+          </w:p>
+          <w:p>
+            <w:pPr>
+              <w:snapToGrid w:val="0"/>
+              <w:spacing w:after="0" w:line="240" w:lineRule="auto"/>
+              <w:ind w:leftChars="-29" w:left="-64"/>
+              <w:contextualSpacing/>
+              <w:mirrorIndents/>
+              <w:jc w:val="both"/>
+              <w:rPr>
+                <w:rFonts w:asciiTheme="minorHAnsi" w:eastAsiaTheme="minorHAnsi" w:hAnsiTheme="minorHAnsi"/>
+                <w:color w:val="FF0000"/>
+                <w:sz w:val="21"/>
+                <w:szCs w:val="21"/>
+              </w:rPr>
+            </w:pPr>
+            <w:r>
+              <w:rPr>
+                <w:rFonts w:asciiTheme="minorHAnsi" w:eastAsiaTheme="minorHAnsi" w:hAnsiTheme="minorHAnsi" w:hint="eastAsia"/>
+                <w:color w:val="FF0000"/>
+                <w:sz w:val="21"/>
+                <w:szCs w:val="21"/>
+              </w:rPr>
+              <w:t>個人情報等の管理責任者</w:t>
+            </w:r>
+            <w:r>
+              <w:rPr>
+                <w:rFonts w:asciiTheme="minorHAnsi" w:eastAsiaTheme="minorHAnsi" w:hAnsiTheme="minorHAnsi" w:hint="eastAsia"/>
+                <w:color w:val="FF0000"/>
+                <w:sz w:val="21"/>
+                <w:szCs w:val="21"/>
+              </w:rPr>
+              <w:t>は、「</w:t>
+            </w:r>
+            <w:r>
+              <w:rPr>
+                <w:rFonts w:asciiTheme="minorHAnsi" w:eastAsiaTheme="minorHAnsi" w:hAnsiTheme="minorHAnsi" w:hint="eastAsia"/>
+                <w:color w:val="FF0000"/>
+                <w:sz w:val="21"/>
+                <w:szCs w:val="21"/>
+              </w:rPr>
+              <w:t>研究責任者</w:t>
+            </w:r>
+            <w:r>
+              <w:rPr>
+                <w:rFonts w:asciiTheme="minorHAnsi" w:eastAsiaTheme="minorHAnsi" w:hAnsiTheme="minorHAnsi" w:hint="eastAsia"/>
+                <w:color w:val="FF0000"/>
+                <w:sz w:val="21"/>
+                <w:szCs w:val="21"/>
+              </w:rPr>
+              <w:t>」が兼ねることが可能です。</w:t>
+            </w:r>
+          </w:p>
+          <w:p>
+            <w:pPr>
+              <w:snapToGrid w:val="0"/>
+              <w:spacing w:after="0" w:line="240" w:lineRule="auto"/>
+              <w:ind w:leftChars="-29" w:left="-64"/>
+              <w:contextualSpacing/>
+              <w:mirrorIndents/>
+              <w:jc w:val="both"/>
+              <w:rPr>
+                <w:rFonts w:asciiTheme="minorHAnsi" w:eastAsiaTheme="minorHAnsi" w:hAnsiTheme="minorHAnsi"/>
+                <w:color w:val="FF0000"/>
+                <w:sz w:val="21"/>
+                <w:szCs w:val="21"/>
+              </w:rPr>
+            </w:pPr>
+            <w:r>
+              <w:rPr>
+                <w:rFonts w:asciiTheme="minorHAnsi" w:eastAsiaTheme="minorHAnsi" w:hAnsiTheme="minorHAnsi" w:hint="eastAsia"/>
+                <w:color w:val="FF0000"/>
+                <w:sz w:val="21"/>
+                <w:szCs w:val="21"/>
+              </w:rPr>
+              <w:t>もし、</w:t>
+            </w:r>
+            <w:r>
+              <w:rPr>
+                <w:rFonts w:asciiTheme="minorHAnsi" w:eastAsiaTheme="minorHAnsi" w:hAnsiTheme="minorHAnsi" w:hint="eastAsia"/>
+                <w:color w:val="FF0000"/>
+                <w:sz w:val="21"/>
+                <w:szCs w:val="21"/>
+              </w:rPr>
+              <w:t>研究責任者とは別に、「</w:t>
+            </w:r>
+            <w:r>
+              <w:rPr>
+                <w:rFonts w:asciiTheme="minorHAnsi" w:eastAsiaTheme="minorHAnsi" w:hAnsiTheme="minorHAnsi" w:hint="eastAsia"/>
+                <w:color w:val="FF0000"/>
+                <w:sz w:val="21"/>
+                <w:szCs w:val="21"/>
+              </w:rPr>
+              <w:t>個人情報管理責任者</w:t>
+            </w:r>
+            <w:r>
+              <w:rPr>
+                <w:rFonts w:asciiTheme="minorHAnsi" w:eastAsiaTheme="minorHAnsi" w:hAnsiTheme="minorHAnsi" w:hint="eastAsia"/>
+                <w:color w:val="FF0000"/>
+                <w:sz w:val="21"/>
+                <w:szCs w:val="21"/>
+              </w:rPr>
+              <w:t>」をおきたい場合は、</w:t>
+            </w:r>
+            <w:r>
+              <w:rPr>
+                <w:rFonts w:asciiTheme="minorHAnsi" w:eastAsiaTheme="minorHAnsi" w:hAnsiTheme="minorHAnsi"/>
+                <w:color w:val="FF0000"/>
+                <w:sz w:val="21"/>
+                <w:szCs w:val="21"/>
+              </w:rPr>
+              <w:t>4. その他研究に携わる者</w:t>
+            </w:r>
+            <w:r>
+              <w:rPr>
+                <w:rFonts w:asciiTheme="minorHAnsi" w:eastAsiaTheme="minorHAnsi" w:hAnsiTheme="minorHAnsi" w:hint="eastAsia"/>
+                <w:color w:val="FF0000"/>
+                <w:sz w:val="21"/>
+                <w:szCs w:val="21"/>
+              </w:rPr>
+              <w:t>と同意説明文書の両方に忘れずに記載してください。</w:t>
+            </w:r>
+          </w:p>
+          <w:p>
+            <w:pPr>
+              <w:snapToGrid w:val="0"/>
+              <w:spacing w:after="0" w:line="240" w:lineRule="auto"/>
+              <w:ind w:leftChars="-29" w:left="-64"/>
+              <w:contextualSpacing/>
+              <w:mirrorIndents/>
+              <w:jc w:val="both"/>
+              <w:rPr>
+                <w:rFonts w:asciiTheme="minorHAnsi" w:eastAsiaTheme="minorHAnsi" w:hAnsiTheme="minorHAnsi"/>
+                <w:color w:val="FF0000"/>
+                <w:sz w:val="21"/>
+                <w:szCs w:val="21"/>
+              </w:rPr>
+            </w:pPr>
           </w:p>
         </w:tc>
       </w:tr>
@@ -3060,17 +4296,37 @@
             <w:pPr>
               <w:snapToGrid w:val="0"/>
               <w:spacing w:after="0" w:line="240" w:lineRule="auto"/>
-              <w:ind w:leftChars="-29" w:left="-64"/>
-              <w:contextualSpacing/>
-              <w:mirrorIndents/>
-              <w:jc w:val="both"/>
-              <w:rPr>
-                <w:rFonts w:asciiTheme="minorHAnsi" w:eastAsiaTheme="minorHAnsi" w:hAnsiTheme="minorHAnsi"/>
-                <w:color w:val="FF0000"/>
-                <w:sz w:val="21"/>
-                <w:szCs w:val="21"/>
-              </w:rPr>
-            </w:pPr>
+              <w:ind w:leftChars="-29" w:left="-64" w:firstLineChars="100" w:firstLine="210"/>
+              <w:contextualSpacing/>
+              <w:mirrorIndents/>
+              <w:jc w:val="both"/>
+              <w:rPr>
+                <w:rFonts w:asciiTheme="minorHAnsi" w:eastAsiaTheme="minorHAnsi" w:hAnsiTheme="minorHAnsi"/>
+                <w:color w:val="FF0000"/>
+                <w:sz w:val="21"/>
+                <w:szCs w:val="21"/>
+              </w:rPr>
+            </w:pPr>
+            <w:r>
+              <w:rPr>
+                <w:rFonts w:asciiTheme="minorHAnsi" w:eastAsiaTheme="minorHAnsi" w:hAnsiTheme="minorHAnsi" w:hint="eastAsia"/>
+                <w:color w:val="FF0000"/>
+                <w:sz w:val="21"/>
+                <w:szCs w:val="21"/>
+                <w:u w:val="single"/>
+              </w:rPr>
+              <w:t>■</w:t>
+            </w:r>
+            <w:r>
+              <w:rPr>
+                <w:rFonts w:asciiTheme="minorHAnsi" w:eastAsiaTheme="minorHAnsi" w:hAnsiTheme="minorHAnsi" w:hint="eastAsia"/>
+                <w:color w:val="FF0000"/>
+                <w:sz w:val="21"/>
+                <w:szCs w:val="21"/>
+                <w:u w:val="single"/>
+              </w:rPr>
+              <w:t>継続保管あり</w:t>
+            </w:r>
             <w:r>
               <w:rPr>
                 <w:rFonts w:asciiTheme="minorHAnsi" w:eastAsiaTheme="minorHAnsi" w:hAnsiTheme="minorHAnsi"/>
@@ -3086,27 +4342,17 @@
                 <w:color w:val="FF0000"/>
                 <w:sz w:val="21"/>
                 <w:szCs w:val="21"/>
-                <w:u w:val="single"/>
-              </w:rPr>
-              <w:t>継続保管あり</w:t>
-            </w:r>
-            <w:r>
-              <w:rPr>
-                <w:rFonts w:asciiTheme="minorHAnsi" w:eastAsiaTheme="minorHAnsi" w:hAnsiTheme="minorHAnsi"/>
-                <w:color w:val="FF0000"/>
-                <w:sz w:val="21"/>
-                <w:szCs w:val="21"/>
-              </w:rPr>
-              <w:t xml:space="preserve"> </w:t>
-            </w:r>
-            <w:r>
-              <w:rPr>
-                <w:rFonts w:asciiTheme="minorHAnsi" w:eastAsiaTheme="minorHAnsi" w:hAnsiTheme="minorHAnsi" w:hint="eastAsia"/>
-                <w:color w:val="FF0000"/>
-                <w:sz w:val="21"/>
-                <w:szCs w:val="21"/>
               </w:rPr>
               <w:t>＞</w:t>
+            </w:r>
+            <w:r>
+              <w:rPr>
+                <w:rFonts w:asciiTheme="minorHAnsi" w:eastAsiaTheme="minorHAnsi" w:hAnsiTheme="minorHAnsi" w:hint="eastAsia"/>
+                <w:color w:val="FF0000"/>
+                <w:sz w:val="21"/>
+                <w:szCs w:val="21"/>
+              </w:rPr>
+              <w:t>■</w:t>
             </w:r>
             <w:r>
               <w:rPr>
@@ -3159,6 +4405,7 @@
                 <w:sz w:val="21"/>
                 <w:szCs w:val="21"/>
               </w:rPr>
+              <w:lastRenderedPageBreak/>
               <w:t>27. 試料・情報の保管場所</w:t>
             </w:r>
           </w:p>
@@ -3195,7 +4442,36 @@
                 <w:sz w:val="21"/>
                 <w:szCs w:val="21"/>
               </w:rPr>
-              <w:t>・「試料の保管場所」について、試料がない場合は「</w:t>
+              <w:t>・「試料の保管場所」について、</w:t>
+            </w:r>
+            <w:r>
+              <w:rPr>
+                <w:rFonts w:asciiTheme="minorHAnsi" w:eastAsiaTheme="minorHAnsi" w:hAnsiTheme="minorHAnsi" w:hint="eastAsia"/>
+                <w:b/>
+                <w:bCs/>
+                <w:color w:val="FF0000"/>
+                <w:sz w:val="21"/>
+                <w:szCs w:val="21"/>
+              </w:rPr>
+              <w:t>試料</w:t>
+            </w:r>
+            <w:r>
+              <w:rPr>
+                <w:rFonts w:asciiTheme="minorHAnsi" w:eastAsiaTheme="minorHAnsi" w:hAnsiTheme="minorHAnsi" w:hint="eastAsia"/>
+                <w:color w:val="FF0000"/>
+                <w:sz w:val="21"/>
+                <w:szCs w:val="21"/>
+              </w:rPr>
+              <w:t>（血液などの生体サンプル）</w:t>
+            </w:r>
+            <w:r>
+              <w:rPr>
+                <w:rFonts w:asciiTheme="minorHAnsi" w:eastAsiaTheme="minorHAnsi" w:hAnsiTheme="minorHAnsi" w:hint="eastAsia"/>
+                <w:color w:val="FF0000"/>
+                <w:sz w:val="21"/>
+                <w:szCs w:val="21"/>
+              </w:rPr>
+              <w:t>がない場合は「</w:t>
             </w:r>
             <w:r>
               <w:rPr>
@@ -3255,7 +4531,34 @@
                 <w:sz w:val="21"/>
                 <w:szCs w:val="21"/>
               </w:rPr>
-              <w:t>・「情報の保管場所」は変更不要です。</w:t>
+              <w:t>・「情報の保管場所」は</w:t>
+            </w:r>
+            <w:r>
+              <w:rPr>
+                <w:rFonts w:asciiTheme="minorHAnsi" w:eastAsiaTheme="minorHAnsi" w:hAnsiTheme="minorHAnsi" w:hint="eastAsia"/>
+                <w:color w:val="FF0000"/>
+                <w:sz w:val="21"/>
+                <w:szCs w:val="21"/>
+              </w:rPr>
+              <w:t>、「学内から切り離されたコンピューター～</w:t>
+            </w:r>
+            <w:r>
+              <w:rPr>
+                <w:rFonts w:asciiTheme="minorHAnsi" w:eastAsiaTheme="minorHAnsi" w:hAnsiTheme="minorHAnsi" w:hint="eastAsia"/>
+                <w:color w:val="FF0000"/>
+                <w:sz w:val="21"/>
+                <w:szCs w:val="21"/>
+              </w:rPr>
+              <w:t>」を選択するか、その他の部分も活用して、本研究での情報の保管場所を</w:t>
+            </w:r>
+            <w:r>
+              <w:rPr>
+                <w:rFonts w:asciiTheme="minorHAnsi" w:eastAsiaTheme="minorHAnsi" w:hAnsiTheme="minorHAnsi" w:hint="eastAsia"/>
+                <w:color w:val="FF0000"/>
+                <w:sz w:val="21"/>
+                <w:szCs w:val="21"/>
+              </w:rPr>
+              <w:t>ご記載ください。</w:t>
             </w:r>
           </w:p>
         </w:tc>
@@ -3404,7 +4707,27 @@
                 <w:sz w:val="21"/>
                 <w:szCs w:val="21"/>
               </w:rPr>
-              <w:t>新規の申請では、特段の理由がない限り現行の指針にて審査を行っております。「</w:t>
+              <w:t>新規の申請では、特段の理由がない限り</w:t>
+            </w:r>
+            <w:r>
+              <w:rPr>
+                <w:rFonts w:asciiTheme="minorHAnsi" w:eastAsiaTheme="minorHAnsi" w:hAnsiTheme="minorHAnsi" w:hint="eastAsia"/>
+                <w:b/>
+                <w:bCs/>
+                <w:color w:val="FF0000"/>
+                <w:sz w:val="21"/>
+                <w:szCs w:val="21"/>
+              </w:rPr>
+              <w:t>現行の指針</w:t>
+            </w:r>
+            <w:r>
+              <w:rPr>
+                <w:rFonts w:asciiTheme="minorHAnsi" w:eastAsiaTheme="minorHAnsi" w:hAnsiTheme="minorHAnsi" w:hint="eastAsia"/>
+                <w:color w:val="FF0000"/>
+                <w:sz w:val="21"/>
+                <w:szCs w:val="21"/>
+              </w:rPr>
+              <w:t>にて審査を行っております。「</w:t>
             </w:r>
             <w:r>
               <w:rPr>
@@ -3423,7 +4746,16 @@
                 <w:sz w:val="21"/>
                 <w:szCs w:val="21"/>
               </w:rPr>
-              <w:t>」に修正をお願いします。</w:t>
+              <w:t>」</w:t>
+            </w:r>
+            <w:r>
+              <w:rPr>
+                <w:rFonts w:asciiTheme="minorHAnsi" w:eastAsiaTheme="minorHAnsi" w:hAnsiTheme="minorHAnsi" w:hint="eastAsia"/>
+                <w:color w:val="FF0000"/>
+                <w:sz w:val="21"/>
+                <w:szCs w:val="21"/>
+              </w:rPr>
+              <w:t>を選択してください。</w:t>
             </w:r>
           </w:p>
         </w:tc>
@@ -3609,7 +4941,27 @@
                 <w:szCs w:val="21"/>
                 <w:highlight w:val="yellow"/>
               </w:rPr>
-              <w:t>COIシステムで【審査必要】となっている場合は「利益相反状態あり」になります。ただし、Q1に薬剤名しかない研究は「利益相反状態なし」でOKです。読んだら消してください！！</w:t>
+              <w:t>COIシステムで【審査必要】となっている場合は「利益相反状態あり」になります。ただし、Q1に薬剤名しかない研究は「利益相反状態なし」でOKです。読んだら</w:t>
+            </w:r>
+            <w:r>
+              <w:rPr>
+                <w:rFonts w:asciiTheme="minorHAnsi" w:eastAsiaTheme="minorHAnsi" w:hAnsiTheme="minorHAnsi" w:hint="eastAsia"/>
+                <w:color w:val="FF0000"/>
+                <w:sz w:val="21"/>
+                <w:szCs w:val="21"/>
+                <w:highlight w:val="yellow"/>
+              </w:rPr>
+              <w:t>このメッセージは</w:t>
+            </w:r>
+            <w:r>
+              <w:rPr>
+                <w:rFonts w:asciiTheme="minorHAnsi" w:eastAsiaTheme="minorHAnsi" w:hAnsiTheme="minorHAnsi" w:hint="eastAsia"/>
+                <w:color w:val="FF0000"/>
+                <w:sz w:val="21"/>
+                <w:szCs w:val="21"/>
+                <w:highlight w:val="yellow"/>
+              </w:rPr>
+              <w:t>消してください！！</w:t>
             </w:r>
           </w:p>
           <w:p>
@@ -3691,12 +5043,39 @@
               <w:mirrorIndents/>
               <w:jc w:val="both"/>
               <w:rPr>
-                <w:rFonts w:asciiTheme="minorHAnsi" w:eastAsiaTheme="minorHAnsi" w:hAnsiTheme="minorHAnsi"/>
-                <w:color w:val="FF0000"/>
-                <w:sz w:val="21"/>
-                <w:szCs w:val="21"/>
-              </w:rPr>
-            </w:pPr>
+                <w:rFonts w:asciiTheme="minorHAnsi" w:eastAsiaTheme="minorHAnsi" w:hAnsiTheme="minorHAnsi" w:hint="eastAsia"/>
+                <w:color w:val="FF0000"/>
+                <w:sz w:val="21"/>
+                <w:szCs w:val="21"/>
+              </w:rPr>
+            </w:pPr>
+            <w:r>
+              <w:rPr>
+                <w:rFonts w:asciiTheme="minorHAnsi" w:eastAsiaTheme="minorHAnsi" w:hAnsiTheme="minorHAnsi"/>
+                <w:color w:val="FF0000"/>
+                <w:sz w:val="21"/>
+                <w:szCs w:val="21"/>
+              </w:rPr>
+              <w:t>介入を行う研究は、研究開始前に公開データベースへの登録が必要です。介入を行わない研究も、登録に努める必要があります</w:t>
+            </w:r>
+            <w:r>
+              <w:rPr>
+                <w:rFonts w:asciiTheme="minorHAnsi" w:eastAsiaTheme="minorHAnsi" w:hAnsiTheme="minorHAnsi" w:hint="eastAsia"/>
+                <w:color w:val="FF0000"/>
+                <w:sz w:val="21"/>
+                <w:szCs w:val="21"/>
+              </w:rPr>
+              <w:t>が任意です</w:t>
+            </w:r>
+            <w:r>
+              <w:rPr>
+                <w:rFonts w:asciiTheme="minorHAnsi" w:eastAsiaTheme="minorHAnsi" w:hAnsiTheme="minorHAnsi"/>
+                <w:color w:val="FF0000"/>
+                <w:sz w:val="21"/>
+                <w:szCs w:val="21"/>
+              </w:rPr>
+              <w:t>。</w:t>
+            </w:r>
           </w:p>
         </w:tc>
       </w:tr>
@@ -3831,12 +5210,30 @@
               <w:mirrorIndents/>
               <w:jc w:val="both"/>
               <w:rPr>
-                <w:rFonts w:asciiTheme="minorHAnsi" w:eastAsiaTheme="minorHAnsi" w:hAnsiTheme="minorHAnsi"/>
-                <w:color w:val="FF0000"/>
-                <w:sz w:val="21"/>
-                <w:szCs w:val="21"/>
-              </w:rPr>
-            </w:pPr>
+                <w:rFonts w:asciiTheme="minorHAnsi" w:eastAsiaTheme="minorHAnsi" w:hAnsiTheme="minorHAnsi" w:hint="eastAsia"/>
+                <w:color w:val="FF0000"/>
+                <w:sz w:val="21"/>
+                <w:szCs w:val="21"/>
+              </w:rPr>
+            </w:pPr>
+            <w:r>
+              <w:rPr>
+                <w:rFonts w:asciiTheme="minorHAnsi" w:eastAsiaTheme="minorHAnsi" w:hAnsiTheme="minorHAnsi" w:hint="eastAsia"/>
+                <w:color w:val="FF0000"/>
+                <w:sz w:val="21"/>
+                <w:szCs w:val="21"/>
+              </w:rPr>
+              <w:t>同意説明文書に記載する</w:t>
+            </w:r>
+            <w:r>
+              <w:rPr>
+                <w:rFonts w:asciiTheme="minorHAnsi" w:eastAsiaTheme="minorHAnsi" w:hAnsiTheme="minorHAnsi" w:hint="eastAsia"/>
+                <w:color w:val="FF0000"/>
+                <w:sz w:val="21"/>
+                <w:szCs w:val="21"/>
+              </w:rPr>
+              <w:t>のと同様の研究対象者からの問合せ先となります。</w:t>
+            </w:r>
           </w:p>
         </w:tc>
       </w:tr>
@@ -4195,17 +5592,7 @@
                 <w:sz w:val="21"/>
                 <w:szCs w:val="21"/>
               </w:rPr>
-              <w:t>・「偶発的所見」とは、研究の過程において偶然見つかった、生命に重大な影響を及ぼすおそれのある情報（例えば、がんや遺伝病への罹患等）を指しま</w:t>
-            </w:r>
-            <w:r>
-              <w:rPr>
-                <w:rFonts w:asciiTheme="minorHAnsi" w:eastAsiaTheme="minorHAnsi" w:hAnsiTheme="minorHAnsi" w:hint="eastAsia"/>
-                <w:color w:val="FF0000"/>
-                <w:sz w:val="21"/>
-                <w:szCs w:val="21"/>
-              </w:rPr>
-              <w:lastRenderedPageBreak/>
-              <w:t>す。本研究を実施するうえでそれらの所見を得る可能性がない場合は「</w:t>
+              <w:t>・「偶発的所見」とは、研究の過程において偶然見つかった、生命に重大な影響を及ぼすおそれのある情報（例えば、がんや遺伝病への罹患等）を指します。本研究を実施するうえでそれらの所見を得る可能性がない場合は「</w:t>
             </w:r>
             <w:r>
               <w:rPr>
@@ -4267,7 +5654,6 @@
                 <w:sz w:val="21"/>
                 <w:szCs w:val="21"/>
               </w:rPr>
-              <w:lastRenderedPageBreak/>
               <w:t>40. 緊急かつ明白な生命の危険が生じている状況における研究の実施</w:t>
             </w:r>
           </w:p>
@@ -4338,6 +5724,7 @@
                 <w:sz w:val="21"/>
                 <w:szCs w:val="21"/>
               </w:rPr>
+              <w:lastRenderedPageBreak/>
               <w:t>41. 研究対象者等の経済的負担の有無と内容</w:t>
             </w:r>
           </w:p>
@@ -5133,7 +6520,6 @@
                 <w:sz w:val="21"/>
                 <w:szCs w:val="21"/>
               </w:rPr>
-              <w:lastRenderedPageBreak/>
               <w:t xml:space="preserve">49. モニタリングの実施 </w:t>
             </w:r>
           </w:p>
@@ -5156,12 +6542,21 @@
               <w:mirrorIndents/>
               <w:jc w:val="both"/>
               <w:rPr>
-                <w:rFonts w:asciiTheme="minorHAnsi" w:eastAsiaTheme="minorHAnsi" w:hAnsiTheme="minorHAnsi"/>
-                <w:color w:val="FF0000"/>
-                <w:sz w:val="21"/>
-                <w:szCs w:val="21"/>
-              </w:rPr>
-            </w:pPr>
+                <w:rFonts w:asciiTheme="minorHAnsi" w:eastAsiaTheme="minorHAnsi" w:hAnsiTheme="minorHAnsi" w:hint="eastAsia"/>
+                <w:color w:val="FF0000"/>
+                <w:sz w:val="21"/>
+                <w:szCs w:val="21"/>
+              </w:rPr>
+            </w:pPr>
+            <w:r>
+              <w:rPr>
+                <w:rFonts w:asciiTheme="minorHAnsi" w:eastAsiaTheme="minorHAnsi" w:hAnsiTheme="minorHAnsi" w:hint="eastAsia"/>
+                <w:color w:val="FF0000"/>
+                <w:sz w:val="21"/>
+                <w:szCs w:val="21"/>
+              </w:rPr>
+              <w:t>侵襲（軽微な侵襲を除く）かつ、介入研究の場合はモニタリングの必要があります。</w:t>
+            </w:r>
           </w:p>
         </w:tc>
       </w:tr>
@@ -5582,10 +6977,11 @@
             <w:pPr>
               <w:snapToGrid w:val="0"/>
               <w:spacing w:after="0" w:line="240" w:lineRule="auto"/>
-              <w:contextualSpacing/>
-              <w:mirrorIndents/>
-              <w:rPr>
-                <w:rFonts w:asciiTheme="minorHAnsi" w:eastAsiaTheme="minorHAnsi" w:hAnsiTheme="minorHAnsi" w:hint="eastAsia"/>
+              <w:ind w:leftChars="-29" w:left="-64"/>
+              <w:contextualSpacing/>
+              <w:mirrorIndents/>
+              <w:rPr>
+                <w:rFonts w:asciiTheme="minorHAnsi" w:eastAsiaTheme="minorHAnsi" w:hAnsiTheme="minorHAnsi"/>
                 <w:color w:val="000000" w:themeColor="text1"/>
                 <w:sz w:val="21"/>
                 <w:szCs w:val="21"/>
@@ -5594,75 +6990,18 @@
           </w:p>
           <w:p>
             <w:pPr>
-              <w:snapToGrid w:val="0"/>
-              <w:spacing w:after="0" w:line="240" w:lineRule="auto"/>
-              <w:contextualSpacing/>
-              <w:mirrorIndents/>
-              <w:rPr>
-                <w:rFonts w:asciiTheme="minorHAnsi" w:eastAsiaTheme="minorHAnsi" w:hAnsiTheme="minorHAnsi"/>
-                <w:color w:val="000000" w:themeColor="text1"/>
-                <w:sz w:val="21"/>
-                <w:szCs w:val="21"/>
-              </w:rPr>
-            </w:pPr>
-            <w:r>
-              <w:rPr>
-                <w:rFonts w:asciiTheme="minorHAnsi" w:eastAsiaTheme="minorHAnsi" w:hAnsiTheme="minorHAnsi" w:hint="eastAsia"/>
-                <w:color w:val="000000" w:themeColor="text1"/>
-                <w:sz w:val="21"/>
-                <w:szCs w:val="21"/>
-              </w:rPr>
-              <w:t>【ご協力お願いします】</w:t>
-            </w:r>
-          </w:p>
-          <w:p>
-            <w:pPr>
-              <w:snapToGrid w:val="0"/>
-              <w:spacing w:after="0" w:line="240" w:lineRule="auto"/>
-              <w:ind w:leftChars="-29" w:left="-64" w:firstLineChars="100" w:firstLine="210"/>
-              <w:contextualSpacing/>
-              <w:mirrorIndents/>
-              <w:rPr>
-                <w:rFonts w:asciiTheme="minorHAnsi" w:eastAsiaTheme="minorHAnsi" w:hAnsiTheme="minorHAnsi"/>
-                <w:color w:val="000000" w:themeColor="text1"/>
-                <w:sz w:val="21"/>
-                <w:szCs w:val="21"/>
-                <w:u w:val="single"/>
-              </w:rPr>
-            </w:pPr>
-            <w:r>
-              <w:rPr>
-                <w:rFonts w:asciiTheme="minorHAnsi" w:eastAsiaTheme="minorHAnsi" w:hAnsiTheme="minorHAnsi" w:hint="eastAsia"/>
-                <w:color w:val="000000" w:themeColor="text1"/>
-                <w:sz w:val="21"/>
-                <w:szCs w:val="21"/>
-                <w:u w:val="single"/>
-              </w:rPr>
-              <w:t>スムーズな審査のために、上記</w:t>
-            </w:r>
-            <w:r>
-              <w:rPr>
-                <w:rFonts w:asciiTheme="minorHAnsi" w:eastAsiaTheme="minorHAnsi" w:hAnsiTheme="minorHAnsi" w:hint="eastAsia"/>
-                <w:color w:val="000000" w:themeColor="text1"/>
-                <w:sz w:val="21"/>
-                <w:szCs w:val="21"/>
-                <w:u w:val="single"/>
-              </w:rPr>
-              <w:t>Bの</w:t>
-            </w:r>
-            <w:r>
-              <w:rPr>
-                <w:rFonts w:asciiTheme="minorHAnsi" w:eastAsiaTheme="minorHAnsi" w:hAnsiTheme="minorHAnsi" w:hint="eastAsia"/>
-                <w:color w:val="000000" w:themeColor="text1"/>
-                <w:sz w:val="21"/>
-                <w:szCs w:val="21"/>
-                <w:u w:val="single"/>
-              </w:rPr>
-              <w:t>書類は</w:t>
-            </w:r>
-            <w:r>
-              <w:rPr>
-                <w:rFonts w:asciiTheme="minorHAnsi" w:eastAsiaTheme="minorHAnsi" w:hAnsiTheme="minorHAnsi" w:hint="eastAsia"/>
+              <w:pStyle w:val="a6"/>
+              <w:numPr>
+                <w:ilvl w:val="0"/>
+                <w:numId w:val="3"/>
+              </w:numPr>
+              <w:snapToGrid w:val="0"/>
+              <w:spacing w:after="0" w:line="240" w:lineRule="auto"/>
+              <w:ind w:leftChars="0"/>
+              <w:contextualSpacing/>
+              <w:mirrorIndents/>
+              <w:rPr>
+                <w:rFonts w:asciiTheme="minorHAnsi" w:eastAsiaTheme="minorHAnsi" w:hAnsiTheme="minorHAnsi"/>
                 <w:b/>
                 <w:bCs/>
                 <w:color w:val="000000" w:themeColor="text1"/>
@@ -5670,57 +7009,7 @@
                 <w:szCs w:val="21"/>
                 <w:u w:val="single"/>
               </w:rPr>
-              <w:t>「変更履歴」「コメント」</w:t>
-            </w:r>
-            <w:r>
-              <w:rPr>
-                <w:rFonts w:asciiTheme="minorHAnsi" w:eastAsiaTheme="minorHAnsi" w:hAnsiTheme="minorHAnsi" w:hint="eastAsia"/>
-                <w:color w:val="000000" w:themeColor="text1"/>
-                <w:sz w:val="21"/>
-                <w:szCs w:val="21"/>
-                <w:u w:val="single"/>
-              </w:rPr>
-              <w:t>を削除してから、システムに再アップロードをお願いします。</w:t>
-            </w:r>
-          </w:p>
-          <w:p>
-            <w:pPr>
-              <w:snapToGrid w:val="0"/>
-              <w:spacing w:after="0" w:line="240" w:lineRule="auto"/>
-              <w:ind w:leftChars="-29" w:left="-64"/>
-              <w:contextualSpacing/>
-              <w:mirrorIndents/>
-              <w:rPr>
-                <w:rFonts w:asciiTheme="minorHAnsi" w:eastAsiaTheme="minorHAnsi" w:hAnsiTheme="minorHAnsi"/>
-                <w:color w:val="000000" w:themeColor="text1"/>
-                <w:sz w:val="21"/>
-                <w:szCs w:val="21"/>
-              </w:rPr>
-            </w:pPr>
-          </w:p>
-          <w:p>
-            <w:pPr>
-              <w:snapToGrid w:val="0"/>
-              <w:spacing w:after="0" w:line="240" w:lineRule="auto"/>
-              <w:ind w:leftChars="-29" w:left="-64"/>
-              <w:contextualSpacing/>
-              <w:mirrorIndents/>
-              <w:rPr>
-                <w:rFonts w:asciiTheme="minorHAnsi" w:eastAsiaTheme="minorHAnsi" w:hAnsiTheme="minorHAnsi"/>
-                <w:color w:val="000000" w:themeColor="text1"/>
-                <w:sz w:val="21"/>
-                <w:szCs w:val="21"/>
-              </w:rPr>
-            </w:pPr>
-            <w:r>
-              <w:rPr>
-                <w:rFonts w:asciiTheme="minorHAnsi" w:eastAsiaTheme="minorHAnsi" w:hAnsiTheme="minorHAnsi" w:hint="eastAsia"/>
-                <w:color w:val="000000" w:themeColor="text1"/>
-                <w:sz w:val="21"/>
-                <w:szCs w:val="21"/>
-              </w:rPr>
-              <w:t>★</w:t>
-            </w:r>
+            </w:pPr>
             <w:r>
               <w:rPr>
                 <w:rFonts w:asciiTheme="minorHAnsi" w:eastAsiaTheme="minorHAnsi" w:hAnsiTheme="minorHAnsi" w:hint="eastAsia"/>
@@ -5729,152 +7018,9 @@
                 <w:color w:val="000000" w:themeColor="text1"/>
                 <w:sz w:val="21"/>
                 <w:szCs w:val="21"/>
-              </w:rPr>
-              <w:t>「変更履歴」</w:t>
-            </w:r>
-            <w:r>
-              <w:rPr>
-                <w:rFonts w:asciiTheme="minorHAnsi" w:eastAsiaTheme="minorHAnsi" w:hAnsiTheme="minorHAnsi" w:hint="eastAsia"/>
-                <w:color w:val="000000" w:themeColor="text1"/>
-                <w:sz w:val="21"/>
-                <w:szCs w:val="21"/>
-              </w:rPr>
-              <w:t>の削除方法</w:t>
-            </w:r>
-          </w:p>
-          <w:p>
-            <w:pPr>
-              <w:snapToGrid w:val="0"/>
-              <w:spacing w:after="0" w:line="240" w:lineRule="auto"/>
-              <w:ind w:leftChars="-29" w:left="-64"/>
-              <w:contextualSpacing/>
-              <w:mirrorIndents/>
-              <w:rPr>
-                <w:rFonts w:asciiTheme="minorHAnsi" w:eastAsiaTheme="minorHAnsi" w:hAnsiTheme="minorHAnsi"/>
-                <w:color w:val="000000" w:themeColor="text1"/>
-                <w:sz w:val="21"/>
-                <w:szCs w:val="21"/>
-              </w:rPr>
-            </w:pPr>
-            <w:r>
-              <w:rPr>
-                <w:rFonts w:asciiTheme="minorHAnsi" w:eastAsiaTheme="minorHAnsi" w:hAnsiTheme="minorHAnsi" w:hint="eastAsia"/>
-                <w:color w:val="000000" w:themeColor="text1"/>
-                <w:sz w:val="21"/>
-                <w:szCs w:val="21"/>
-              </w:rPr>
-              <w:t>校閲</w:t>
-            </w:r>
-            <w:r>
-              <w:rPr>
-                <w:rFonts w:asciiTheme="minorHAnsi" w:eastAsiaTheme="minorHAnsi" w:hAnsiTheme="minorHAnsi" w:hint="eastAsia"/>
-                <w:color w:val="000000" w:themeColor="text1"/>
-                <w:sz w:val="21"/>
-                <w:szCs w:val="21"/>
-              </w:rPr>
-              <w:t xml:space="preserve"> </w:t>
-            </w:r>
-            <w:r>
-              <w:rPr>
-                <w:rFonts w:asciiTheme="minorHAnsi" w:eastAsiaTheme="minorHAnsi" w:hAnsiTheme="minorHAnsi" w:hint="eastAsia"/>
-                <w:color w:val="000000" w:themeColor="text1"/>
-                <w:sz w:val="21"/>
-                <w:szCs w:val="21"/>
-              </w:rPr>
-              <w:t>＞</w:t>
-            </w:r>
-            <w:r>
-              <w:rPr>
-                <w:rFonts w:asciiTheme="minorHAnsi" w:eastAsiaTheme="minorHAnsi" w:hAnsiTheme="minorHAnsi" w:hint="eastAsia"/>
-                <w:color w:val="000000" w:themeColor="text1"/>
-                <w:sz w:val="21"/>
-                <w:szCs w:val="21"/>
-              </w:rPr>
-              <w:t xml:space="preserve"> </w:t>
-            </w:r>
-            <w:r>
-              <w:rPr>
-                <w:rFonts w:asciiTheme="minorHAnsi" w:eastAsiaTheme="minorHAnsi" w:hAnsiTheme="minorHAnsi" w:hint="eastAsia"/>
-                <w:color w:val="000000" w:themeColor="text1"/>
-                <w:sz w:val="21"/>
-                <w:szCs w:val="21"/>
-              </w:rPr>
-              <w:t>変更履歴：承諾ボタンの下向き矢印</w:t>
-            </w:r>
-            <w:r>
-              <w:rPr>
-                <w:rFonts w:asciiTheme="minorHAnsi" w:eastAsiaTheme="minorHAnsi" w:hAnsiTheme="minorHAnsi" w:hint="eastAsia"/>
-                <w:color w:val="000000" w:themeColor="text1"/>
-                <w:sz w:val="21"/>
-                <w:szCs w:val="21"/>
-              </w:rPr>
-              <w:t xml:space="preserve"> </w:t>
-            </w:r>
-            <w:r>
-              <w:rPr>
-                <w:rFonts w:asciiTheme="minorHAnsi" w:eastAsiaTheme="minorHAnsi" w:hAnsiTheme="minorHAnsi" w:hint="eastAsia"/>
-                <w:color w:val="000000" w:themeColor="text1"/>
-                <w:sz w:val="21"/>
-                <w:szCs w:val="21"/>
-              </w:rPr>
-              <w:t>＞</w:t>
-            </w:r>
-            <w:r>
-              <w:rPr>
-                <w:rFonts w:asciiTheme="minorHAnsi" w:eastAsiaTheme="minorHAnsi" w:hAnsiTheme="minorHAnsi" w:hint="eastAsia"/>
-                <w:color w:val="000000" w:themeColor="text1"/>
-                <w:sz w:val="21"/>
-                <w:szCs w:val="21"/>
-              </w:rPr>
-              <w:t xml:space="preserve"> </w:t>
-            </w:r>
-            <w:r>
-              <w:rPr>
-                <w:rFonts w:asciiTheme="minorHAnsi" w:eastAsiaTheme="minorHAnsi" w:hAnsiTheme="minorHAnsi" w:hint="eastAsia"/>
-                <w:color w:val="000000" w:themeColor="text1"/>
-                <w:sz w:val="21"/>
-                <w:szCs w:val="21"/>
-              </w:rPr>
-              <w:t>すべての変更を反映し、変更の記録を停止</w:t>
-            </w:r>
-          </w:p>
-          <w:p>
-            <w:pPr>
-              <w:snapToGrid w:val="0"/>
-              <w:spacing w:after="0" w:line="240" w:lineRule="auto"/>
-              <w:ind w:leftChars="-29" w:left="-64"/>
-              <w:contextualSpacing/>
-              <w:mirrorIndents/>
-              <w:rPr>
-                <w:rFonts w:asciiTheme="minorHAnsi" w:eastAsiaTheme="minorHAnsi" w:hAnsiTheme="minorHAnsi"/>
-                <w:color w:val="000000" w:themeColor="text1"/>
-                <w:sz w:val="21"/>
-                <w:szCs w:val="21"/>
-              </w:rPr>
-            </w:pPr>
-          </w:p>
-          <w:p>
-            <w:pPr>
-              <w:snapToGrid w:val="0"/>
-              <w:spacing w:after="0" w:line="240" w:lineRule="auto"/>
-              <w:ind w:leftChars="-29" w:left="-64"/>
-              <w:contextualSpacing/>
-              <w:mirrorIndents/>
-              <w:rPr>
-                <w:rFonts w:asciiTheme="minorHAnsi" w:eastAsiaTheme="minorHAnsi" w:hAnsiTheme="minorHAnsi"/>
-                <w:color w:val="000000" w:themeColor="text1"/>
-                <w:sz w:val="21"/>
-                <w:szCs w:val="21"/>
-              </w:rPr>
-            </w:pPr>
-            <w:r>
-              <w:rPr>
-                <w:rFonts w:asciiTheme="minorHAnsi" w:eastAsiaTheme="minorHAnsi" w:hAnsiTheme="minorHAnsi" w:hint="eastAsia"/>
-                <w:color w:val="000000" w:themeColor="text1"/>
-                <w:sz w:val="21"/>
-                <w:szCs w:val="21"/>
-              </w:rPr>
-              <w:t>★</w:t>
+                <w:u w:val="single"/>
+              </w:rPr>
+              <w:t>軽微な文言修正等を行った添付書類</w:t>
             </w:r>
             <w:r>
               <w:rPr>
@@ -5884,6 +7030,411 @@
                 <w:color w:val="000000" w:themeColor="text1"/>
                 <w:sz w:val="21"/>
                 <w:szCs w:val="21"/>
+                <w:u w:val="single"/>
+              </w:rPr>
+              <w:t>の再アップロード</w:t>
+            </w:r>
+            <w:r>
+              <w:rPr>
+                <w:rFonts w:asciiTheme="minorHAnsi" w:eastAsiaTheme="minorHAnsi" w:hAnsiTheme="minorHAnsi"/>
+                <w:b/>
+                <w:bCs/>
+                <w:color w:val="000000" w:themeColor="text1"/>
+                <w:sz w:val="21"/>
+                <w:szCs w:val="21"/>
+                <w:u w:val="single"/>
+              </w:rPr>
+              <w:br/>
+            </w:r>
+            <w:r>
+              <w:rPr>
+                <w:rFonts w:asciiTheme="minorHAnsi" w:eastAsiaTheme="minorHAnsi" w:hAnsiTheme="minorHAnsi"/>
+                <w:b/>
+                <w:bCs/>
+                <w:color w:val="000000" w:themeColor="text1"/>
+                <w:sz w:val="21"/>
+                <w:szCs w:val="21"/>
+              </w:rPr>
+              <w:t>(</w:t>
+            </w:r>
+            <w:r>
+              <w:rPr>
+                <w:rFonts w:asciiTheme="minorHAnsi" w:eastAsiaTheme="minorHAnsi" w:hAnsiTheme="minorHAnsi" w:hint="eastAsia"/>
+                <w:b/>
+                <w:bCs/>
+                <w:color w:val="000000" w:themeColor="text1"/>
+                <w:sz w:val="21"/>
+                <w:szCs w:val="21"/>
+              </w:rPr>
+              <w:t>下記修正箇所をご確認いただき、必要に応じて加筆修正を行ってください。</w:t>
+            </w:r>
+            <w:r>
+              <w:rPr>
+                <w:rFonts w:asciiTheme="minorHAnsi" w:eastAsiaTheme="minorHAnsi" w:hAnsiTheme="minorHAnsi"/>
+                <w:b/>
+                <w:bCs/>
+                <w:color w:val="000000" w:themeColor="text1"/>
+                <w:sz w:val="21"/>
+                <w:szCs w:val="21"/>
+              </w:rPr>
+              <w:t>)</w:t>
+            </w:r>
+          </w:p>
+          <w:p>
+            <w:pPr>
+              <w:snapToGrid w:val="0"/>
+              <w:spacing w:after="0" w:line="240" w:lineRule="auto"/>
+              <w:ind w:leftChars="-29" w:left="-64"/>
+              <w:contextualSpacing/>
+              <w:mirrorIndents/>
+              <w:rPr>
+                <w:rFonts w:asciiTheme="minorHAnsi" w:eastAsiaTheme="minorHAnsi" w:hAnsiTheme="minorHAnsi"/>
+                <w:color w:val="000000" w:themeColor="text1"/>
+                <w:sz w:val="21"/>
+                <w:szCs w:val="21"/>
+              </w:rPr>
+            </w:pPr>
+            <w:r>
+              <w:rPr>
+                <w:rFonts w:asciiTheme="minorHAnsi" w:eastAsiaTheme="minorHAnsi" w:hAnsiTheme="minorHAnsi" w:hint="eastAsia"/>
+                <w:color w:val="000000" w:themeColor="text1"/>
+                <w:sz w:val="21"/>
+                <w:szCs w:val="21"/>
+              </w:rPr>
+              <w:t xml:space="preserve">　・同意文書、同意撤回書</w:t>
+            </w:r>
+          </w:p>
+          <w:p>
+            <w:pPr>
+              <w:snapToGrid w:val="0"/>
+              <w:spacing w:after="0" w:line="240" w:lineRule="auto"/>
+              <w:ind w:leftChars="-29" w:left="-64"/>
+              <w:contextualSpacing/>
+              <w:mirrorIndents/>
+              <w:rPr>
+                <w:rFonts w:asciiTheme="minorHAnsi" w:eastAsiaTheme="minorHAnsi" w:hAnsiTheme="minorHAnsi"/>
+                <w:color w:val="000000" w:themeColor="text1"/>
+                <w:sz w:val="21"/>
+                <w:szCs w:val="21"/>
+              </w:rPr>
+            </w:pPr>
+            <w:r>
+              <w:rPr>
+                <w:rFonts w:asciiTheme="minorHAnsi" w:eastAsiaTheme="minorHAnsi" w:hAnsiTheme="minorHAnsi" w:hint="eastAsia"/>
+                <w:color w:val="000000" w:themeColor="text1"/>
+                <w:sz w:val="21"/>
+                <w:szCs w:val="21"/>
+              </w:rPr>
+              <w:t xml:space="preserve">　・研究計画内容変更の概要・対比表</w:t>
+            </w:r>
+          </w:p>
+          <w:p>
+            <w:pPr>
+              <w:snapToGrid w:val="0"/>
+              <w:spacing w:after="0" w:line="240" w:lineRule="auto"/>
+              <w:ind w:leftChars="-29" w:left="-64"/>
+              <w:contextualSpacing/>
+              <w:mirrorIndents/>
+              <w:rPr>
+                <w:rFonts w:asciiTheme="minorHAnsi" w:eastAsiaTheme="minorHAnsi" w:hAnsiTheme="minorHAnsi"/>
+                <w:color w:val="000000" w:themeColor="text1"/>
+                <w:sz w:val="21"/>
+                <w:szCs w:val="21"/>
+              </w:rPr>
+            </w:pPr>
+          </w:p>
+          <w:p>
+            <w:pPr>
+              <w:snapToGrid w:val="0"/>
+              <w:spacing w:after="0" w:line="240" w:lineRule="auto"/>
+              <w:contextualSpacing/>
+              <w:mirrorIndents/>
+              <w:rPr>
+                <w:rFonts w:asciiTheme="minorHAnsi" w:eastAsiaTheme="minorHAnsi" w:hAnsiTheme="minorHAnsi"/>
+                <w:color w:val="000000" w:themeColor="text1"/>
+                <w:sz w:val="21"/>
+                <w:szCs w:val="21"/>
+              </w:rPr>
+            </w:pPr>
+            <w:r>
+              <w:rPr>
+                <w:rFonts w:asciiTheme="minorHAnsi" w:eastAsiaTheme="minorHAnsi" w:hAnsiTheme="minorHAnsi" w:hint="eastAsia"/>
+                <w:color w:val="000000" w:themeColor="text1"/>
+                <w:sz w:val="21"/>
+                <w:szCs w:val="21"/>
+              </w:rPr>
+              <w:t>【ご協力お願いします】</w:t>
+            </w:r>
+          </w:p>
+          <w:p>
+            <w:pPr>
+              <w:snapToGrid w:val="0"/>
+              <w:spacing w:after="0" w:line="240" w:lineRule="auto"/>
+              <w:ind w:leftChars="-29" w:left="-64" w:firstLineChars="100" w:firstLine="210"/>
+              <w:contextualSpacing/>
+              <w:mirrorIndents/>
+              <w:rPr>
+                <w:rFonts w:asciiTheme="minorHAnsi" w:eastAsiaTheme="minorHAnsi" w:hAnsiTheme="minorHAnsi"/>
+                <w:color w:val="000000" w:themeColor="text1"/>
+                <w:sz w:val="21"/>
+                <w:szCs w:val="21"/>
+                <w:u w:val="single"/>
+              </w:rPr>
+            </w:pPr>
+            <w:r>
+              <w:rPr>
+                <w:rFonts w:asciiTheme="minorHAnsi" w:eastAsiaTheme="minorHAnsi" w:hAnsiTheme="minorHAnsi" w:hint="eastAsia"/>
+                <w:color w:val="000000" w:themeColor="text1"/>
+                <w:sz w:val="21"/>
+                <w:szCs w:val="21"/>
+                <w:u w:val="single"/>
+              </w:rPr>
+              <w:t>スムーズな審査のために、上記</w:t>
+            </w:r>
+            <w:r>
+              <w:rPr>
+                <w:rFonts w:asciiTheme="minorHAnsi" w:eastAsiaTheme="minorHAnsi" w:hAnsiTheme="minorHAnsi" w:hint="eastAsia"/>
+                <w:color w:val="000000" w:themeColor="text1"/>
+                <w:sz w:val="21"/>
+                <w:szCs w:val="21"/>
+                <w:u w:val="single"/>
+              </w:rPr>
+              <w:t>B,Cの</w:t>
+            </w:r>
+            <w:r>
+              <w:rPr>
+                <w:rFonts w:asciiTheme="minorHAnsi" w:eastAsiaTheme="minorHAnsi" w:hAnsiTheme="minorHAnsi" w:hint="eastAsia"/>
+                <w:color w:val="000000" w:themeColor="text1"/>
+                <w:sz w:val="21"/>
+                <w:szCs w:val="21"/>
+                <w:u w:val="single"/>
+              </w:rPr>
+              <w:t>書類は</w:t>
+            </w:r>
+            <w:r>
+              <w:rPr>
+                <w:rFonts w:asciiTheme="minorHAnsi" w:eastAsiaTheme="minorHAnsi" w:hAnsiTheme="minorHAnsi" w:hint="eastAsia"/>
+                <w:b/>
+                <w:bCs/>
+                <w:color w:val="000000" w:themeColor="text1"/>
+                <w:sz w:val="21"/>
+                <w:szCs w:val="21"/>
+                <w:u w:val="single"/>
+              </w:rPr>
+              <w:t>「変更履歴」「コメント」</w:t>
+            </w:r>
+            <w:r>
+              <w:rPr>
+                <w:rFonts w:asciiTheme="minorHAnsi" w:eastAsiaTheme="minorHAnsi" w:hAnsiTheme="minorHAnsi" w:hint="eastAsia"/>
+                <w:color w:val="000000" w:themeColor="text1"/>
+                <w:sz w:val="21"/>
+                <w:szCs w:val="21"/>
+                <w:u w:val="single"/>
+              </w:rPr>
+              <w:t>を削除してから、システムに再アップロードをお願いします。</w:t>
+            </w:r>
+          </w:p>
+          <w:p>
+            <w:pPr>
+              <w:snapToGrid w:val="0"/>
+              <w:spacing w:after="0" w:line="240" w:lineRule="auto"/>
+              <w:ind w:leftChars="-29" w:left="-64"/>
+              <w:contextualSpacing/>
+              <w:mirrorIndents/>
+              <w:rPr>
+                <w:rFonts w:asciiTheme="minorHAnsi" w:eastAsiaTheme="minorHAnsi" w:hAnsiTheme="minorHAnsi"/>
+                <w:color w:val="000000" w:themeColor="text1"/>
+                <w:sz w:val="21"/>
+                <w:szCs w:val="21"/>
+              </w:rPr>
+            </w:pPr>
+          </w:p>
+          <w:p>
+            <w:pPr>
+              <w:snapToGrid w:val="0"/>
+              <w:spacing w:after="0" w:line="240" w:lineRule="auto"/>
+              <w:ind w:leftChars="-29" w:left="-64"/>
+              <w:contextualSpacing/>
+              <w:mirrorIndents/>
+              <w:rPr>
+                <w:rFonts w:asciiTheme="minorHAnsi" w:eastAsiaTheme="minorHAnsi" w:hAnsiTheme="minorHAnsi"/>
+                <w:color w:val="000000" w:themeColor="text1"/>
+                <w:sz w:val="21"/>
+                <w:szCs w:val="21"/>
+              </w:rPr>
+            </w:pPr>
+            <w:r>
+              <w:rPr>
+                <w:rFonts w:asciiTheme="minorHAnsi" w:eastAsiaTheme="minorHAnsi" w:hAnsiTheme="minorHAnsi" w:hint="eastAsia"/>
+                <w:color w:val="000000" w:themeColor="text1"/>
+                <w:sz w:val="21"/>
+                <w:szCs w:val="21"/>
+              </w:rPr>
+              <w:t>★</w:t>
+            </w:r>
+            <w:r>
+              <w:rPr>
+                <w:rFonts w:asciiTheme="minorHAnsi" w:eastAsiaTheme="minorHAnsi" w:hAnsiTheme="minorHAnsi" w:hint="eastAsia"/>
+                <w:b/>
+                <w:bCs/>
+                <w:color w:val="000000" w:themeColor="text1"/>
+                <w:sz w:val="21"/>
+                <w:szCs w:val="21"/>
+              </w:rPr>
+              <w:t>「変更履歴」</w:t>
+            </w:r>
+            <w:r>
+              <w:rPr>
+                <w:rFonts w:asciiTheme="minorHAnsi" w:eastAsiaTheme="minorHAnsi" w:hAnsiTheme="minorHAnsi" w:hint="eastAsia"/>
+                <w:color w:val="000000" w:themeColor="text1"/>
+                <w:sz w:val="21"/>
+                <w:szCs w:val="21"/>
+              </w:rPr>
+              <w:t>の削除方法</w:t>
+            </w:r>
+          </w:p>
+          <w:p>
+            <w:pPr>
+              <w:snapToGrid w:val="0"/>
+              <w:spacing w:after="0" w:line="240" w:lineRule="auto"/>
+              <w:ind w:leftChars="-29" w:left="-64"/>
+              <w:contextualSpacing/>
+              <w:mirrorIndents/>
+              <w:rPr>
+                <w:rFonts w:asciiTheme="minorHAnsi" w:eastAsiaTheme="minorHAnsi" w:hAnsiTheme="minorHAnsi"/>
+                <w:color w:val="000000" w:themeColor="text1"/>
+                <w:sz w:val="21"/>
+                <w:szCs w:val="21"/>
+              </w:rPr>
+            </w:pPr>
+            <w:r>
+              <w:rPr>
+                <w:rFonts w:asciiTheme="minorHAnsi" w:eastAsiaTheme="minorHAnsi" w:hAnsiTheme="minorHAnsi" w:hint="eastAsia"/>
+                <w:color w:val="000000" w:themeColor="text1"/>
+                <w:sz w:val="21"/>
+                <w:szCs w:val="21"/>
+              </w:rPr>
+              <w:t>校閲</w:t>
+            </w:r>
+            <w:r>
+              <w:rPr>
+                <w:rFonts w:asciiTheme="minorHAnsi" w:eastAsiaTheme="minorHAnsi" w:hAnsiTheme="minorHAnsi" w:hint="eastAsia"/>
+                <w:color w:val="000000" w:themeColor="text1"/>
+                <w:sz w:val="21"/>
+                <w:szCs w:val="21"/>
+              </w:rPr>
+              <w:t xml:space="preserve"> </w:t>
+            </w:r>
+            <w:r>
+              <w:rPr>
+                <w:rFonts w:asciiTheme="minorHAnsi" w:eastAsiaTheme="minorHAnsi" w:hAnsiTheme="minorHAnsi" w:hint="eastAsia"/>
+                <w:color w:val="000000" w:themeColor="text1"/>
+                <w:sz w:val="21"/>
+                <w:szCs w:val="21"/>
+              </w:rPr>
+              <w:t>＞</w:t>
+            </w:r>
+            <w:r>
+              <w:rPr>
+                <w:rFonts w:asciiTheme="minorHAnsi" w:eastAsiaTheme="minorHAnsi" w:hAnsiTheme="minorHAnsi" w:hint="eastAsia"/>
+                <w:color w:val="000000" w:themeColor="text1"/>
+                <w:sz w:val="21"/>
+                <w:szCs w:val="21"/>
+              </w:rPr>
+              <w:t xml:space="preserve"> </w:t>
+            </w:r>
+            <w:r>
+              <w:rPr>
+                <w:rFonts w:asciiTheme="minorHAnsi" w:eastAsiaTheme="minorHAnsi" w:hAnsiTheme="minorHAnsi" w:hint="eastAsia"/>
+                <w:color w:val="000000" w:themeColor="text1"/>
+                <w:sz w:val="21"/>
+                <w:szCs w:val="21"/>
+              </w:rPr>
+              <w:t>変更履歴：承諾ボタンの下向き矢印</w:t>
+            </w:r>
+            <w:r>
+              <w:rPr>
+                <w:rFonts w:asciiTheme="minorHAnsi" w:eastAsiaTheme="minorHAnsi" w:hAnsiTheme="minorHAnsi" w:hint="eastAsia"/>
+                <w:color w:val="000000" w:themeColor="text1"/>
+                <w:sz w:val="21"/>
+                <w:szCs w:val="21"/>
+              </w:rPr>
+              <w:t xml:space="preserve"> </w:t>
+            </w:r>
+            <w:r>
+              <w:rPr>
+                <w:rFonts w:asciiTheme="minorHAnsi" w:eastAsiaTheme="minorHAnsi" w:hAnsiTheme="minorHAnsi" w:hint="eastAsia"/>
+                <w:color w:val="000000" w:themeColor="text1"/>
+                <w:sz w:val="21"/>
+                <w:szCs w:val="21"/>
+              </w:rPr>
+              <w:t>＞</w:t>
+            </w:r>
+            <w:r>
+              <w:rPr>
+                <w:rFonts w:asciiTheme="minorHAnsi" w:eastAsiaTheme="minorHAnsi" w:hAnsiTheme="minorHAnsi" w:hint="eastAsia"/>
+                <w:color w:val="000000" w:themeColor="text1"/>
+                <w:sz w:val="21"/>
+                <w:szCs w:val="21"/>
+              </w:rPr>
+              <w:t xml:space="preserve"> </w:t>
+            </w:r>
+            <w:r>
+              <w:rPr>
+                <w:rFonts w:asciiTheme="minorHAnsi" w:eastAsiaTheme="minorHAnsi" w:hAnsiTheme="minorHAnsi" w:hint="eastAsia"/>
+                <w:color w:val="000000" w:themeColor="text1"/>
+                <w:sz w:val="21"/>
+                <w:szCs w:val="21"/>
+              </w:rPr>
+              <w:t>すべての変更を反映し、変更の記録を停止</w:t>
+            </w:r>
+          </w:p>
+          <w:p>
+            <w:pPr>
+              <w:snapToGrid w:val="0"/>
+              <w:spacing w:after="0" w:line="240" w:lineRule="auto"/>
+              <w:ind w:leftChars="-29" w:left="-64"/>
+              <w:contextualSpacing/>
+              <w:mirrorIndents/>
+              <w:rPr>
+                <w:rFonts w:asciiTheme="minorHAnsi" w:eastAsiaTheme="minorHAnsi" w:hAnsiTheme="minorHAnsi"/>
+                <w:color w:val="000000" w:themeColor="text1"/>
+                <w:sz w:val="21"/>
+                <w:szCs w:val="21"/>
+              </w:rPr>
+            </w:pPr>
+          </w:p>
+          <w:p>
+            <w:pPr>
+              <w:snapToGrid w:val="0"/>
+              <w:spacing w:after="0" w:line="240" w:lineRule="auto"/>
+              <w:ind w:leftChars="-29" w:left="-64"/>
+              <w:contextualSpacing/>
+              <w:mirrorIndents/>
+              <w:rPr>
+                <w:rFonts w:asciiTheme="minorHAnsi" w:eastAsiaTheme="minorHAnsi" w:hAnsiTheme="minorHAnsi"/>
+                <w:color w:val="000000" w:themeColor="text1"/>
+                <w:sz w:val="21"/>
+                <w:szCs w:val="21"/>
+              </w:rPr>
+            </w:pPr>
+            <w:r>
+              <w:rPr>
+                <w:rFonts w:asciiTheme="minorHAnsi" w:eastAsiaTheme="minorHAnsi" w:hAnsiTheme="minorHAnsi" w:hint="eastAsia"/>
+                <w:color w:val="000000" w:themeColor="text1"/>
+                <w:sz w:val="21"/>
+                <w:szCs w:val="21"/>
+              </w:rPr>
+              <w:t>★</w:t>
+            </w:r>
+            <w:r>
+              <w:rPr>
+                <w:rFonts w:asciiTheme="minorHAnsi" w:eastAsiaTheme="minorHAnsi" w:hAnsiTheme="minorHAnsi" w:hint="eastAsia"/>
+                <w:b/>
+                <w:bCs/>
+                <w:color w:val="000000" w:themeColor="text1"/>
+                <w:sz w:val="21"/>
+                <w:szCs w:val="21"/>
               </w:rPr>
               <w:t>「コメント」</w:t>
             </w:r>
@@ -5998,7 +7549,7 @@
                 <w:szCs w:val="21"/>
               </w:rPr>
               <w:drawing>
-                <wp:anchor distT="0" distB="0" distL="114300" distR="114300" simplePos="0" relativeHeight="251660288" behindDoc="0" locked="0" layoutInCell="1" allowOverlap="1" wp14:anchorId="57FEA120" wp14:editId="2C42F5BE">
+                <wp:anchor distT="0" distB="0" distL="114300" distR="114300" simplePos="0" relativeHeight="251660288" behindDoc="0" locked="0" layoutInCell="1" allowOverlap="1" wp14:anchorId="57FEA120" wp14:editId="3A1B6A1F">
                   <wp:simplePos x="0" y="0"/>
                   <wp:positionH relativeFrom="column">
                     <wp:posOffset>-4868</wp:posOffset>

</xml_diff>

<commit_message>
Update return template and standard examples to v2 (#7)
</commit_message>
<xml_diff>
--- a/codex-skill/assets/return-template.docx
+++ b/codex-skill/assets/return-template.docx
@@ -111,7 +111,7 @@
           <w:sz w:val="28"/>
           <w:szCs w:val="28"/>
         </w:rPr>
-        <w:t>下記、A、Bの</w:t>
+        <w:t>下記、A、B、Cの</w:t>
       </w:r>
       <w:r>
         <w:rPr>
@@ -248,7 +248,7 @@
           <w:sz w:val="21"/>
           <w:szCs w:val="21"/>
         </w:rPr>
-        <w:t>Bは文末に記載</w:t>
+        <w:t>B,Cは文末に記載</w:t>
       </w:r>
       <w:r>
         <w:rPr>
@@ -344,6 +344,15 @@
                 <w:szCs w:val="21"/>
               </w:rPr>
             </w:pPr>
+            <w:r>
+              <w:rPr>
+                <w:rFonts w:asciiTheme="minorHAnsi" w:eastAsiaTheme="minorHAnsi" w:hAnsiTheme="minorHAnsi" w:hint="eastAsia"/>
+                <w:color w:val="FF0000"/>
+                <w:sz w:val="21"/>
+                <w:szCs w:val="21"/>
+              </w:rPr>
+              <w:t>すべての書類で同一の研究課題名としてください。</w:t>
+            </w:r>
           </w:p>
         </w:tc>
       </w:tr>
@@ -542,7 +551,70 @@
                 <w:sz w:val="21"/>
                 <w:szCs w:val="21"/>
               </w:rPr>
-              <w:t>前回の申請では個人情報管理責任者が設置されていました。本項目に追記するか、変更・削除する場合は「変更対比表」に記載して下さい。</w:t>
+              <w:t>個人情報管理責任者</w:t>
+            </w:r>
+            <w:r>
+              <w:rPr>
+                <w:rFonts w:asciiTheme="minorHAnsi" w:eastAsiaTheme="minorHAnsi" w:hAnsiTheme="minorHAnsi" w:hint="eastAsia"/>
+                <w:color w:val="FF0000"/>
+                <w:sz w:val="21"/>
+                <w:szCs w:val="21"/>
+              </w:rPr>
+              <w:t>を研究責任者と別に</w:t>
+            </w:r>
+            <w:r>
+              <w:rPr>
+                <w:rFonts w:asciiTheme="minorHAnsi" w:eastAsiaTheme="minorHAnsi" w:hAnsiTheme="minorHAnsi" w:hint="eastAsia"/>
+                <w:color w:val="FF0000"/>
+                <w:sz w:val="21"/>
+                <w:szCs w:val="21"/>
+              </w:rPr>
+              <w:t>設置</w:t>
+            </w:r>
+            <w:r>
+              <w:rPr>
+                <w:rFonts w:asciiTheme="minorHAnsi" w:eastAsiaTheme="minorHAnsi" w:hAnsiTheme="minorHAnsi" w:hint="eastAsia"/>
+                <w:color w:val="FF0000"/>
+                <w:sz w:val="21"/>
+                <w:szCs w:val="21"/>
+              </w:rPr>
+              <w:t>する場合は、ここに記載してください。その場合、</w:t>
+            </w:r>
+            <w:r>
+              <w:rPr>
+                <w:rFonts w:asciiTheme="minorHAnsi" w:eastAsiaTheme="minorHAnsi" w:hAnsiTheme="minorHAnsi"/>
+                <w:color w:val="FF0000"/>
+                <w:sz w:val="21"/>
+                <w:szCs w:val="21"/>
+              </w:rPr>
+              <w:t>”</w:t>
+            </w:r>
+            <w:r>
+              <w:rPr>
+                <w:rFonts w:asciiTheme="minorHAnsi" w:eastAsiaTheme="minorHAnsi" w:hAnsiTheme="minorHAnsi"/>
+                <w:color w:val="FF0000"/>
+                <w:sz w:val="21"/>
+                <w:szCs w:val="21"/>
+              </w:rPr>
+              <w:t>25. 個人情報等の取り扱い</w:t>
+            </w:r>
+            <w:r>
+              <w:rPr>
+                <w:rFonts w:asciiTheme="minorHAnsi" w:eastAsiaTheme="minorHAnsi" w:hAnsiTheme="minorHAnsi"/>
+                <w:color w:val="FF0000"/>
+                <w:sz w:val="21"/>
+                <w:szCs w:val="21"/>
+              </w:rPr>
+              <w:t>”</w:t>
+            </w:r>
+            <w:r>
+              <w:rPr>
+                <w:rFonts w:asciiTheme="minorHAnsi" w:eastAsiaTheme="minorHAnsi" w:hAnsiTheme="minorHAnsi" w:hint="eastAsia"/>
+                <w:color w:val="FF0000"/>
+                <w:sz w:val="21"/>
+                <w:szCs w:val="21"/>
+              </w:rPr>
+              <w:t>でも個人情報管理責任者を選択してください。</w:t>
             </w:r>
           </w:p>
         </w:tc>
@@ -607,22 +679,59 @@
               <w:ind w:leftChars="-29" w:left="-64"/>
               <w:contextualSpacing/>
               <w:mirrorIndents/>
-              <w:jc w:val="both"/>
-              <w:rPr>
-                <w:rFonts w:asciiTheme="minorHAnsi" w:eastAsiaTheme="minorHAnsi" w:hAnsiTheme="minorHAnsi"/>
-                <w:color w:val="FF0000"/>
-                <w:sz w:val="21"/>
-                <w:szCs w:val="21"/>
-              </w:rPr>
-            </w:pPr>
-            <w:r>
-              <w:rPr>
-                <w:rFonts w:asciiTheme="minorHAnsi" w:eastAsiaTheme="minorHAnsi" w:hAnsiTheme="minorHAnsi" w:hint="eastAsia"/>
-                <w:color w:val="FF0000"/>
-                <w:sz w:val="21"/>
-                <w:szCs w:val="21"/>
-              </w:rPr>
-              <w:t>研究責任者以外で連絡を必要とする担当者を記載してください。研究責任者以外または研究責任者の</w:t>
+              <w:rPr>
+                <w:rFonts w:asciiTheme="minorHAnsi" w:eastAsiaTheme="minorHAnsi" w:hAnsiTheme="minorHAnsi"/>
+                <w:color w:val="FF0000"/>
+                <w:sz w:val="21"/>
+                <w:szCs w:val="21"/>
+              </w:rPr>
+            </w:pPr>
+            <w:r>
+              <w:rPr>
+                <w:rFonts w:asciiTheme="minorHAnsi" w:eastAsiaTheme="minorHAnsi" w:hAnsiTheme="minorHAnsi" w:hint="eastAsia"/>
+                <w:color w:val="FF0000"/>
+                <w:sz w:val="21"/>
+                <w:szCs w:val="21"/>
+              </w:rPr>
+              <w:t>研究責任者</w:t>
+            </w:r>
+            <w:r>
+              <w:rPr>
+                <w:rFonts w:asciiTheme="minorHAnsi" w:eastAsiaTheme="minorHAnsi" w:hAnsiTheme="minorHAnsi" w:hint="eastAsia"/>
+                <w:b/>
+                <w:bCs/>
+                <w:color w:val="FF0000"/>
+                <w:sz w:val="21"/>
+                <w:szCs w:val="21"/>
+              </w:rPr>
+              <w:t>以外</w:t>
+            </w:r>
+            <w:r>
+              <w:rPr>
+                <w:rFonts w:asciiTheme="minorHAnsi" w:eastAsiaTheme="minorHAnsi" w:hAnsiTheme="minorHAnsi" w:hint="eastAsia"/>
+                <w:color w:val="FF0000"/>
+                <w:sz w:val="21"/>
+                <w:szCs w:val="21"/>
+              </w:rPr>
+              <w:t>で連絡を必要とする担当者を記載してください。</w:t>
+            </w:r>
+            <w:r>
+              <w:rPr>
+                <w:rFonts w:asciiTheme="minorHAnsi" w:eastAsiaTheme="minorHAnsi" w:hAnsiTheme="minorHAnsi"/>
+                <w:color w:val="FF0000"/>
+                <w:sz w:val="21"/>
+                <w:szCs w:val="21"/>
+              </w:rPr>
+              <w:br/>
+            </w:r>
+            <w:r>
+              <w:rPr>
+                <w:rFonts w:asciiTheme="minorHAnsi" w:eastAsiaTheme="minorHAnsi" w:hAnsiTheme="minorHAnsi" w:hint="eastAsia"/>
+                <w:color w:val="FF0000"/>
+                <w:sz w:val="21"/>
+                <w:szCs w:val="21"/>
+              </w:rPr>
+              <w:t>研究責任者以外または研究責任者の</w:t>
             </w:r>
             <w:r>
               <w:rPr>
@@ -640,7 +749,34 @@
                 <w:sz w:val="21"/>
                 <w:szCs w:val="21"/>
               </w:rPr>
-              <w:t>以外のメールアドレスに連絡が必要な場合にご記載ください。いない場合は空欄で構いません。</w:t>
+              <w:t>以外のメールアドレスに連絡が必要な場合にご記載ください。</w:t>
+            </w:r>
+            <w:r>
+              <w:rPr>
+                <w:rFonts w:asciiTheme="minorHAnsi" w:eastAsiaTheme="minorHAnsi" w:hAnsiTheme="minorHAnsi"/>
+                <w:color w:val="FF0000"/>
+                <w:sz w:val="21"/>
+                <w:szCs w:val="21"/>
+              </w:rPr>
+              <w:br/>
+            </w:r>
+            <w:r>
+              <w:rPr>
+                <w:rFonts w:asciiTheme="minorHAnsi" w:eastAsiaTheme="minorHAnsi" w:hAnsiTheme="minorHAnsi" w:hint="eastAsia"/>
+                <w:color w:val="FF0000"/>
+                <w:sz w:val="21"/>
+                <w:szCs w:val="21"/>
+              </w:rPr>
+              <w:t>特に</w:t>
+            </w:r>
+            <w:r>
+              <w:rPr>
+                <w:rFonts w:asciiTheme="minorHAnsi" w:eastAsiaTheme="minorHAnsi" w:hAnsiTheme="minorHAnsi" w:hint="eastAsia"/>
+                <w:color w:val="FF0000"/>
+                <w:sz w:val="21"/>
+                <w:szCs w:val="21"/>
+              </w:rPr>
+              <w:t>ない場合は空欄で構いません。</w:t>
             </w:r>
           </w:p>
         </w:tc>
@@ -1194,6 +1330,15 @@
                 <w:szCs w:val="21"/>
               </w:rPr>
             </w:pPr>
+            <w:r>
+              <w:rPr>
+                <w:rFonts w:asciiTheme="minorHAnsi" w:eastAsiaTheme="minorHAnsi" w:hAnsiTheme="minorHAnsi" w:hint="eastAsia"/>
+                <w:color w:val="FF0000"/>
+                <w:sz w:val="21"/>
+                <w:szCs w:val="21"/>
+              </w:rPr>
+              <w:t>目的と意義を分けて記載してください。</w:t>
+            </w:r>
           </w:p>
         </w:tc>
       </w:tr>
@@ -1287,24 +1432,17 @@
                 <w:sz w:val="21"/>
                 <w:szCs w:val="21"/>
               </w:rPr>
-              <w:t>全体の予定数はいくつでしょうか？全員昭和での患者さんに思えますので、</w:t>
-            </w:r>
-          </w:p>
-          <w:p>
-            <w:pPr>
-              <w:snapToGrid w:val="0"/>
-              <w:spacing w:after="0" w:line="240" w:lineRule="auto"/>
-              <w:ind w:leftChars="-29" w:left="-64"/>
-              <w:contextualSpacing/>
-              <w:mirrorIndents/>
-              <w:jc w:val="both"/>
-              <w:rPr>
-                <w:rFonts w:asciiTheme="minorHAnsi" w:eastAsiaTheme="minorHAnsi" w:hAnsiTheme="minorHAnsi"/>
+              <w:t>本研究の昭和医大がで実施する</w:t>
+            </w:r>
+            <w:r>
+              <w:rPr>
+                <w:rFonts w:asciiTheme="minorHAnsi" w:eastAsiaTheme="minorHAnsi" w:hAnsiTheme="minorHAnsi" w:hint="eastAsia"/>
                 <w:color w:val="EE0000"/>
                 <w:sz w:val="21"/>
                 <w:szCs w:val="21"/>
               </w:rPr>
-            </w:pPr>
+              <w:t>予定数</w:t>
+            </w:r>
             <w:r>
               <w:rPr>
                 <w:rFonts w:asciiTheme="minorHAnsi" w:eastAsiaTheme="minorHAnsi" w:hAnsiTheme="minorHAnsi" w:hint="eastAsia"/>
@@ -1312,7 +1450,7 @@
                 <w:sz w:val="21"/>
                 <w:szCs w:val="21"/>
               </w:rPr>
-              <w:t>下記のような記載になるのではと思っています。</w:t>
+              <w:t>と、多施設共同研究の場合は、全体の数を記載してください。</w:t>
             </w:r>
           </w:p>
           <w:p>
@@ -1337,7 +1475,7 @@
                 <w:sz w:val="21"/>
                 <w:szCs w:val="21"/>
               </w:rPr>
-              <w:t>昭和医科大学における予定対象者数： 300</w:t>
+              <w:t>例</w:t>
             </w:r>
           </w:p>
           <w:p>
@@ -1362,7 +1500,50 @@
                 <w:sz w:val="21"/>
                 <w:szCs w:val="21"/>
               </w:rPr>
-              <w:t>多機関共同研究の場合全体の予定対象者数：300</w:t>
+              <w:t>昭和医科大学における予定対象者数： 30</w:t>
+            </w:r>
+          </w:p>
+          <w:p>
+            <w:pPr>
+              <w:snapToGrid w:val="0"/>
+              <w:spacing w:after="0" w:line="240" w:lineRule="auto"/>
+              <w:ind w:leftChars="-29" w:left="-64"/>
+              <w:contextualSpacing/>
+              <w:mirrorIndents/>
+              <w:jc w:val="both"/>
+              <w:rPr>
+                <w:rFonts w:asciiTheme="minorHAnsi" w:eastAsiaTheme="minorHAnsi" w:hAnsiTheme="minorHAnsi"/>
+                <w:color w:val="EE0000"/>
+                <w:sz w:val="21"/>
+                <w:szCs w:val="21"/>
+              </w:rPr>
+            </w:pPr>
+            <w:r>
+              <w:rPr>
+                <w:rFonts w:asciiTheme="minorHAnsi" w:eastAsiaTheme="minorHAnsi" w:hAnsiTheme="minorHAnsi" w:hint="eastAsia"/>
+                <w:color w:val="EE0000"/>
+                <w:sz w:val="21"/>
+                <w:szCs w:val="21"/>
+              </w:rPr>
+              <w:t>多機関共同研究の場合全体の予定対象者数：</w:t>
+            </w:r>
+            <w:r>
+              <w:rPr>
+                <w:rFonts w:asciiTheme="minorHAnsi" w:eastAsiaTheme="minorHAnsi" w:hAnsiTheme="minorHAnsi" w:hint="eastAsia"/>
+                <w:color w:val="EE0000"/>
+                <w:sz w:val="21"/>
+                <w:szCs w:val="21"/>
+              </w:rPr>
+              <w:t>9</w:t>
+            </w:r>
+            <w:r>
+              <w:rPr>
+                <w:rFonts w:asciiTheme="minorHAnsi" w:eastAsiaTheme="minorHAnsi" w:hAnsiTheme="minorHAnsi" w:hint="eastAsia"/>
+                <w:color w:val="EE0000"/>
+                <w:sz w:val="21"/>
+                <w:szCs w:val="21"/>
+              </w:rPr>
+              <w:t>0</w:t>
             </w:r>
           </w:p>
           <w:p>
@@ -1514,6 +1695,73 @@
                 <w:sz w:val="21"/>
                 <w:szCs w:val="21"/>
               </w:rPr>
+              <w:t>選択基準：</w:t>
+            </w:r>
+          </w:p>
+          <w:p>
+            <w:pPr>
+              <w:snapToGrid w:val="0"/>
+              <w:spacing w:after="0" w:line="240" w:lineRule="auto"/>
+              <w:ind w:leftChars="-29" w:left="-64"/>
+              <w:contextualSpacing/>
+              <w:mirrorIndents/>
+              <w:jc w:val="both"/>
+              <w:rPr>
+                <w:rFonts w:asciiTheme="minorHAnsi" w:eastAsiaTheme="minorHAnsi" w:hAnsiTheme="minorHAnsi"/>
+                <w:color w:val="FF0000"/>
+                <w:sz w:val="21"/>
+                <w:szCs w:val="21"/>
+              </w:rPr>
+            </w:pPr>
+            <w:r>
+              <w:rPr>
+                <w:rFonts w:asciiTheme="minorHAnsi" w:eastAsiaTheme="minorHAnsi" w:hAnsiTheme="minorHAnsi" w:hint="eastAsia"/>
+                <w:color w:val="FF0000"/>
+                <w:sz w:val="21"/>
+                <w:szCs w:val="21"/>
+              </w:rPr>
+              <w:t>どのような条件の人が本研究の対象となるかを記載する部分です。</w:t>
+            </w:r>
+          </w:p>
+          <w:p>
+            <w:pPr>
+              <w:snapToGrid w:val="0"/>
+              <w:spacing w:after="0" w:line="240" w:lineRule="auto"/>
+              <w:ind w:leftChars="-29" w:left="-64"/>
+              <w:contextualSpacing/>
+              <w:mirrorIndents/>
+              <w:jc w:val="both"/>
+              <w:rPr>
+                <w:rFonts w:asciiTheme="minorHAnsi" w:eastAsiaTheme="minorHAnsi" w:hAnsiTheme="minorHAnsi"/>
+                <w:color w:val="FF0000"/>
+                <w:sz w:val="21"/>
+                <w:szCs w:val="21"/>
+              </w:rPr>
+            </w:pPr>
+          </w:p>
+          <w:p>
+            <w:pPr>
+              <w:snapToGrid w:val="0"/>
+              <w:spacing w:after="0" w:line="240" w:lineRule="auto"/>
+              <w:ind w:leftChars="-29" w:left="-64"/>
+              <w:contextualSpacing/>
+              <w:mirrorIndents/>
+              <w:jc w:val="both"/>
+              <w:rPr>
+                <w:rFonts w:asciiTheme="minorHAnsi" w:eastAsiaTheme="minorHAnsi" w:hAnsiTheme="minorHAnsi"/>
+                <w:color w:val="FF0000"/>
+                <w:sz w:val="21"/>
+                <w:szCs w:val="21"/>
+              </w:rPr>
+            </w:pPr>
+            <w:r>
+              <w:rPr>
+                <w:rFonts w:asciiTheme="minorHAnsi" w:eastAsiaTheme="minorHAnsi" w:hAnsiTheme="minorHAnsi" w:hint="eastAsia"/>
+                <w:color w:val="FF0000"/>
+                <w:sz w:val="21"/>
+                <w:szCs w:val="21"/>
+              </w:rPr>
+              <w:lastRenderedPageBreak/>
               <w:t>除外基準：</w:t>
             </w:r>
           </w:p>
@@ -1541,6 +1789,385 @@
               </w:rPr>
               <w:t>除外基準は、選択基準に合致する研究対象者候補のうち、特定の条件により研究対象から除外するための基準です。</w:t>
             </w:r>
+          </w:p>
+          <w:p>
+            <w:pPr>
+              <w:snapToGrid w:val="0"/>
+              <w:spacing w:after="0" w:line="240" w:lineRule="auto"/>
+              <w:ind w:leftChars="-29" w:left="-64"/>
+              <w:contextualSpacing/>
+              <w:mirrorIndents/>
+              <w:jc w:val="both"/>
+              <w:rPr>
+                <w:rFonts w:asciiTheme="minorHAnsi" w:eastAsiaTheme="minorHAnsi" w:hAnsiTheme="minorHAnsi"/>
+                <w:color w:val="FF0000"/>
+                <w:sz w:val="21"/>
+                <w:szCs w:val="21"/>
+              </w:rPr>
+            </w:pPr>
+            <w:r>
+              <w:rPr>
+                <w:rFonts w:asciiTheme="minorHAnsi" w:eastAsiaTheme="minorHAnsi" w:hAnsiTheme="minorHAnsi" w:hint="eastAsia"/>
+                <w:color w:val="FF0000"/>
+                <w:sz w:val="21"/>
+                <w:szCs w:val="21"/>
+              </w:rPr>
+              <w:t>記載例）</w:t>
+            </w:r>
+          </w:p>
+          <w:p>
+            <w:pPr>
+              <w:snapToGrid w:val="0"/>
+              <w:spacing w:after="0" w:line="240" w:lineRule="auto"/>
+              <w:ind w:leftChars="-29" w:left="-64"/>
+              <w:contextualSpacing/>
+              <w:mirrorIndents/>
+              <w:jc w:val="both"/>
+              <w:rPr>
+                <w:rFonts w:asciiTheme="minorHAnsi" w:eastAsiaTheme="minorHAnsi" w:hAnsiTheme="minorHAnsi"/>
+                <w:color w:val="FF0000"/>
+                <w:sz w:val="21"/>
+                <w:szCs w:val="21"/>
+              </w:rPr>
+            </w:pPr>
+            <w:r>
+              <w:rPr>
+                <w:rFonts w:asciiTheme="minorHAnsi" w:eastAsiaTheme="minorHAnsi" w:hAnsiTheme="minorHAnsi" w:hint="eastAsia"/>
+                <w:color w:val="FF0000"/>
+                <w:sz w:val="21"/>
+                <w:szCs w:val="21"/>
+              </w:rPr>
+              <w:t>・</w:t>
+            </w:r>
+            <w:r>
+              <w:rPr>
+                <w:rFonts w:asciiTheme="minorHAnsi" w:eastAsiaTheme="minorHAnsi" w:hAnsiTheme="minorHAnsi" w:hint="eastAsia"/>
+                <w:color w:val="FF0000"/>
+                <w:sz w:val="21"/>
+                <w:szCs w:val="21"/>
+              </w:rPr>
+              <w:t>選択基準</w:t>
+            </w:r>
+          </w:p>
+          <w:p>
+            <w:pPr>
+              <w:snapToGrid w:val="0"/>
+              <w:spacing w:after="0" w:line="240" w:lineRule="auto"/>
+              <w:ind w:leftChars="-29" w:left="-64"/>
+              <w:contextualSpacing/>
+              <w:mirrorIndents/>
+              <w:jc w:val="both"/>
+              <w:rPr>
+                <w:rFonts w:asciiTheme="minorHAnsi" w:eastAsiaTheme="minorHAnsi" w:hAnsiTheme="minorHAnsi"/>
+                <w:color w:val="FF0000"/>
+                <w:sz w:val="21"/>
+                <w:szCs w:val="21"/>
+              </w:rPr>
+            </w:pPr>
+            <w:r>
+              <w:rPr>
+                <w:rFonts w:asciiTheme="minorHAnsi" w:eastAsiaTheme="minorHAnsi" w:hAnsiTheme="minorHAnsi" w:hint="eastAsia"/>
+                <w:color w:val="FF0000"/>
+                <w:sz w:val="21"/>
+                <w:szCs w:val="21"/>
+              </w:rPr>
+              <w:t>以下のすべてを満たす患者を対象とする。</w:t>
+            </w:r>
+          </w:p>
+          <w:p>
+            <w:pPr>
+              <w:snapToGrid w:val="0"/>
+              <w:spacing w:after="0" w:line="240" w:lineRule="auto"/>
+              <w:ind w:leftChars="-29" w:left="-64"/>
+              <w:contextualSpacing/>
+              <w:mirrorIndents/>
+              <w:jc w:val="both"/>
+              <w:rPr>
+                <w:rFonts w:asciiTheme="minorHAnsi" w:eastAsiaTheme="minorHAnsi" w:hAnsiTheme="minorHAnsi"/>
+                <w:color w:val="FF0000"/>
+                <w:sz w:val="21"/>
+                <w:szCs w:val="21"/>
+              </w:rPr>
+            </w:pPr>
+            <w:r>
+              <w:rPr>
+                <w:rFonts w:asciiTheme="minorHAnsi" w:eastAsiaTheme="minorHAnsi" w:hAnsiTheme="minorHAnsi"/>
+                <w:color w:val="FF0000"/>
+                <w:sz w:val="21"/>
+                <w:szCs w:val="21"/>
+              </w:rPr>
+              <w:t xml:space="preserve">1. </w:t>
+            </w:r>
+            <w:r>
+              <w:rPr>
+                <w:rFonts w:asciiTheme="minorHAnsi" w:eastAsiaTheme="minorHAnsi" w:hAnsiTheme="minorHAnsi" w:hint="eastAsia"/>
+                <w:color w:val="FF0000"/>
+                <w:sz w:val="21"/>
+                <w:szCs w:val="21"/>
+              </w:rPr>
+              <w:t>高血圧と診断されている患者。</w:t>
+            </w:r>
+          </w:p>
+          <w:p>
+            <w:pPr>
+              <w:snapToGrid w:val="0"/>
+              <w:spacing w:after="0" w:line="240" w:lineRule="auto"/>
+              <w:ind w:leftChars="-29" w:left="-64"/>
+              <w:contextualSpacing/>
+              <w:mirrorIndents/>
+              <w:jc w:val="both"/>
+              <w:rPr>
+                <w:rFonts w:asciiTheme="minorHAnsi" w:eastAsiaTheme="minorHAnsi" w:hAnsiTheme="minorHAnsi"/>
+                <w:color w:val="FF0000"/>
+                <w:sz w:val="21"/>
+                <w:szCs w:val="21"/>
+              </w:rPr>
+            </w:pPr>
+            <w:r>
+              <w:rPr>
+                <w:rFonts w:asciiTheme="minorHAnsi" w:eastAsiaTheme="minorHAnsi" w:hAnsiTheme="minorHAnsi"/>
+                <w:color w:val="FF0000"/>
+                <w:sz w:val="21"/>
+                <w:szCs w:val="21"/>
+              </w:rPr>
+              <w:t xml:space="preserve">2. </w:t>
+            </w:r>
+            <w:r>
+              <w:rPr>
+                <w:rFonts w:asciiTheme="minorHAnsi" w:eastAsiaTheme="minorHAnsi" w:hAnsiTheme="minorHAnsi" w:hint="eastAsia"/>
+                <w:color w:val="FF0000"/>
+                <w:sz w:val="21"/>
+                <w:szCs w:val="21"/>
+              </w:rPr>
+              <w:t>同意取得時の年齢が</w:t>
+            </w:r>
+            <w:r>
+              <w:rPr>
+                <w:rFonts w:asciiTheme="minorHAnsi" w:eastAsiaTheme="minorHAnsi" w:hAnsiTheme="minorHAnsi"/>
+                <w:color w:val="FF0000"/>
+                <w:sz w:val="21"/>
+                <w:szCs w:val="21"/>
+              </w:rPr>
+              <w:t>18</w:t>
+            </w:r>
+            <w:r>
+              <w:rPr>
+                <w:rFonts w:asciiTheme="minorHAnsi" w:eastAsiaTheme="minorHAnsi" w:hAnsiTheme="minorHAnsi" w:hint="eastAsia"/>
+                <w:color w:val="FF0000"/>
+                <w:sz w:val="21"/>
+                <w:szCs w:val="21"/>
+              </w:rPr>
+              <w:t>歳以上の患者。</w:t>
+            </w:r>
+          </w:p>
+          <w:p>
+            <w:pPr>
+              <w:snapToGrid w:val="0"/>
+              <w:spacing w:after="0" w:line="240" w:lineRule="auto"/>
+              <w:ind w:leftChars="-29" w:left="-64"/>
+              <w:contextualSpacing/>
+              <w:mirrorIndents/>
+              <w:jc w:val="both"/>
+              <w:rPr>
+                <w:rFonts w:asciiTheme="minorHAnsi" w:eastAsiaTheme="minorHAnsi" w:hAnsiTheme="minorHAnsi"/>
+                <w:color w:val="FF0000"/>
+                <w:sz w:val="21"/>
+                <w:szCs w:val="21"/>
+              </w:rPr>
+            </w:pPr>
+            <w:r>
+              <w:rPr>
+                <w:rFonts w:asciiTheme="minorHAnsi" w:eastAsiaTheme="minorHAnsi" w:hAnsiTheme="minorHAnsi"/>
+                <w:color w:val="FF0000"/>
+                <w:sz w:val="21"/>
+                <w:szCs w:val="21"/>
+              </w:rPr>
+              <w:t xml:space="preserve">3. </w:t>
+            </w:r>
+            <w:r>
+              <w:rPr>
+                <w:rFonts w:asciiTheme="minorHAnsi" w:eastAsiaTheme="minorHAnsi" w:hAnsiTheme="minorHAnsi" w:hint="eastAsia"/>
+                <w:color w:val="FF0000"/>
+                <w:sz w:val="21"/>
+                <w:szCs w:val="21"/>
+              </w:rPr>
+              <w:t>本研究への参加について、本人の文書同意が得られた患者。</w:t>
+            </w:r>
+          </w:p>
+          <w:p>
+            <w:pPr>
+              <w:snapToGrid w:val="0"/>
+              <w:spacing w:after="0" w:line="240" w:lineRule="auto"/>
+              <w:ind w:leftChars="-29" w:left="-64"/>
+              <w:contextualSpacing/>
+              <w:mirrorIndents/>
+              <w:jc w:val="both"/>
+              <w:rPr>
+                <w:rFonts w:asciiTheme="minorHAnsi" w:eastAsiaTheme="minorHAnsi" w:hAnsiTheme="minorHAnsi"/>
+                <w:color w:val="FF0000"/>
+                <w:sz w:val="21"/>
+                <w:szCs w:val="21"/>
+              </w:rPr>
+            </w:pPr>
+          </w:p>
+          <w:p>
+            <w:pPr>
+              <w:snapToGrid w:val="0"/>
+              <w:spacing w:after="0" w:line="240" w:lineRule="auto"/>
+              <w:ind w:leftChars="-29" w:left="-64"/>
+              <w:contextualSpacing/>
+              <w:mirrorIndents/>
+              <w:jc w:val="both"/>
+              <w:rPr>
+                <w:rFonts w:asciiTheme="minorHAnsi" w:eastAsiaTheme="minorHAnsi" w:hAnsiTheme="minorHAnsi"/>
+                <w:color w:val="FF0000"/>
+                <w:sz w:val="21"/>
+                <w:szCs w:val="21"/>
+              </w:rPr>
+            </w:pPr>
+            <w:r>
+              <w:rPr>
+                <w:rFonts w:asciiTheme="minorHAnsi" w:eastAsiaTheme="minorHAnsi" w:hAnsiTheme="minorHAnsi" w:hint="eastAsia"/>
+                <w:color w:val="FF0000"/>
+                <w:sz w:val="21"/>
+                <w:szCs w:val="21"/>
+              </w:rPr>
+              <w:t>・</w:t>
+            </w:r>
+            <w:r>
+              <w:rPr>
+                <w:rFonts w:asciiTheme="minorHAnsi" w:eastAsiaTheme="minorHAnsi" w:hAnsiTheme="minorHAnsi" w:hint="eastAsia"/>
+                <w:color w:val="FF0000"/>
+                <w:sz w:val="21"/>
+                <w:szCs w:val="21"/>
+              </w:rPr>
+              <w:t>除外基準</w:t>
+            </w:r>
+          </w:p>
+          <w:p>
+            <w:pPr>
+              <w:snapToGrid w:val="0"/>
+              <w:spacing w:after="0" w:line="240" w:lineRule="auto"/>
+              <w:ind w:leftChars="-29" w:left="-64"/>
+              <w:contextualSpacing/>
+              <w:mirrorIndents/>
+              <w:jc w:val="both"/>
+              <w:rPr>
+                <w:rFonts w:asciiTheme="minorHAnsi" w:eastAsiaTheme="minorHAnsi" w:hAnsiTheme="minorHAnsi"/>
+                <w:color w:val="FF0000"/>
+                <w:sz w:val="21"/>
+                <w:szCs w:val="21"/>
+              </w:rPr>
+            </w:pPr>
+            <w:r>
+              <w:rPr>
+                <w:rFonts w:asciiTheme="minorHAnsi" w:eastAsiaTheme="minorHAnsi" w:hAnsiTheme="minorHAnsi" w:hint="eastAsia"/>
+                <w:color w:val="FF0000"/>
+                <w:sz w:val="21"/>
+                <w:szCs w:val="21"/>
+              </w:rPr>
+              <w:t>以下のいずれかに該当する患者は除外する。</w:t>
+            </w:r>
+          </w:p>
+          <w:p>
+            <w:pPr>
+              <w:snapToGrid w:val="0"/>
+              <w:spacing w:after="0" w:line="240" w:lineRule="auto"/>
+              <w:ind w:leftChars="-29" w:left="-64"/>
+              <w:contextualSpacing/>
+              <w:mirrorIndents/>
+              <w:jc w:val="both"/>
+              <w:rPr>
+                <w:rFonts w:asciiTheme="minorHAnsi" w:eastAsiaTheme="minorHAnsi" w:hAnsiTheme="minorHAnsi"/>
+                <w:color w:val="FF0000"/>
+                <w:sz w:val="21"/>
+                <w:szCs w:val="21"/>
+              </w:rPr>
+            </w:pPr>
+            <w:r>
+              <w:rPr>
+                <w:rFonts w:asciiTheme="minorHAnsi" w:eastAsiaTheme="minorHAnsi" w:hAnsiTheme="minorHAnsi"/>
+                <w:color w:val="FF0000"/>
+                <w:sz w:val="21"/>
+                <w:szCs w:val="21"/>
+              </w:rPr>
+              <w:t xml:space="preserve">1. </w:t>
+            </w:r>
+            <w:r>
+              <w:rPr>
+                <w:rFonts w:asciiTheme="minorHAnsi" w:eastAsiaTheme="minorHAnsi" w:hAnsiTheme="minorHAnsi" w:hint="eastAsia"/>
+                <w:color w:val="FF0000"/>
+                <w:sz w:val="21"/>
+                <w:szCs w:val="21"/>
+              </w:rPr>
+              <w:t>研究薬の成分に対する過敏症の既往がある患者。</w:t>
+            </w:r>
+          </w:p>
+          <w:p>
+            <w:pPr>
+              <w:snapToGrid w:val="0"/>
+              <w:spacing w:after="0" w:line="240" w:lineRule="auto"/>
+              <w:ind w:leftChars="-29" w:left="-64"/>
+              <w:contextualSpacing/>
+              <w:mirrorIndents/>
+              <w:jc w:val="both"/>
+              <w:rPr>
+                <w:rFonts w:asciiTheme="minorHAnsi" w:eastAsiaTheme="minorHAnsi" w:hAnsiTheme="minorHAnsi"/>
+                <w:color w:val="FF0000"/>
+                <w:sz w:val="21"/>
+                <w:szCs w:val="21"/>
+              </w:rPr>
+            </w:pPr>
+            <w:r>
+              <w:rPr>
+                <w:rFonts w:asciiTheme="minorHAnsi" w:eastAsiaTheme="minorHAnsi" w:hAnsiTheme="minorHAnsi"/>
+                <w:color w:val="FF0000"/>
+                <w:sz w:val="21"/>
+                <w:szCs w:val="21"/>
+              </w:rPr>
+              <w:t xml:space="preserve">2. </w:t>
+            </w:r>
+            <w:r>
+              <w:rPr>
+                <w:rFonts w:asciiTheme="minorHAnsi" w:eastAsiaTheme="minorHAnsi" w:hAnsiTheme="minorHAnsi" w:hint="eastAsia"/>
+                <w:color w:val="FF0000"/>
+                <w:sz w:val="21"/>
+                <w:szCs w:val="21"/>
+              </w:rPr>
+              <w:t>研究薬との併用が禁忌とされる薬剤を継続する必要がある患者。</w:t>
+            </w:r>
+          </w:p>
+          <w:p>
+            <w:pPr>
+              <w:snapToGrid w:val="0"/>
+              <w:spacing w:after="0" w:line="240" w:lineRule="auto"/>
+              <w:ind w:leftChars="-29" w:left="-64"/>
+              <w:contextualSpacing/>
+              <w:mirrorIndents/>
+              <w:jc w:val="both"/>
+              <w:rPr>
+                <w:rFonts w:asciiTheme="minorHAnsi" w:eastAsiaTheme="minorHAnsi" w:hAnsiTheme="minorHAnsi"/>
+                <w:color w:val="FF0000"/>
+                <w:sz w:val="21"/>
+                <w:szCs w:val="21"/>
+              </w:rPr>
+            </w:pPr>
+          </w:p>
+          <w:p>
+            <w:pPr>
+              <w:snapToGrid w:val="0"/>
+              <w:spacing w:after="0" w:line="240" w:lineRule="auto"/>
+              <w:ind w:leftChars="-29" w:left="-64"/>
+              <w:contextualSpacing/>
+              <w:mirrorIndents/>
+              <w:jc w:val="both"/>
+              <w:rPr>
+                <w:rFonts w:asciiTheme="minorHAnsi" w:eastAsiaTheme="minorHAnsi" w:hAnsiTheme="minorHAnsi"/>
+                <w:color w:val="FF0000"/>
+                <w:sz w:val="21"/>
+                <w:szCs w:val="21"/>
+              </w:rPr>
+            </w:pPr>
           </w:p>
         </w:tc>
       </w:tr>
@@ -1582,6 +2209,7 @@
                 <w:sz w:val="21"/>
                 <w:szCs w:val="21"/>
               </w:rPr>
+              <w:lastRenderedPageBreak/>
               <w:t>1</w:t>
             </w:r>
             <w:r>
@@ -1627,6 +2255,239 @@
                 <w:szCs w:val="21"/>
               </w:rPr>
             </w:pPr>
+            <w:r>
+              <w:rPr>
+                <w:rFonts w:asciiTheme="minorHAnsi" w:eastAsiaTheme="minorHAnsi" w:hAnsiTheme="minorHAnsi" w:hint="eastAsia"/>
+                <w:color w:val="FF0000"/>
+                <w:sz w:val="21"/>
+                <w:szCs w:val="21"/>
+              </w:rPr>
+              <w:t>「研究の科学的合理性の根拠」は、「なぜこの研究が必要で、この方法なら知りたいことを確かめられるのか」を説明する項目です。</w:t>
+            </w:r>
+          </w:p>
+          <w:p>
+            <w:pPr>
+              <w:snapToGrid w:val="0"/>
+              <w:spacing w:after="0" w:line="240" w:lineRule="auto"/>
+              <w:ind w:leftChars="-29" w:left="-64"/>
+              <w:contextualSpacing/>
+              <w:mirrorIndents/>
+              <w:jc w:val="both"/>
+              <w:rPr>
+                <w:rFonts w:asciiTheme="minorHAnsi" w:eastAsiaTheme="minorHAnsi" w:hAnsiTheme="minorHAnsi"/>
+                <w:color w:val="FF0000"/>
+                <w:sz w:val="21"/>
+                <w:szCs w:val="21"/>
+              </w:rPr>
+            </w:pPr>
+            <w:r>
+              <w:rPr>
+                <w:rFonts w:asciiTheme="minorHAnsi" w:eastAsiaTheme="minorHAnsi" w:hAnsiTheme="minorHAnsi" w:hint="eastAsia"/>
+                <w:color w:val="FF0000"/>
+                <w:sz w:val="21"/>
+                <w:szCs w:val="21"/>
+              </w:rPr>
+              <w:t>次の</w:t>
+            </w:r>
+            <w:r>
+              <w:rPr>
+                <w:rFonts w:asciiTheme="minorHAnsi" w:eastAsiaTheme="minorHAnsi" w:hAnsiTheme="minorHAnsi"/>
+                <w:color w:val="FF0000"/>
+                <w:sz w:val="21"/>
+                <w:szCs w:val="21"/>
+              </w:rPr>
+              <w:t>3</w:t>
+            </w:r>
+            <w:r>
+              <w:rPr>
+                <w:rFonts w:asciiTheme="minorHAnsi" w:eastAsiaTheme="minorHAnsi" w:hAnsiTheme="minorHAnsi" w:hint="eastAsia"/>
+                <w:color w:val="FF0000"/>
+                <w:sz w:val="21"/>
+                <w:szCs w:val="21"/>
+              </w:rPr>
+              <w:t>点を、短くつなげて書くと整理できます。</w:t>
+            </w:r>
+          </w:p>
+          <w:p>
+            <w:pPr>
+              <w:snapToGrid w:val="0"/>
+              <w:spacing w:after="0" w:line="240" w:lineRule="auto"/>
+              <w:ind w:leftChars="-29" w:left="-64"/>
+              <w:contextualSpacing/>
+              <w:mirrorIndents/>
+              <w:jc w:val="both"/>
+              <w:rPr>
+                <w:rFonts w:asciiTheme="minorHAnsi" w:eastAsiaTheme="minorHAnsi" w:hAnsiTheme="minorHAnsi"/>
+                <w:color w:val="FF0000"/>
+                <w:sz w:val="21"/>
+                <w:szCs w:val="21"/>
+              </w:rPr>
+            </w:pPr>
+            <w:r>
+              <w:rPr>
+                <w:rFonts w:asciiTheme="minorHAnsi" w:eastAsiaTheme="minorHAnsi" w:hAnsiTheme="minorHAnsi"/>
+                <w:color w:val="FF0000"/>
+                <w:sz w:val="21"/>
+                <w:szCs w:val="21"/>
+              </w:rPr>
+              <w:t xml:space="preserve">- </w:t>
+            </w:r>
+            <w:r>
+              <w:rPr>
+                <w:rFonts w:asciiTheme="minorHAnsi" w:eastAsiaTheme="minorHAnsi" w:hAnsiTheme="minorHAnsi" w:hint="eastAsia"/>
+                <w:color w:val="FF0000"/>
+                <w:sz w:val="21"/>
+                <w:szCs w:val="21"/>
+              </w:rPr>
+              <w:t>わかっていること：これまでの研究で何がわかっているか。</w:t>
+            </w:r>
+          </w:p>
+          <w:p>
+            <w:pPr>
+              <w:snapToGrid w:val="0"/>
+              <w:spacing w:after="0" w:line="240" w:lineRule="auto"/>
+              <w:ind w:leftChars="-29" w:left="-64"/>
+              <w:contextualSpacing/>
+              <w:mirrorIndents/>
+              <w:jc w:val="both"/>
+              <w:rPr>
+                <w:rFonts w:asciiTheme="minorHAnsi" w:eastAsiaTheme="minorHAnsi" w:hAnsiTheme="minorHAnsi"/>
+                <w:color w:val="FF0000"/>
+                <w:sz w:val="21"/>
+                <w:szCs w:val="21"/>
+              </w:rPr>
+            </w:pPr>
+            <w:r>
+              <w:rPr>
+                <w:rFonts w:asciiTheme="minorHAnsi" w:eastAsiaTheme="minorHAnsi" w:hAnsiTheme="minorHAnsi"/>
+                <w:color w:val="FF0000"/>
+                <w:sz w:val="21"/>
+                <w:szCs w:val="21"/>
+              </w:rPr>
+              <w:t xml:space="preserve">- </w:t>
+            </w:r>
+            <w:r>
+              <w:rPr>
+                <w:rFonts w:asciiTheme="minorHAnsi" w:eastAsiaTheme="minorHAnsi" w:hAnsiTheme="minorHAnsi" w:hint="eastAsia"/>
+                <w:color w:val="FF0000"/>
+                <w:sz w:val="21"/>
+                <w:szCs w:val="21"/>
+              </w:rPr>
+              <w:t>わかっていないこと：何がまだ不明か。</w:t>
+            </w:r>
+          </w:p>
+          <w:p>
+            <w:pPr>
+              <w:snapToGrid w:val="0"/>
+              <w:spacing w:after="0" w:line="240" w:lineRule="auto"/>
+              <w:ind w:leftChars="-29" w:left="-64"/>
+              <w:contextualSpacing/>
+              <w:mirrorIndents/>
+              <w:jc w:val="both"/>
+              <w:rPr>
+                <w:rFonts w:asciiTheme="minorHAnsi" w:eastAsiaTheme="minorHAnsi" w:hAnsiTheme="minorHAnsi"/>
+                <w:color w:val="FF0000"/>
+                <w:sz w:val="21"/>
+                <w:szCs w:val="21"/>
+              </w:rPr>
+            </w:pPr>
+            <w:r>
+              <w:rPr>
+                <w:rFonts w:asciiTheme="minorHAnsi" w:eastAsiaTheme="minorHAnsi" w:hAnsiTheme="minorHAnsi"/>
+                <w:color w:val="FF0000"/>
+                <w:sz w:val="21"/>
+                <w:szCs w:val="21"/>
+              </w:rPr>
+              <w:t xml:space="preserve">- </w:t>
+            </w:r>
+            <w:r>
+              <w:rPr>
+                <w:rFonts w:asciiTheme="minorHAnsi" w:eastAsiaTheme="minorHAnsi" w:hAnsiTheme="minorHAnsi" w:hint="eastAsia"/>
+                <w:color w:val="FF0000"/>
+                <w:sz w:val="21"/>
+                <w:szCs w:val="21"/>
+              </w:rPr>
+              <w:t>確かめる方法：どの対象者を、どのように調べれば、その疑問に答えられるか。</w:t>
+            </w:r>
+          </w:p>
+          <w:p>
+            <w:pPr>
+              <w:snapToGrid w:val="0"/>
+              <w:spacing w:after="0" w:line="240" w:lineRule="auto"/>
+              <w:ind w:leftChars="-29" w:left="-64"/>
+              <w:contextualSpacing/>
+              <w:mirrorIndents/>
+              <w:jc w:val="both"/>
+              <w:rPr>
+                <w:rFonts w:asciiTheme="minorHAnsi" w:eastAsiaTheme="minorHAnsi" w:hAnsiTheme="minorHAnsi" w:hint="eastAsia"/>
+                <w:color w:val="FF0000"/>
+                <w:sz w:val="21"/>
+                <w:szCs w:val="21"/>
+              </w:rPr>
+            </w:pPr>
+            <w:r>
+              <w:rPr>
+                <w:rFonts w:asciiTheme="minorHAnsi" w:eastAsiaTheme="minorHAnsi" w:hAnsiTheme="minorHAnsi" w:hint="eastAsia"/>
+                <w:color w:val="FF0000"/>
+                <w:sz w:val="21"/>
+                <w:szCs w:val="21"/>
+              </w:rPr>
+              <w:t>「</w:t>
+            </w:r>
+            <w:r>
+              <w:rPr>
+                <w:rFonts w:asciiTheme="minorHAnsi" w:eastAsiaTheme="minorHAnsi" w:hAnsiTheme="minorHAnsi" w:hint="eastAsia"/>
+                <w:color w:val="FF0000"/>
+                <w:sz w:val="21"/>
+                <w:szCs w:val="21"/>
+              </w:rPr>
+              <w:t>将来</w:t>
+            </w:r>
+            <w:r>
+              <w:rPr>
+                <w:rFonts w:asciiTheme="minorHAnsi" w:eastAsiaTheme="minorHAnsi" w:hAnsiTheme="minorHAnsi" w:hint="eastAsia"/>
+                <w:color w:val="FF0000"/>
+                <w:sz w:val="21"/>
+                <w:szCs w:val="21"/>
+              </w:rPr>
+              <w:t>役に立つ研究です」だけでなく、研究の疑問と</w:t>
+            </w:r>
+            <w:r>
+              <w:rPr>
+                <w:rFonts w:asciiTheme="minorHAnsi" w:eastAsiaTheme="minorHAnsi" w:hAnsiTheme="minorHAnsi" w:hint="eastAsia"/>
+                <w:color w:val="FF0000"/>
+                <w:sz w:val="21"/>
+                <w:szCs w:val="21"/>
+              </w:rPr>
+              <w:t>明らかにしたいことと、今回の</w:t>
+            </w:r>
+            <w:r>
+              <w:rPr>
+                <w:rFonts w:asciiTheme="minorHAnsi" w:eastAsiaTheme="minorHAnsi" w:hAnsiTheme="minorHAnsi" w:hint="eastAsia"/>
+                <w:color w:val="FF0000"/>
+                <w:sz w:val="21"/>
+                <w:szCs w:val="21"/>
+              </w:rPr>
+              <w:t>方法が結びついている理由を書く</w:t>
+            </w:r>
+            <w:r>
+              <w:rPr>
+                <w:rFonts w:asciiTheme="minorHAnsi" w:eastAsiaTheme="minorHAnsi" w:hAnsiTheme="minorHAnsi" w:hint="eastAsia"/>
+                <w:color w:val="FF0000"/>
+                <w:sz w:val="21"/>
+                <w:szCs w:val="21"/>
+              </w:rPr>
+              <w:t>欄</w:t>
+            </w:r>
+            <w:r>
+              <w:rPr>
+                <w:rFonts w:asciiTheme="minorHAnsi" w:eastAsiaTheme="minorHAnsi" w:hAnsiTheme="minorHAnsi" w:hint="eastAsia"/>
+                <w:color w:val="FF0000"/>
+                <w:sz w:val="21"/>
+                <w:szCs w:val="21"/>
+              </w:rPr>
+              <w:t>、と考えてください。</w:t>
+            </w:r>
           </w:p>
         </w:tc>
       </w:tr>
@@ -1668,7 +2529,6 @@
                 <w:sz w:val="21"/>
                 <w:szCs w:val="21"/>
               </w:rPr>
-              <w:lastRenderedPageBreak/>
               <w:t>1</w:t>
             </w:r>
             <w:r>
@@ -1807,7 +2667,79 @@
                 <w:sz w:val="21"/>
                 <w:szCs w:val="21"/>
               </w:rPr>
-              <w:t>研究目的を達成するために取得する情報等を項目化して記載して下さい。患者背景や既往歴等を研究に使用する場合はもれなく記載して下さい。</w:t>
+              <w:t>研究目的を達成するために取得する情報等を</w:t>
+            </w:r>
+            <w:r>
+              <w:rPr>
+                <w:rFonts w:asciiTheme="minorHAnsi" w:eastAsiaTheme="minorHAnsi" w:hAnsiTheme="minorHAnsi" w:hint="eastAsia"/>
+                <w:color w:val="FF0000"/>
+                <w:sz w:val="21"/>
+                <w:szCs w:val="21"/>
+              </w:rPr>
+              <w:t>「</w:t>
+            </w:r>
+            <w:r>
+              <w:rPr>
+                <w:rFonts w:asciiTheme="minorHAnsi" w:eastAsiaTheme="minorHAnsi" w:hAnsiTheme="minorHAnsi" w:hint="eastAsia"/>
+                <w:color w:val="FF0000"/>
+                <w:sz w:val="21"/>
+                <w:szCs w:val="21"/>
+              </w:rPr>
+              <w:t>項目化</w:t>
+            </w:r>
+            <w:r>
+              <w:rPr>
+                <w:rFonts w:asciiTheme="minorHAnsi" w:eastAsiaTheme="minorHAnsi" w:hAnsiTheme="minorHAnsi" w:hint="eastAsia"/>
+                <w:color w:val="FF0000"/>
+                <w:sz w:val="21"/>
+                <w:szCs w:val="21"/>
+              </w:rPr>
+              <w:t>」</w:t>
+            </w:r>
+            <w:r>
+              <w:rPr>
+                <w:rFonts w:asciiTheme="minorHAnsi" w:eastAsiaTheme="minorHAnsi" w:hAnsiTheme="minorHAnsi" w:hint="eastAsia"/>
+                <w:color w:val="FF0000"/>
+                <w:sz w:val="21"/>
+                <w:szCs w:val="21"/>
+              </w:rPr>
+              <w:t>して記載して下さい。患者背景や既往歴等を研究に使用する場合は</w:t>
+            </w:r>
+            <w:r>
+              <w:rPr>
+                <w:rFonts w:asciiTheme="minorHAnsi" w:eastAsiaTheme="minorHAnsi" w:hAnsiTheme="minorHAnsi" w:hint="eastAsia"/>
+                <w:color w:val="FF0000"/>
+                <w:sz w:val="21"/>
+                <w:szCs w:val="21"/>
+              </w:rPr>
+              <w:t>、全て</w:t>
+            </w:r>
+            <w:r>
+              <w:rPr>
+                <w:rFonts w:asciiTheme="minorHAnsi" w:eastAsiaTheme="minorHAnsi" w:hAnsiTheme="minorHAnsi" w:hint="eastAsia"/>
+                <w:color w:val="FF0000"/>
+                <w:sz w:val="21"/>
+                <w:szCs w:val="21"/>
+              </w:rPr>
+              <w:t>もれなく記載して下さい。</w:t>
+            </w:r>
+            <w:r>
+              <w:rPr>
+                <w:rFonts w:asciiTheme="minorHAnsi" w:eastAsiaTheme="minorHAnsi" w:hAnsiTheme="minorHAnsi"/>
+                <w:color w:val="FF0000"/>
+                <w:sz w:val="21"/>
+                <w:szCs w:val="21"/>
+              </w:rPr>
+              <w:br/>
+            </w:r>
+            <w:r>
+              <w:rPr>
+                <w:rFonts w:asciiTheme="minorHAnsi" w:eastAsiaTheme="minorHAnsi" w:hAnsiTheme="minorHAnsi" w:hint="eastAsia"/>
+                <w:color w:val="FF0000"/>
+                <w:sz w:val="21"/>
+                <w:szCs w:val="21"/>
+              </w:rPr>
+              <w:t>ここに記載のない項目は、研究にも発表にも使うことはできません。</w:t>
             </w:r>
           </w:p>
         </w:tc>
@@ -1889,12 +2821,21 @@
               <w:mirrorIndents/>
               <w:jc w:val="both"/>
               <w:rPr>
-                <w:rFonts w:asciiTheme="minorHAnsi" w:eastAsiaTheme="minorHAnsi" w:hAnsiTheme="minorHAnsi"/>
-                <w:color w:val="FF0000"/>
-                <w:sz w:val="21"/>
-                <w:szCs w:val="21"/>
-              </w:rPr>
-            </w:pPr>
+                <w:rFonts w:asciiTheme="minorHAnsi" w:eastAsiaTheme="minorHAnsi" w:hAnsiTheme="minorHAnsi" w:hint="eastAsia"/>
+                <w:color w:val="FF0000"/>
+                <w:sz w:val="21"/>
+                <w:szCs w:val="21"/>
+              </w:rPr>
+            </w:pPr>
+            <w:r>
+              <w:rPr>
+                <w:rFonts w:asciiTheme="minorHAnsi" w:eastAsiaTheme="minorHAnsi" w:hAnsiTheme="minorHAnsi" w:hint="eastAsia"/>
+                <w:color w:val="FF0000"/>
+                <w:sz w:val="21"/>
+                <w:szCs w:val="21"/>
+              </w:rPr>
+              <w:t>統計解析に必要な期間まで含めて研究期間です。</w:t>
+            </w:r>
           </w:p>
         </w:tc>
       </w:tr>
@@ -2064,7 +3005,6 @@
               <w:ind w:leftChars="-29" w:left="-64"/>
               <w:contextualSpacing/>
               <w:mirrorIndents/>
-              <w:jc w:val="both"/>
               <w:rPr>
                 <w:rFonts w:asciiTheme="minorHAnsi" w:eastAsiaTheme="minorHAnsi" w:hAnsiTheme="minorHAnsi"/>
                 <w:color w:val="FF0000"/>
@@ -2098,23 +3038,21 @@
               <w:ind w:leftChars="-29" w:left="-64"/>
               <w:contextualSpacing/>
               <w:mirrorIndents/>
-              <w:jc w:val="both"/>
-              <w:rPr>
-                <w:rFonts w:asciiTheme="minorHAnsi" w:eastAsiaTheme="minorHAnsi" w:hAnsiTheme="minorHAnsi"/>
-                <w:color w:val="FF0000"/>
-                <w:sz w:val="21"/>
-                <w:szCs w:val="21"/>
-              </w:rPr>
-            </w:pPr>
-          </w:p>
-          <w:p>
-            <w:pPr>
-              <w:snapToGrid w:val="0"/>
-              <w:spacing w:after="0" w:line="240" w:lineRule="auto"/>
-              <w:ind w:leftChars="-29" w:left="-64"/>
-              <w:contextualSpacing/>
-              <w:mirrorIndents/>
-              <w:jc w:val="both"/>
+              <w:rPr>
+                <w:rFonts w:asciiTheme="minorHAnsi" w:eastAsiaTheme="minorHAnsi" w:hAnsiTheme="minorHAnsi"/>
+                <w:color w:val="FF0000"/>
+                <w:sz w:val="21"/>
+                <w:szCs w:val="21"/>
+              </w:rPr>
+            </w:pPr>
+          </w:p>
+          <w:p>
+            <w:pPr>
+              <w:snapToGrid w:val="0"/>
+              <w:spacing w:after="0" w:line="240" w:lineRule="auto"/>
+              <w:ind w:leftChars="-29" w:left="-64"/>
+              <w:contextualSpacing/>
+              <w:mirrorIndents/>
               <w:rPr>
                 <w:rFonts w:asciiTheme="minorHAnsi" w:eastAsiaTheme="minorHAnsi" w:hAnsiTheme="minorHAnsi"/>
                 <w:color w:val="FF0000"/>
@@ -2167,64 +3105,105 @@
               <w:ind w:leftChars="-29" w:left="-64"/>
               <w:contextualSpacing/>
               <w:mirrorIndents/>
-              <w:jc w:val="both"/>
-              <w:rPr>
-                <w:rFonts w:asciiTheme="minorHAnsi" w:eastAsiaTheme="minorHAnsi" w:hAnsiTheme="minorHAnsi"/>
-                <w:color w:val="FF0000"/>
-                <w:sz w:val="21"/>
-                <w:szCs w:val="21"/>
-              </w:rPr>
-            </w:pPr>
-          </w:p>
-          <w:p>
-            <w:pPr>
-              <w:snapToGrid w:val="0"/>
-              <w:spacing w:after="0" w:line="240" w:lineRule="auto"/>
-              <w:ind w:leftChars="-29" w:left="-64"/>
-              <w:contextualSpacing/>
-              <w:mirrorIndents/>
-              <w:jc w:val="both"/>
-              <w:rPr>
-                <w:rFonts w:asciiTheme="minorHAnsi" w:eastAsiaTheme="minorHAnsi" w:hAnsiTheme="minorHAnsi"/>
-                <w:color w:val="FF0000"/>
-                <w:sz w:val="21"/>
-                <w:szCs w:val="21"/>
-              </w:rPr>
-            </w:pPr>
-            <w:r>
-              <w:rPr>
-                <w:rFonts w:asciiTheme="minorHAnsi" w:eastAsiaTheme="minorHAnsi" w:hAnsiTheme="minorHAnsi" w:hint="eastAsia"/>
-                <w:color w:val="FF0000"/>
-                <w:sz w:val="21"/>
-                <w:szCs w:val="21"/>
-              </w:rPr>
-              <w:t>・「既存の仮名加工情報」は研究開始の時点ですでに「仮名加工情報」となっている情報を利用するときに選択できます。該当するかどうかご再考ください。本研究で取得する診療録は該当しませんのでご注意ください。</w:t>
-            </w:r>
-          </w:p>
-          <w:p>
-            <w:pPr>
-              <w:snapToGrid w:val="0"/>
-              <w:spacing w:after="0" w:line="240" w:lineRule="auto"/>
-              <w:ind w:leftChars="-29" w:left="-64"/>
-              <w:contextualSpacing/>
-              <w:mirrorIndents/>
-              <w:jc w:val="both"/>
-              <w:rPr>
-                <w:rFonts w:asciiTheme="minorHAnsi" w:eastAsiaTheme="minorHAnsi" w:hAnsiTheme="minorHAnsi"/>
-                <w:color w:val="FF0000"/>
-                <w:sz w:val="21"/>
-                <w:szCs w:val="21"/>
-              </w:rPr>
-            </w:pPr>
-          </w:p>
-          <w:p>
-            <w:pPr>
-              <w:snapToGrid w:val="0"/>
-              <w:spacing w:after="0" w:line="240" w:lineRule="auto"/>
-              <w:ind w:leftChars="-29" w:left="-64"/>
-              <w:contextualSpacing/>
-              <w:mirrorIndents/>
-              <w:jc w:val="both"/>
+              <w:rPr>
+                <w:rFonts w:asciiTheme="minorHAnsi" w:eastAsiaTheme="minorHAnsi" w:hAnsiTheme="minorHAnsi"/>
+                <w:color w:val="FF0000"/>
+                <w:sz w:val="21"/>
+                <w:szCs w:val="21"/>
+              </w:rPr>
+            </w:pPr>
+          </w:p>
+          <w:p>
+            <w:pPr>
+              <w:snapToGrid w:val="0"/>
+              <w:spacing w:after="0" w:line="240" w:lineRule="auto"/>
+              <w:ind w:leftChars="-29" w:left="-64"/>
+              <w:contextualSpacing/>
+              <w:mirrorIndents/>
+              <w:rPr>
+                <w:rFonts w:asciiTheme="minorHAnsi" w:eastAsiaTheme="minorHAnsi" w:hAnsiTheme="minorHAnsi"/>
+                <w:color w:val="FF0000"/>
+                <w:sz w:val="21"/>
+                <w:szCs w:val="21"/>
+              </w:rPr>
+            </w:pPr>
+            <w:r>
+              <w:rPr>
+                <w:rFonts w:asciiTheme="minorHAnsi" w:eastAsiaTheme="minorHAnsi" w:hAnsiTheme="minorHAnsi" w:hint="eastAsia"/>
+                <w:color w:val="FF0000"/>
+                <w:sz w:val="21"/>
+                <w:szCs w:val="21"/>
+              </w:rPr>
+              <w:t>・「既存の仮名加工情報」は研究開始の時点ですでに「仮名加工情報」となっている情報を利用するときに選択</w:t>
+            </w:r>
+            <w:r>
+              <w:rPr>
+                <w:rFonts w:asciiTheme="minorHAnsi" w:eastAsiaTheme="minorHAnsi" w:hAnsiTheme="minorHAnsi" w:hint="eastAsia"/>
+                <w:color w:val="FF0000"/>
+                <w:sz w:val="21"/>
+                <w:szCs w:val="21"/>
+              </w:rPr>
+              <w:t>します。研究の手順で仮名加工する場合は、</w:t>
+            </w:r>
+            <w:r>
+              <w:rPr>
+                <w:rFonts w:asciiTheme="minorHAnsi" w:eastAsiaTheme="minorHAnsi" w:hAnsiTheme="minorHAnsi" w:hint="eastAsia"/>
+                <w:color w:val="FF0000"/>
+                <w:sz w:val="21"/>
+                <w:szCs w:val="21"/>
+              </w:rPr>
+              <w:t>該当しません。</w:t>
+            </w:r>
+            <w:r>
+              <w:rPr>
+                <w:rFonts w:asciiTheme="minorHAnsi" w:eastAsiaTheme="minorHAnsi" w:hAnsiTheme="minorHAnsi" w:hint="eastAsia"/>
+                <w:color w:val="FF0000"/>
+                <w:sz w:val="21"/>
+                <w:szCs w:val="21"/>
+              </w:rPr>
+              <w:t>該当するかどうかご再考ください。</w:t>
+            </w:r>
+            <w:r>
+              <w:rPr>
+                <w:rFonts w:asciiTheme="minorHAnsi" w:eastAsiaTheme="minorHAnsi" w:hAnsiTheme="minorHAnsi"/>
+                <w:color w:val="FF0000"/>
+                <w:sz w:val="21"/>
+                <w:szCs w:val="21"/>
+              </w:rPr>
+              <w:br/>
+            </w:r>
+            <w:r>
+              <w:rPr>
+                <w:rFonts w:asciiTheme="minorHAnsi" w:eastAsiaTheme="minorHAnsi" w:hAnsiTheme="minorHAnsi" w:hint="eastAsia"/>
+                <w:color w:val="FF0000"/>
+                <w:sz w:val="21"/>
+                <w:szCs w:val="21"/>
+              </w:rPr>
+              <w:t>本研究で取得する診療録は該当しませんのでご注意ください。</w:t>
+            </w:r>
+          </w:p>
+          <w:p>
+            <w:pPr>
+              <w:snapToGrid w:val="0"/>
+              <w:spacing w:after="0" w:line="240" w:lineRule="auto"/>
+              <w:ind w:leftChars="-29" w:left="-64"/>
+              <w:contextualSpacing/>
+              <w:mirrorIndents/>
+              <w:rPr>
+                <w:rFonts w:asciiTheme="minorHAnsi" w:eastAsiaTheme="minorHAnsi" w:hAnsiTheme="minorHAnsi"/>
+                <w:color w:val="FF0000"/>
+                <w:sz w:val="21"/>
+                <w:szCs w:val="21"/>
+              </w:rPr>
+            </w:pPr>
+          </w:p>
+          <w:p>
+            <w:pPr>
+              <w:snapToGrid w:val="0"/>
+              <w:spacing w:after="0" w:line="240" w:lineRule="auto"/>
+              <w:ind w:leftChars="-29" w:left="-64"/>
+              <w:contextualSpacing/>
+              <w:mirrorIndents/>
               <w:rPr>
                 <w:rFonts w:asciiTheme="minorHAnsi" w:eastAsiaTheme="minorHAnsi" w:hAnsiTheme="minorHAnsi"/>
                 <w:color w:val="FF0000"/>
@@ -2267,23 +3246,21 @@
               <w:ind w:leftChars="-29" w:left="-64"/>
               <w:contextualSpacing/>
               <w:mirrorIndents/>
-              <w:jc w:val="both"/>
-              <w:rPr>
-                <w:rFonts w:asciiTheme="minorHAnsi" w:eastAsiaTheme="minorHAnsi" w:hAnsiTheme="minorHAnsi"/>
-                <w:color w:val="FF0000"/>
-                <w:sz w:val="21"/>
-                <w:szCs w:val="21"/>
-              </w:rPr>
-            </w:pPr>
-          </w:p>
-          <w:p>
-            <w:pPr>
-              <w:snapToGrid w:val="0"/>
-              <w:spacing w:after="0" w:line="240" w:lineRule="auto"/>
-              <w:ind w:leftChars="-29" w:left="-64"/>
-              <w:contextualSpacing/>
-              <w:mirrorIndents/>
-              <w:jc w:val="both"/>
+              <w:rPr>
+                <w:rFonts w:asciiTheme="minorHAnsi" w:eastAsiaTheme="minorHAnsi" w:hAnsiTheme="minorHAnsi"/>
+                <w:color w:val="FF0000"/>
+                <w:sz w:val="21"/>
+                <w:szCs w:val="21"/>
+              </w:rPr>
+            </w:pPr>
+          </w:p>
+          <w:p>
+            <w:pPr>
+              <w:snapToGrid w:val="0"/>
+              <w:spacing w:after="0" w:line="240" w:lineRule="auto"/>
+              <w:ind w:leftChars="-29" w:left="-64"/>
+              <w:contextualSpacing/>
+              <w:mirrorIndents/>
               <w:rPr>
                 <w:rFonts w:asciiTheme="minorHAnsi" w:eastAsiaTheme="minorHAnsi" w:hAnsiTheme="minorHAnsi"/>
                 <w:color w:val="FF0000"/>
@@ -2308,7 +3285,6 @@
               <w:ind w:leftChars="-29" w:left="-64"/>
               <w:contextualSpacing/>
               <w:mirrorIndents/>
-              <w:jc w:val="both"/>
               <w:rPr>
                 <w:rFonts w:asciiTheme="minorHAnsi" w:eastAsiaTheme="minorHAnsi" w:hAnsiTheme="minorHAnsi"/>
                 <w:color w:val="FF0000"/>
@@ -2333,7 +3309,6 @@
               <w:ind w:leftChars="-29" w:left="-64"/>
               <w:contextualSpacing/>
               <w:mirrorIndents/>
-              <w:jc w:val="both"/>
               <w:rPr>
                 <w:rFonts w:asciiTheme="minorHAnsi" w:eastAsiaTheme="minorHAnsi" w:hAnsiTheme="minorHAnsi"/>
                 <w:color w:val="FF0000"/>
@@ -2380,7 +3355,6 @@
               <w:ind w:leftChars="-29" w:left="-64"/>
               <w:contextualSpacing/>
               <w:mirrorIndents/>
-              <w:jc w:val="both"/>
               <w:rPr>
                 <w:rFonts w:asciiTheme="minorHAnsi" w:eastAsiaTheme="minorHAnsi" w:hAnsiTheme="minorHAnsi"/>
                 <w:color w:val="FF0000"/>
@@ -2438,6 +3412,7 @@
                 <w:sz w:val="21"/>
                 <w:szCs w:val="21"/>
               </w:rPr>
+              <w:lastRenderedPageBreak/>
               <w:t>2</w:t>
             </w:r>
             <w:r>
@@ -2717,7 +3692,6 @@
               <w:ind w:leftChars="-29" w:left="-64"/>
               <w:contextualSpacing/>
               <w:mirrorIndents/>
-              <w:jc w:val="both"/>
               <w:rPr>
                 <w:rFonts w:asciiTheme="minorHAnsi" w:eastAsiaTheme="minorHAnsi" w:hAnsiTheme="minorHAnsi"/>
                 <w:color w:val="EE0000"/>
@@ -2741,7 +3715,25 @@
                 <w:sz w:val="21"/>
                 <w:szCs w:val="21"/>
               </w:rPr>
-              <w:t>インフォームドアセントは不要ではないでしょうか？</w:t>
+              <w:t>インフォームド</w:t>
+            </w:r>
+            <w:r>
+              <w:rPr>
+                <w:rFonts w:asciiTheme="minorHAnsi" w:eastAsiaTheme="minorHAnsi" w:hAnsiTheme="minorHAnsi" w:hint="eastAsia"/>
+                <w:color w:val="EE0000"/>
+                <w:sz w:val="21"/>
+                <w:szCs w:val="21"/>
+              </w:rPr>
+              <w:t>・</w:t>
+            </w:r>
+            <w:r>
+              <w:rPr>
+                <w:rFonts w:asciiTheme="minorHAnsi" w:eastAsiaTheme="minorHAnsi" w:hAnsiTheme="minorHAnsi" w:hint="eastAsia"/>
+                <w:color w:val="EE0000"/>
+                <w:sz w:val="21"/>
+                <w:szCs w:val="21"/>
+              </w:rPr>
+              <w:t>アセントは不要ではないでしょうか？</w:t>
             </w:r>
           </w:p>
           <w:p>
@@ -2754,7 +3746,6 @@
               <w:ind w:leftChars="-29" w:left="-64"/>
               <w:contextualSpacing/>
               <w:mirrorIndents/>
-              <w:jc w:val="both"/>
               <w:rPr>
                 <w:rFonts w:asciiTheme="minorHAnsi" w:eastAsiaTheme="minorHAnsi" w:hAnsiTheme="minorHAnsi"/>
                 <w:color w:val="EE0000"/>
@@ -2769,15 +3760,33 @@
                 <w:sz w:val="21"/>
                 <w:szCs w:val="21"/>
               </w:rPr>
-              <w:t>インフォームドアセントは判断能力が不十分により、通常の同意説明文書により同意取得ができない、</w:t>
-            </w:r>
-            <w:r>
-              <w:rPr>
-                <w:rFonts w:asciiTheme="minorHAnsi" w:eastAsiaTheme="minorHAnsi" w:hAnsiTheme="minorHAnsi"/>
+              <w:t>インフォームド</w:t>
+            </w:r>
+            <w:r>
+              <w:rPr>
+                <w:rFonts w:asciiTheme="minorHAnsi" w:eastAsiaTheme="minorHAnsi" w:hAnsiTheme="minorHAnsi" w:hint="eastAsia"/>
                 <w:color w:val="EE0000"/>
                 <w:sz w:val="21"/>
                 <w:szCs w:val="21"/>
               </w:rPr>
+              <w:t>・</w:t>
+            </w:r>
+            <w:r>
+              <w:rPr>
+                <w:rFonts w:asciiTheme="minorHAnsi" w:eastAsiaTheme="minorHAnsi" w:hAnsiTheme="minorHAnsi" w:hint="eastAsia"/>
+                <w:color w:val="EE0000"/>
+                <w:sz w:val="21"/>
+                <w:szCs w:val="21"/>
+              </w:rPr>
+              <w:t>アセントは判断能力が不十分により、通常の同意説明文書により同意取得ができない、</w:t>
+            </w:r>
+            <w:r>
+              <w:rPr>
+                <w:rFonts w:asciiTheme="minorHAnsi" w:eastAsiaTheme="minorHAnsi" w:hAnsiTheme="minorHAnsi"/>
+                <w:color w:val="EE0000"/>
+                <w:sz w:val="21"/>
+                <w:szCs w:val="21"/>
+              </w:rPr>
               <w:t>16</w:t>
             </w:r>
             <w:r>
@@ -2787,7 +3796,61 @@
                 <w:sz w:val="21"/>
                 <w:szCs w:val="21"/>
               </w:rPr>
-              <w:t>歳以上の小児や、障害をもった成人等への同意補助になります。不要と考えますが、もし必要でしたら、インフォームドアセント文書の作成をお願いします。</w:t>
+              <w:t>歳以上の小児や、障害をもった成人等への同意補助になります。</w:t>
+            </w:r>
+            <w:r>
+              <w:rPr>
+                <w:rFonts w:asciiTheme="minorHAnsi" w:eastAsiaTheme="minorHAnsi" w:hAnsiTheme="minorHAnsi"/>
+                <w:color w:val="EE0000"/>
+                <w:sz w:val="21"/>
+                <w:szCs w:val="21"/>
+              </w:rPr>
+              <w:br/>
+            </w:r>
+            <w:r>
+              <w:rPr>
+                <w:rFonts w:asciiTheme="minorHAnsi" w:eastAsiaTheme="minorHAnsi" w:hAnsiTheme="minorHAnsi" w:hint="eastAsia"/>
+                <w:color w:val="EE0000"/>
+                <w:sz w:val="21"/>
+                <w:szCs w:val="21"/>
+              </w:rPr>
+              <w:t>もし必要でしたら、インフォームド</w:t>
+            </w:r>
+            <w:r>
+              <w:rPr>
+                <w:rFonts w:asciiTheme="minorHAnsi" w:eastAsiaTheme="minorHAnsi" w:hAnsiTheme="minorHAnsi" w:hint="eastAsia"/>
+                <w:color w:val="EE0000"/>
+                <w:sz w:val="21"/>
+                <w:szCs w:val="21"/>
+              </w:rPr>
+              <w:t>・</w:t>
+            </w:r>
+            <w:r>
+              <w:rPr>
+                <w:rFonts w:asciiTheme="minorHAnsi" w:eastAsiaTheme="minorHAnsi" w:hAnsiTheme="minorHAnsi" w:hint="eastAsia"/>
+                <w:color w:val="EE0000"/>
+                <w:sz w:val="21"/>
+                <w:szCs w:val="21"/>
+              </w:rPr>
+              <w:t>アセント文書の作成</w:t>
+            </w:r>
+            <w:r>
+              <w:rPr>
+                <w:rFonts w:asciiTheme="minorHAnsi" w:eastAsiaTheme="minorHAnsi" w:hAnsiTheme="minorHAnsi" w:hint="eastAsia"/>
+                <w:color w:val="EE0000"/>
+                <w:sz w:val="21"/>
+                <w:szCs w:val="21"/>
+              </w:rPr>
+              <w:t>と添付</w:t>
+            </w:r>
+            <w:r>
+              <w:rPr>
+                <w:rFonts w:asciiTheme="minorHAnsi" w:eastAsiaTheme="minorHAnsi" w:hAnsiTheme="minorHAnsi" w:hint="eastAsia"/>
+                <w:color w:val="EE0000"/>
+                <w:sz w:val="21"/>
+                <w:szCs w:val="21"/>
+              </w:rPr>
+              <w:t>をお願いします。</w:t>
             </w:r>
           </w:p>
         </w:tc>
@@ -2830,7 +3893,6 @@
                 <w:sz w:val="21"/>
                 <w:szCs w:val="21"/>
               </w:rPr>
-              <w:lastRenderedPageBreak/>
               <w:t>24. 代諾者の選定</w:t>
             </w:r>
           </w:p>
@@ -2867,7 +3929,16 @@
                 <w:sz w:val="21"/>
                 <w:szCs w:val="21"/>
               </w:rPr>
-              <w:t>代諾者を置かない場合は、「同意文書・同意撤回文書」から代諾者用の署名欄を削除するほうが安心です。</w:t>
+              <w:t>代諾者を置かない場合は、「同意文書・同意撤回文書」から代諾者用の署名欄を削除</w:t>
+            </w:r>
+            <w:r>
+              <w:rPr>
+                <w:rFonts w:asciiTheme="minorHAnsi" w:eastAsiaTheme="minorHAnsi" w:hAnsiTheme="minorHAnsi" w:hint="eastAsia"/>
+                <w:color w:val="EE0000"/>
+                <w:sz w:val="21"/>
+                <w:szCs w:val="21"/>
+              </w:rPr>
+              <w:t>してください。</w:t>
             </w:r>
           </w:p>
         </w:tc>
@@ -2946,8 +4017,173 @@
                 <w:sz w:val="21"/>
                 <w:szCs w:val="21"/>
               </w:rPr>
-              <w:t>対応表について「作成しない」でお間違いないでしょうか。同意撤回を受けるためには対応表が必要です。ご確認ください。</w:t>
-            </w:r>
+              <w:t>対応表について「作成しない」でお間違いないでしょうか。</w:t>
+            </w:r>
+            <w:r>
+              <w:rPr>
+                <w:rFonts w:asciiTheme="minorHAnsi" w:eastAsiaTheme="minorHAnsi" w:hAnsiTheme="minorHAnsi" w:hint="eastAsia"/>
+                <w:color w:val="FF0000"/>
+                <w:sz w:val="21"/>
+                <w:szCs w:val="21"/>
+              </w:rPr>
+              <w:t>本研究で</w:t>
+            </w:r>
+            <w:r>
+              <w:rPr>
+                <w:rFonts w:asciiTheme="minorHAnsi" w:eastAsiaTheme="minorHAnsi" w:hAnsiTheme="minorHAnsi" w:hint="eastAsia"/>
+                <w:color w:val="FF0000"/>
+                <w:sz w:val="21"/>
+                <w:szCs w:val="21"/>
+              </w:rPr>
+              <w:t>同意撤回を受けるためには対応表が必要です。ご確認ください。</w:t>
+            </w:r>
+            <w:r>
+              <w:rPr>
+                <w:rFonts w:asciiTheme="minorHAnsi" w:eastAsiaTheme="minorHAnsi" w:hAnsiTheme="minorHAnsi"/>
+                <w:color w:val="FF0000"/>
+                <w:sz w:val="21"/>
+                <w:szCs w:val="21"/>
+              </w:rPr>
+              <w:br/>
+            </w:r>
+          </w:p>
+          <w:p>
+            <w:pPr>
+              <w:snapToGrid w:val="0"/>
+              <w:spacing w:after="0" w:line="240" w:lineRule="auto"/>
+              <w:ind w:leftChars="-29" w:left="-64"/>
+              <w:contextualSpacing/>
+              <w:mirrorIndents/>
+              <w:jc w:val="both"/>
+              <w:rPr>
+                <w:rFonts w:asciiTheme="minorHAnsi" w:eastAsiaTheme="minorHAnsi" w:hAnsiTheme="minorHAnsi"/>
+                <w:color w:val="FF0000"/>
+                <w:sz w:val="21"/>
+                <w:szCs w:val="21"/>
+              </w:rPr>
+            </w:pPr>
+            <w:r>
+              <w:rPr>
+                <w:rFonts w:asciiTheme="minorHAnsi" w:eastAsiaTheme="minorHAnsi" w:hAnsiTheme="minorHAnsi" w:hint="eastAsia"/>
+                <w:color w:val="FF0000"/>
+                <w:sz w:val="21"/>
+                <w:szCs w:val="21"/>
+              </w:rPr>
+              <w:t>個人情報等の管理責任者</w:t>
+            </w:r>
+            <w:r>
+              <w:rPr>
+                <w:rFonts w:asciiTheme="minorHAnsi" w:eastAsiaTheme="minorHAnsi" w:hAnsiTheme="minorHAnsi" w:hint="eastAsia"/>
+                <w:color w:val="FF0000"/>
+                <w:sz w:val="21"/>
+                <w:szCs w:val="21"/>
+              </w:rPr>
+              <w:t>は、「</w:t>
+            </w:r>
+            <w:r>
+              <w:rPr>
+                <w:rFonts w:asciiTheme="minorHAnsi" w:eastAsiaTheme="minorHAnsi" w:hAnsiTheme="minorHAnsi" w:hint="eastAsia"/>
+                <w:color w:val="FF0000"/>
+                <w:sz w:val="21"/>
+                <w:szCs w:val="21"/>
+              </w:rPr>
+              <w:t>研究責任者</w:t>
+            </w:r>
+            <w:r>
+              <w:rPr>
+                <w:rFonts w:asciiTheme="minorHAnsi" w:eastAsiaTheme="minorHAnsi" w:hAnsiTheme="minorHAnsi" w:hint="eastAsia"/>
+                <w:color w:val="FF0000"/>
+                <w:sz w:val="21"/>
+                <w:szCs w:val="21"/>
+              </w:rPr>
+              <w:t>」が兼ねることが可能です。</w:t>
+            </w:r>
+          </w:p>
+          <w:p>
+            <w:pPr>
+              <w:snapToGrid w:val="0"/>
+              <w:spacing w:after="0" w:line="240" w:lineRule="auto"/>
+              <w:ind w:leftChars="-29" w:left="-64"/>
+              <w:contextualSpacing/>
+              <w:mirrorIndents/>
+              <w:jc w:val="both"/>
+              <w:rPr>
+                <w:rFonts w:asciiTheme="minorHAnsi" w:eastAsiaTheme="minorHAnsi" w:hAnsiTheme="minorHAnsi"/>
+                <w:color w:val="FF0000"/>
+                <w:sz w:val="21"/>
+                <w:szCs w:val="21"/>
+              </w:rPr>
+            </w:pPr>
+            <w:r>
+              <w:rPr>
+                <w:rFonts w:asciiTheme="minorHAnsi" w:eastAsiaTheme="minorHAnsi" w:hAnsiTheme="minorHAnsi" w:hint="eastAsia"/>
+                <w:color w:val="FF0000"/>
+                <w:sz w:val="21"/>
+                <w:szCs w:val="21"/>
+              </w:rPr>
+              <w:t>もし、</w:t>
+            </w:r>
+            <w:r>
+              <w:rPr>
+                <w:rFonts w:asciiTheme="minorHAnsi" w:eastAsiaTheme="minorHAnsi" w:hAnsiTheme="minorHAnsi" w:hint="eastAsia"/>
+                <w:color w:val="FF0000"/>
+                <w:sz w:val="21"/>
+                <w:szCs w:val="21"/>
+              </w:rPr>
+              <w:t>研究責任者とは別に、「</w:t>
+            </w:r>
+            <w:r>
+              <w:rPr>
+                <w:rFonts w:asciiTheme="minorHAnsi" w:eastAsiaTheme="minorHAnsi" w:hAnsiTheme="minorHAnsi" w:hint="eastAsia"/>
+                <w:color w:val="FF0000"/>
+                <w:sz w:val="21"/>
+                <w:szCs w:val="21"/>
+              </w:rPr>
+              <w:t>個人情報管理責任者</w:t>
+            </w:r>
+            <w:r>
+              <w:rPr>
+                <w:rFonts w:asciiTheme="minorHAnsi" w:eastAsiaTheme="minorHAnsi" w:hAnsiTheme="minorHAnsi" w:hint="eastAsia"/>
+                <w:color w:val="FF0000"/>
+                <w:sz w:val="21"/>
+                <w:szCs w:val="21"/>
+              </w:rPr>
+              <w:t>」をおきたい場合は、</w:t>
+            </w:r>
+            <w:r>
+              <w:rPr>
+                <w:rFonts w:asciiTheme="minorHAnsi" w:eastAsiaTheme="minorHAnsi" w:hAnsiTheme="minorHAnsi"/>
+                <w:color w:val="FF0000"/>
+                <w:sz w:val="21"/>
+                <w:szCs w:val="21"/>
+              </w:rPr>
+              <w:t>4. その他研究に携わる者</w:t>
+            </w:r>
+            <w:r>
+              <w:rPr>
+                <w:rFonts w:asciiTheme="minorHAnsi" w:eastAsiaTheme="minorHAnsi" w:hAnsiTheme="minorHAnsi" w:hint="eastAsia"/>
+                <w:color w:val="FF0000"/>
+                <w:sz w:val="21"/>
+                <w:szCs w:val="21"/>
+              </w:rPr>
+              <w:t>と同意説明文書の両方に忘れずに記載してください。</w:t>
+            </w:r>
+          </w:p>
+          <w:p>
+            <w:pPr>
+              <w:snapToGrid w:val="0"/>
+              <w:spacing w:after="0" w:line="240" w:lineRule="auto"/>
+              <w:ind w:leftChars="-29" w:left="-64"/>
+              <w:contextualSpacing/>
+              <w:mirrorIndents/>
+              <w:jc w:val="both"/>
+              <w:rPr>
+                <w:rFonts w:asciiTheme="minorHAnsi" w:eastAsiaTheme="minorHAnsi" w:hAnsiTheme="minorHAnsi"/>
+                <w:color w:val="FF0000"/>
+                <w:sz w:val="21"/>
+                <w:szCs w:val="21"/>
+              </w:rPr>
+            </w:pPr>
           </w:p>
         </w:tc>
       </w:tr>
@@ -3060,17 +4296,37 @@
             <w:pPr>
               <w:snapToGrid w:val="0"/>
               <w:spacing w:after="0" w:line="240" w:lineRule="auto"/>
-              <w:ind w:leftChars="-29" w:left="-64"/>
-              <w:contextualSpacing/>
-              <w:mirrorIndents/>
-              <w:jc w:val="both"/>
-              <w:rPr>
-                <w:rFonts w:asciiTheme="minorHAnsi" w:eastAsiaTheme="minorHAnsi" w:hAnsiTheme="minorHAnsi"/>
-                <w:color w:val="FF0000"/>
-                <w:sz w:val="21"/>
-                <w:szCs w:val="21"/>
-              </w:rPr>
-            </w:pPr>
+              <w:ind w:leftChars="-29" w:left="-64" w:firstLineChars="100" w:firstLine="210"/>
+              <w:contextualSpacing/>
+              <w:mirrorIndents/>
+              <w:jc w:val="both"/>
+              <w:rPr>
+                <w:rFonts w:asciiTheme="minorHAnsi" w:eastAsiaTheme="minorHAnsi" w:hAnsiTheme="minorHAnsi"/>
+                <w:color w:val="FF0000"/>
+                <w:sz w:val="21"/>
+                <w:szCs w:val="21"/>
+              </w:rPr>
+            </w:pPr>
+            <w:r>
+              <w:rPr>
+                <w:rFonts w:asciiTheme="minorHAnsi" w:eastAsiaTheme="minorHAnsi" w:hAnsiTheme="minorHAnsi" w:hint="eastAsia"/>
+                <w:color w:val="FF0000"/>
+                <w:sz w:val="21"/>
+                <w:szCs w:val="21"/>
+                <w:u w:val="single"/>
+              </w:rPr>
+              <w:t>■</w:t>
+            </w:r>
+            <w:r>
+              <w:rPr>
+                <w:rFonts w:asciiTheme="minorHAnsi" w:eastAsiaTheme="minorHAnsi" w:hAnsiTheme="minorHAnsi" w:hint="eastAsia"/>
+                <w:color w:val="FF0000"/>
+                <w:sz w:val="21"/>
+                <w:szCs w:val="21"/>
+                <w:u w:val="single"/>
+              </w:rPr>
+              <w:t>継続保管あり</w:t>
+            </w:r>
             <w:r>
               <w:rPr>
                 <w:rFonts w:asciiTheme="minorHAnsi" w:eastAsiaTheme="minorHAnsi" w:hAnsiTheme="minorHAnsi"/>
@@ -3086,27 +4342,17 @@
                 <w:color w:val="FF0000"/>
                 <w:sz w:val="21"/>
                 <w:szCs w:val="21"/>
-                <w:u w:val="single"/>
-              </w:rPr>
-              <w:t>継続保管あり</w:t>
-            </w:r>
-            <w:r>
-              <w:rPr>
-                <w:rFonts w:asciiTheme="minorHAnsi" w:eastAsiaTheme="minorHAnsi" w:hAnsiTheme="minorHAnsi"/>
-                <w:color w:val="FF0000"/>
-                <w:sz w:val="21"/>
-                <w:szCs w:val="21"/>
-              </w:rPr>
-              <w:t xml:space="preserve"> </w:t>
-            </w:r>
-            <w:r>
-              <w:rPr>
-                <w:rFonts w:asciiTheme="minorHAnsi" w:eastAsiaTheme="minorHAnsi" w:hAnsiTheme="minorHAnsi" w:hint="eastAsia"/>
-                <w:color w:val="FF0000"/>
-                <w:sz w:val="21"/>
-                <w:szCs w:val="21"/>
               </w:rPr>
               <w:t>＞</w:t>
+            </w:r>
+            <w:r>
+              <w:rPr>
+                <w:rFonts w:asciiTheme="minorHAnsi" w:eastAsiaTheme="minorHAnsi" w:hAnsiTheme="minorHAnsi" w:hint="eastAsia"/>
+                <w:color w:val="FF0000"/>
+                <w:sz w:val="21"/>
+                <w:szCs w:val="21"/>
+              </w:rPr>
+              <w:t>■</w:t>
             </w:r>
             <w:r>
               <w:rPr>
@@ -3159,6 +4405,7 @@
                 <w:sz w:val="21"/>
                 <w:szCs w:val="21"/>
               </w:rPr>
+              <w:lastRenderedPageBreak/>
               <w:t>27. 試料・情報の保管場所</w:t>
             </w:r>
           </w:p>
@@ -3195,7 +4442,36 @@
                 <w:sz w:val="21"/>
                 <w:szCs w:val="21"/>
               </w:rPr>
-              <w:t>・「試料の保管場所」について、試料がない場合は「</w:t>
+              <w:t>・「試料の保管場所」について、</w:t>
+            </w:r>
+            <w:r>
+              <w:rPr>
+                <w:rFonts w:asciiTheme="minorHAnsi" w:eastAsiaTheme="minorHAnsi" w:hAnsiTheme="minorHAnsi" w:hint="eastAsia"/>
+                <w:b/>
+                <w:bCs/>
+                <w:color w:val="FF0000"/>
+                <w:sz w:val="21"/>
+                <w:szCs w:val="21"/>
+              </w:rPr>
+              <w:t>試料</w:t>
+            </w:r>
+            <w:r>
+              <w:rPr>
+                <w:rFonts w:asciiTheme="minorHAnsi" w:eastAsiaTheme="minorHAnsi" w:hAnsiTheme="minorHAnsi" w:hint="eastAsia"/>
+                <w:color w:val="FF0000"/>
+                <w:sz w:val="21"/>
+                <w:szCs w:val="21"/>
+              </w:rPr>
+              <w:t>（血液などの生体サンプル）</w:t>
+            </w:r>
+            <w:r>
+              <w:rPr>
+                <w:rFonts w:asciiTheme="minorHAnsi" w:eastAsiaTheme="minorHAnsi" w:hAnsiTheme="minorHAnsi" w:hint="eastAsia"/>
+                <w:color w:val="FF0000"/>
+                <w:sz w:val="21"/>
+                <w:szCs w:val="21"/>
+              </w:rPr>
+              <w:t>がない場合は「</w:t>
             </w:r>
             <w:r>
               <w:rPr>
@@ -3255,7 +4531,34 @@
                 <w:sz w:val="21"/>
                 <w:szCs w:val="21"/>
               </w:rPr>
-              <w:t>・「情報の保管場所」は変更不要です。</w:t>
+              <w:t>・「情報の保管場所」は</w:t>
+            </w:r>
+            <w:r>
+              <w:rPr>
+                <w:rFonts w:asciiTheme="minorHAnsi" w:eastAsiaTheme="minorHAnsi" w:hAnsiTheme="minorHAnsi" w:hint="eastAsia"/>
+                <w:color w:val="FF0000"/>
+                <w:sz w:val="21"/>
+                <w:szCs w:val="21"/>
+              </w:rPr>
+              <w:t>、「学内から切り離されたコンピューター～</w:t>
+            </w:r>
+            <w:r>
+              <w:rPr>
+                <w:rFonts w:asciiTheme="minorHAnsi" w:eastAsiaTheme="minorHAnsi" w:hAnsiTheme="minorHAnsi" w:hint="eastAsia"/>
+                <w:color w:val="FF0000"/>
+                <w:sz w:val="21"/>
+                <w:szCs w:val="21"/>
+              </w:rPr>
+              <w:t>」を選択するか、その他の部分も活用して、本研究での情報の保管場所を</w:t>
+            </w:r>
+            <w:r>
+              <w:rPr>
+                <w:rFonts w:asciiTheme="minorHAnsi" w:eastAsiaTheme="minorHAnsi" w:hAnsiTheme="minorHAnsi" w:hint="eastAsia"/>
+                <w:color w:val="FF0000"/>
+                <w:sz w:val="21"/>
+                <w:szCs w:val="21"/>
+              </w:rPr>
+              <w:t>ご記載ください。</w:t>
             </w:r>
           </w:p>
         </w:tc>
@@ -3404,7 +4707,27 @@
                 <w:sz w:val="21"/>
                 <w:szCs w:val="21"/>
               </w:rPr>
-              <w:t>新規の申請では、特段の理由がない限り現行の指針にて審査を行っております。「</w:t>
+              <w:t>新規の申請では、特段の理由がない限り</w:t>
+            </w:r>
+            <w:r>
+              <w:rPr>
+                <w:rFonts w:asciiTheme="minorHAnsi" w:eastAsiaTheme="minorHAnsi" w:hAnsiTheme="minorHAnsi" w:hint="eastAsia"/>
+                <w:b/>
+                <w:bCs/>
+                <w:color w:val="FF0000"/>
+                <w:sz w:val="21"/>
+                <w:szCs w:val="21"/>
+              </w:rPr>
+              <w:t>現行の指針</w:t>
+            </w:r>
+            <w:r>
+              <w:rPr>
+                <w:rFonts w:asciiTheme="minorHAnsi" w:eastAsiaTheme="minorHAnsi" w:hAnsiTheme="minorHAnsi" w:hint="eastAsia"/>
+                <w:color w:val="FF0000"/>
+                <w:sz w:val="21"/>
+                <w:szCs w:val="21"/>
+              </w:rPr>
+              <w:t>にて審査を行っております。「</w:t>
             </w:r>
             <w:r>
               <w:rPr>
@@ -3423,7 +4746,16 @@
                 <w:sz w:val="21"/>
                 <w:szCs w:val="21"/>
               </w:rPr>
-              <w:t>」に修正をお願いします。</w:t>
+              <w:t>」</w:t>
+            </w:r>
+            <w:r>
+              <w:rPr>
+                <w:rFonts w:asciiTheme="minorHAnsi" w:eastAsiaTheme="minorHAnsi" w:hAnsiTheme="minorHAnsi" w:hint="eastAsia"/>
+                <w:color w:val="FF0000"/>
+                <w:sz w:val="21"/>
+                <w:szCs w:val="21"/>
+              </w:rPr>
+              <w:t>を選択してください。</w:t>
             </w:r>
           </w:p>
         </w:tc>
@@ -3609,7 +4941,27 @@
                 <w:szCs w:val="21"/>
                 <w:highlight w:val="yellow"/>
               </w:rPr>
-              <w:t>COIシステムで【審査必要】となっている場合は「利益相反状態あり」になります。ただし、Q1に薬剤名しかない研究は「利益相反状態なし」でOKです。読んだら消してください！！</w:t>
+              <w:t>COIシステムで【審査必要】となっている場合は「利益相反状態あり」になります。ただし、Q1に薬剤名しかない研究は「利益相反状態なし」でOKです。読んだら</w:t>
+            </w:r>
+            <w:r>
+              <w:rPr>
+                <w:rFonts w:asciiTheme="minorHAnsi" w:eastAsiaTheme="minorHAnsi" w:hAnsiTheme="minorHAnsi" w:hint="eastAsia"/>
+                <w:color w:val="FF0000"/>
+                <w:sz w:val="21"/>
+                <w:szCs w:val="21"/>
+                <w:highlight w:val="yellow"/>
+              </w:rPr>
+              <w:t>このメッセージは</w:t>
+            </w:r>
+            <w:r>
+              <w:rPr>
+                <w:rFonts w:asciiTheme="minorHAnsi" w:eastAsiaTheme="minorHAnsi" w:hAnsiTheme="minorHAnsi" w:hint="eastAsia"/>
+                <w:color w:val="FF0000"/>
+                <w:sz w:val="21"/>
+                <w:szCs w:val="21"/>
+                <w:highlight w:val="yellow"/>
+              </w:rPr>
+              <w:t>消してください！！</w:t>
             </w:r>
           </w:p>
           <w:p>
@@ -3691,12 +5043,39 @@
               <w:mirrorIndents/>
               <w:jc w:val="both"/>
               <w:rPr>
-                <w:rFonts w:asciiTheme="minorHAnsi" w:eastAsiaTheme="minorHAnsi" w:hAnsiTheme="minorHAnsi"/>
-                <w:color w:val="FF0000"/>
-                <w:sz w:val="21"/>
-                <w:szCs w:val="21"/>
-              </w:rPr>
-            </w:pPr>
+                <w:rFonts w:asciiTheme="minorHAnsi" w:eastAsiaTheme="minorHAnsi" w:hAnsiTheme="minorHAnsi" w:hint="eastAsia"/>
+                <w:color w:val="FF0000"/>
+                <w:sz w:val="21"/>
+                <w:szCs w:val="21"/>
+              </w:rPr>
+            </w:pPr>
+            <w:r>
+              <w:rPr>
+                <w:rFonts w:asciiTheme="minorHAnsi" w:eastAsiaTheme="minorHAnsi" w:hAnsiTheme="minorHAnsi"/>
+                <w:color w:val="FF0000"/>
+                <w:sz w:val="21"/>
+                <w:szCs w:val="21"/>
+              </w:rPr>
+              <w:t>介入を行う研究は、研究開始前に公開データベースへの登録が必要です。介入を行わない研究も、登録に努める必要があります</w:t>
+            </w:r>
+            <w:r>
+              <w:rPr>
+                <w:rFonts w:asciiTheme="minorHAnsi" w:eastAsiaTheme="minorHAnsi" w:hAnsiTheme="minorHAnsi" w:hint="eastAsia"/>
+                <w:color w:val="FF0000"/>
+                <w:sz w:val="21"/>
+                <w:szCs w:val="21"/>
+              </w:rPr>
+              <w:t>が任意です</w:t>
+            </w:r>
+            <w:r>
+              <w:rPr>
+                <w:rFonts w:asciiTheme="minorHAnsi" w:eastAsiaTheme="minorHAnsi" w:hAnsiTheme="minorHAnsi"/>
+                <w:color w:val="FF0000"/>
+                <w:sz w:val="21"/>
+                <w:szCs w:val="21"/>
+              </w:rPr>
+              <w:t>。</w:t>
+            </w:r>
           </w:p>
         </w:tc>
       </w:tr>
@@ -3831,12 +5210,30 @@
               <w:mirrorIndents/>
               <w:jc w:val="both"/>
               <w:rPr>
-                <w:rFonts w:asciiTheme="minorHAnsi" w:eastAsiaTheme="minorHAnsi" w:hAnsiTheme="minorHAnsi"/>
-                <w:color w:val="FF0000"/>
-                <w:sz w:val="21"/>
-                <w:szCs w:val="21"/>
-              </w:rPr>
-            </w:pPr>
+                <w:rFonts w:asciiTheme="minorHAnsi" w:eastAsiaTheme="minorHAnsi" w:hAnsiTheme="minorHAnsi" w:hint="eastAsia"/>
+                <w:color w:val="FF0000"/>
+                <w:sz w:val="21"/>
+                <w:szCs w:val="21"/>
+              </w:rPr>
+            </w:pPr>
+            <w:r>
+              <w:rPr>
+                <w:rFonts w:asciiTheme="minorHAnsi" w:eastAsiaTheme="minorHAnsi" w:hAnsiTheme="minorHAnsi" w:hint="eastAsia"/>
+                <w:color w:val="FF0000"/>
+                <w:sz w:val="21"/>
+                <w:szCs w:val="21"/>
+              </w:rPr>
+              <w:t>同意説明文書に記載する</w:t>
+            </w:r>
+            <w:r>
+              <w:rPr>
+                <w:rFonts w:asciiTheme="minorHAnsi" w:eastAsiaTheme="minorHAnsi" w:hAnsiTheme="minorHAnsi" w:hint="eastAsia"/>
+                <w:color w:val="FF0000"/>
+                <w:sz w:val="21"/>
+                <w:szCs w:val="21"/>
+              </w:rPr>
+              <w:t>のと同様の研究対象者からの問合せ先となります。</w:t>
+            </w:r>
           </w:p>
         </w:tc>
       </w:tr>
@@ -4195,17 +5592,7 @@
                 <w:sz w:val="21"/>
                 <w:szCs w:val="21"/>
               </w:rPr>
-              <w:t>・「偶発的所見」とは、研究の過程において偶然見つかった、生命に重大な影響を及ぼすおそれのある情報（例えば、がんや遺伝病への罹患等）を指しま</w:t>
-            </w:r>
-            <w:r>
-              <w:rPr>
-                <w:rFonts w:asciiTheme="minorHAnsi" w:eastAsiaTheme="minorHAnsi" w:hAnsiTheme="minorHAnsi" w:hint="eastAsia"/>
-                <w:color w:val="FF0000"/>
-                <w:sz w:val="21"/>
-                <w:szCs w:val="21"/>
-              </w:rPr>
-              <w:lastRenderedPageBreak/>
-              <w:t>す。本研究を実施するうえでそれらの所見を得る可能性がない場合は「</w:t>
+              <w:t>・「偶発的所見」とは、研究の過程において偶然見つかった、生命に重大な影響を及ぼすおそれのある情報（例えば、がんや遺伝病への罹患等）を指します。本研究を実施するうえでそれらの所見を得る可能性がない場合は「</w:t>
             </w:r>
             <w:r>
               <w:rPr>
@@ -4267,7 +5654,6 @@
                 <w:sz w:val="21"/>
                 <w:szCs w:val="21"/>
               </w:rPr>
-              <w:lastRenderedPageBreak/>
               <w:t>40. 緊急かつ明白な生命の危険が生じている状況における研究の実施</w:t>
             </w:r>
           </w:p>
@@ -4338,6 +5724,7 @@
                 <w:sz w:val="21"/>
                 <w:szCs w:val="21"/>
               </w:rPr>
+              <w:lastRenderedPageBreak/>
               <w:t>41. 研究対象者等の経済的負担の有無と内容</w:t>
             </w:r>
           </w:p>
@@ -5133,7 +6520,6 @@
                 <w:sz w:val="21"/>
                 <w:szCs w:val="21"/>
               </w:rPr>
-              <w:lastRenderedPageBreak/>
               <w:t xml:space="preserve">49. モニタリングの実施 </w:t>
             </w:r>
           </w:p>
@@ -5156,12 +6542,21 @@
               <w:mirrorIndents/>
               <w:jc w:val="both"/>
               <w:rPr>
-                <w:rFonts w:asciiTheme="minorHAnsi" w:eastAsiaTheme="minorHAnsi" w:hAnsiTheme="minorHAnsi"/>
-                <w:color w:val="FF0000"/>
-                <w:sz w:val="21"/>
-                <w:szCs w:val="21"/>
-              </w:rPr>
-            </w:pPr>
+                <w:rFonts w:asciiTheme="minorHAnsi" w:eastAsiaTheme="minorHAnsi" w:hAnsiTheme="minorHAnsi" w:hint="eastAsia"/>
+                <w:color w:val="FF0000"/>
+                <w:sz w:val="21"/>
+                <w:szCs w:val="21"/>
+              </w:rPr>
+            </w:pPr>
+            <w:r>
+              <w:rPr>
+                <w:rFonts w:asciiTheme="minorHAnsi" w:eastAsiaTheme="minorHAnsi" w:hAnsiTheme="minorHAnsi" w:hint="eastAsia"/>
+                <w:color w:val="FF0000"/>
+                <w:sz w:val="21"/>
+                <w:szCs w:val="21"/>
+              </w:rPr>
+              <w:t>侵襲（軽微な侵襲を除く）かつ、介入研究の場合はモニタリングの必要があります。</w:t>
+            </w:r>
           </w:p>
         </w:tc>
       </w:tr>
@@ -5582,10 +6977,11 @@
             <w:pPr>
               <w:snapToGrid w:val="0"/>
               <w:spacing w:after="0" w:line="240" w:lineRule="auto"/>
-              <w:contextualSpacing/>
-              <w:mirrorIndents/>
-              <w:rPr>
-                <w:rFonts w:asciiTheme="minorHAnsi" w:eastAsiaTheme="minorHAnsi" w:hAnsiTheme="minorHAnsi" w:hint="eastAsia"/>
+              <w:ind w:leftChars="-29" w:left="-64"/>
+              <w:contextualSpacing/>
+              <w:mirrorIndents/>
+              <w:rPr>
+                <w:rFonts w:asciiTheme="minorHAnsi" w:eastAsiaTheme="minorHAnsi" w:hAnsiTheme="minorHAnsi"/>
                 <w:color w:val="000000" w:themeColor="text1"/>
                 <w:sz w:val="21"/>
                 <w:szCs w:val="21"/>
@@ -5594,75 +6990,18 @@
           </w:p>
           <w:p>
             <w:pPr>
-              <w:snapToGrid w:val="0"/>
-              <w:spacing w:after="0" w:line="240" w:lineRule="auto"/>
-              <w:contextualSpacing/>
-              <w:mirrorIndents/>
-              <w:rPr>
-                <w:rFonts w:asciiTheme="minorHAnsi" w:eastAsiaTheme="minorHAnsi" w:hAnsiTheme="minorHAnsi"/>
-                <w:color w:val="000000" w:themeColor="text1"/>
-                <w:sz w:val="21"/>
-                <w:szCs w:val="21"/>
-              </w:rPr>
-            </w:pPr>
-            <w:r>
-              <w:rPr>
-                <w:rFonts w:asciiTheme="minorHAnsi" w:eastAsiaTheme="minorHAnsi" w:hAnsiTheme="minorHAnsi" w:hint="eastAsia"/>
-                <w:color w:val="000000" w:themeColor="text1"/>
-                <w:sz w:val="21"/>
-                <w:szCs w:val="21"/>
-              </w:rPr>
-              <w:t>【ご協力お願いします】</w:t>
-            </w:r>
-          </w:p>
-          <w:p>
-            <w:pPr>
-              <w:snapToGrid w:val="0"/>
-              <w:spacing w:after="0" w:line="240" w:lineRule="auto"/>
-              <w:ind w:leftChars="-29" w:left="-64" w:firstLineChars="100" w:firstLine="210"/>
-              <w:contextualSpacing/>
-              <w:mirrorIndents/>
-              <w:rPr>
-                <w:rFonts w:asciiTheme="minorHAnsi" w:eastAsiaTheme="minorHAnsi" w:hAnsiTheme="minorHAnsi"/>
-                <w:color w:val="000000" w:themeColor="text1"/>
-                <w:sz w:val="21"/>
-                <w:szCs w:val="21"/>
-                <w:u w:val="single"/>
-              </w:rPr>
-            </w:pPr>
-            <w:r>
-              <w:rPr>
-                <w:rFonts w:asciiTheme="minorHAnsi" w:eastAsiaTheme="minorHAnsi" w:hAnsiTheme="minorHAnsi" w:hint="eastAsia"/>
-                <w:color w:val="000000" w:themeColor="text1"/>
-                <w:sz w:val="21"/>
-                <w:szCs w:val="21"/>
-                <w:u w:val="single"/>
-              </w:rPr>
-              <w:t>スムーズな審査のために、上記</w:t>
-            </w:r>
-            <w:r>
-              <w:rPr>
-                <w:rFonts w:asciiTheme="minorHAnsi" w:eastAsiaTheme="minorHAnsi" w:hAnsiTheme="minorHAnsi" w:hint="eastAsia"/>
-                <w:color w:val="000000" w:themeColor="text1"/>
-                <w:sz w:val="21"/>
-                <w:szCs w:val="21"/>
-                <w:u w:val="single"/>
-              </w:rPr>
-              <w:t>Bの</w:t>
-            </w:r>
-            <w:r>
-              <w:rPr>
-                <w:rFonts w:asciiTheme="minorHAnsi" w:eastAsiaTheme="minorHAnsi" w:hAnsiTheme="minorHAnsi" w:hint="eastAsia"/>
-                <w:color w:val="000000" w:themeColor="text1"/>
-                <w:sz w:val="21"/>
-                <w:szCs w:val="21"/>
-                <w:u w:val="single"/>
-              </w:rPr>
-              <w:t>書類は</w:t>
-            </w:r>
-            <w:r>
-              <w:rPr>
-                <w:rFonts w:asciiTheme="minorHAnsi" w:eastAsiaTheme="minorHAnsi" w:hAnsiTheme="minorHAnsi" w:hint="eastAsia"/>
+              <w:pStyle w:val="a6"/>
+              <w:numPr>
+                <w:ilvl w:val="0"/>
+                <w:numId w:val="3"/>
+              </w:numPr>
+              <w:snapToGrid w:val="0"/>
+              <w:spacing w:after="0" w:line="240" w:lineRule="auto"/>
+              <w:ind w:leftChars="0"/>
+              <w:contextualSpacing/>
+              <w:mirrorIndents/>
+              <w:rPr>
+                <w:rFonts w:asciiTheme="minorHAnsi" w:eastAsiaTheme="minorHAnsi" w:hAnsiTheme="minorHAnsi"/>
                 <w:b/>
                 <w:bCs/>
                 <w:color w:val="000000" w:themeColor="text1"/>
@@ -5670,57 +7009,7 @@
                 <w:szCs w:val="21"/>
                 <w:u w:val="single"/>
               </w:rPr>
-              <w:t>「変更履歴」「コメント」</w:t>
-            </w:r>
-            <w:r>
-              <w:rPr>
-                <w:rFonts w:asciiTheme="minorHAnsi" w:eastAsiaTheme="minorHAnsi" w:hAnsiTheme="minorHAnsi" w:hint="eastAsia"/>
-                <w:color w:val="000000" w:themeColor="text1"/>
-                <w:sz w:val="21"/>
-                <w:szCs w:val="21"/>
-                <w:u w:val="single"/>
-              </w:rPr>
-              <w:t>を削除してから、システムに再アップロードをお願いします。</w:t>
-            </w:r>
-          </w:p>
-          <w:p>
-            <w:pPr>
-              <w:snapToGrid w:val="0"/>
-              <w:spacing w:after="0" w:line="240" w:lineRule="auto"/>
-              <w:ind w:leftChars="-29" w:left="-64"/>
-              <w:contextualSpacing/>
-              <w:mirrorIndents/>
-              <w:rPr>
-                <w:rFonts w:asciiTheme="minorHAnsi" w:eastAsiaTheme="minorHAnsi" w:hAnsiTheme="minorHAnsi"/>
-                <w:color w:val="000000" w:themeColor="text1"/>
-                <w:sz w:val="21"/>
-                <w:szCs w:val="21"/>
-              </w:rPr>
-            </w:pPr>
-          </w:p>
-          <w:p>
-            <w:pPr>
-              <w:snapToGrid w:val="0"/>
-              <w:spacing w:after="0" w:line="240" w:lineRule="auto"/>
-              <w:ind w:leftChars="-29" w:left="-64"/>
-              <w:contextualSpacing/>
-              <w:mirrorIndents/>
-              <w:rPr>
-                <w:rFonts w:asciiTheme="minorHAnsi" w:eastAsiaTheme="minorHAnsi" w:hAnsiTheme="minorHAnsi"/>
-                <w:color w:val="000000" w:themeColor="text1"/>
-                <w:sz w:val="21"/>
-                <w:szCs w:val="21"/>
-              </w:rPr>
-            </w:pPr>
-            <w:r>
-              <w:rPr>
-                <w:rFonts w:asciiTheme="minorHAnsi" w:eastAsiaTheme="minorHAnsi" w:hAnsiTheme="minorHAnsi" w:hint="eastAsia"/>
-                <w:color w:val="000000" w:themeColor="text1"/>
-                <w:sz w:val="21"/>
-                <w:szCs w:val="21"/>
-              </w:rPr>
-              <w:t>★</w:t>
-            </w:r>
+            </w:pPr>
             <w:r>
               <w:rPr>
                 <w:rFonts w:asciiTheme="minorHAnsi" w:eastAsiaTheme="minorHAnsi" w:hAnsiTheme="minorHAnsi" w:hint="eastAsia"/>
@@ -5729,152 +7018,9 @@
                 <w:color w:val="000000" w:themeColor="text1"/>
                 <w:sz w:val="21"/>
                 <w:szCs w:val="21"/>
-              </w:rPr>
-              <w:t>「変更履歴」</w:t>
-            </w:r>
-            <w:r>
-              <w:rPr>
-                <w:rFonts w:asciiTheme="minorHAnsi" w:eastAsiaTheme="minorHAnsi" w:hAnsiTheme="minorHAnsi" w:hint="eastAsia"/>
-                <w:color w:val="000000" w:themeColor="text1"/>
-                <w:sz w:val="21"/>
-                <w:szCs w:val="21"/>
-              </w:rPr>
-              <w:t>の削除方法</w:t>
-            </w:r>
-          </w:p>
-          <w:p>
-            <w:pPr>
-              <w:snapToGrid w:val="0"/>
-              <w:spacing w:after="0" w:line="240" w:lineRule="auto"/>
-              <w:ind w:leftChars="-29" w:left="-64"/>
-              <w:contextualSpacing/>
-              <w:mirrorIndents/>
-              <w:rPr>
-                <w:rFonts w:asciiTheme="minorHAnsi" w:eastAsiaTheme="minorHAnsi" w:hAnsiTheme="minorHAnsi"/>
-                <w:color w:val="000000" w:themeColor="text1"/>
-                <w:sz w:val="21"/>
-                <w:szCs w:val="21"/>
-              </w:rPr>
-            </w:pPr>
-            <w:r>
-              <w:rPr>
-                <w:rFonts w:asciiTheme="minorHAnsi" w:eastAsiaTheme="minorHAnsi" w:hAnsiTheme="minorHAnsi" w:hint="eastAsia"/>
-                <w:color w:val="000000" w:themeColor="text1"/>
-                <w:sz w:val="21"/>
-                <w:szCs w:val="21"/>
-              </w:rPr>
-              <w:t>校閲</w:t>
-            </w:r>
-            <w:r>
-              <w:rPr>
-                <w:rFonts w:asciiTheme="minorHAnsi" w:eastAsiaTheme="minorHAnsi" w:hAnsiTheme="minorHAnsi" w:hint="eastAsia"/>
-                <w:color w:val="000000" w:themeColor="text1"/>
-                <w:sz w:val="21"/>
-                <w:szCs w:val="21"/>
-              </w:rPr>
-              <w:t xml:space="preserve"> </w:t>
-            </w:r>
-            <w:r>
-              <w:rPr>
-                <w:rFonts w:asciiTheme="minorHAnsi" w:eastAsiaTheme="minorHAnsi" w:hAnsiTheme="minorHAnsi" w:hint="eastAsia"/>
-                <w:color w:val="000000" w:themeColor="text1"/>
-                <w:sz w:val="21"/>
-                <w:szCs w:val="21"/>
-              </w:rPr>
-              <w:t>＞</w:t>
-            </w:r>
-            <w:r>
-              <w:rPr>
-                <w:rFonts w:asciiTheme="minorHAnsi" w:eastAsiaTheme="minorHAnsi" w:hAnsiTheme="minorHAnsi" w:hint="eastAsia"/>
-                <w:color w:val="000000" w:themeColor="text1"/>
-                <w:sz w:val="21"/>
-                <w:szCs w:val="21"/>
-              </w:rPr>
-              <w:t xml:space="preserve"> </w:t>
-            </w:r>
-            <w:r>
-              <w:rPr>
-                <w:rFonts w:asciiTheme="minorHAnsi" w:eastAsiaTheme="minorHAnsi" w:hAnsiTheme="minorHAnsi" w:hint="eastAsia"/>
-                <w:color w:val="000000" w:themeColor="text1"/>
-                <w:sz w:val="21"/>
-                <w:szCs w:val="21"/>
-              </w:rPr>
-              <w:t>変更履歴：承諾ボタンの下向き矢印</w:t>
-            </w:r>
-            <w:r>
-              <w:rPr>
-                <w:rFonts w:asciiTheme="minorHAnsi" w:eastAsiaTheme="minorHAnsi" w:hAnsiTheme="minorHAnsi" w:hint="eastAsia"/>
-                <w:color w:val="000000" w:themeColor="text1"/>
-                <w:sz w:val="21"/>
-                <w:szCs w:val="21"/>
-              </w:rPr>
-              <w:t xml:space="preserve"> </w:t>
-            </w:r>
-            <w:r>
-              <w:rPr>
-                <w:rFonts w:asciiTheme="minorHAnsi" w:eastAsiaTheme="minorHAnsi" w:hAnsiTheme="minorHAnsi" w:hint="eastAsia"/>
-                <w:color w:val="000000" w:themeColor="text1"/>
-                <w:sz w:val="21"/>
-                <w:szCs w:val="21"/>
-              </w:rPr>
-              <w:t>＞</w:t>
-            </w:r>
-            <w:r>
-              <w:rPr>
-                <w:rFonts w:asciiTheme="minorHAnsi" w:eastAsiaTheme="minorHAnsi" w:hAnsiTheme="minorHAnsi" w:hint="eastAsia"/>
-                <w:color w:val="000000" w:themeColor="text1"/>
-                <w:sz w:val="21"/>
-                <w:szCs w:val="21"/>
-              </w:rPr>
-              <w:t xml:space="preserve"> </w:t>
-            </w:r>
-            <w:r>
-              <w:rPr>
-                <w:rFonts w:asciiTheme="minorHAnsi" w:eastAsiaTheme="minorHAnsi" w:hAnsiTheme="minorHAnsi" w:hint="eastAsia"/>
-                <w:color w:val="000000" w:themeColor="text1"/>
-                <w:sz w:val="21"/>
-                <w:szCs w:val="21"/>
-              </w:rPr>
-              <w:t>すべての変更を反映し、変更の記録を停止</w:t>
-            </w:r>
-          </w:p>
-          <w:p>
-            <w:pPr>
-              <w:snapToGrid w:val="0"/>
-              <w:spacing w:after="0" w:line="240" w:lineRule="auto"/>
-              <w:ind w:leftChars="-29" w:left="-64"/>
-              <w:contextualSpacing/>
-              <w:mirrorIndents/>
-              <w:rPr>
-                <w:rFonts w:asciiTheme="minorHAnsi" w:eastAsiaTheme="minorHAnsi" w:hAnsiTheme="minorHAnsi"/>
-                <w:color w:val="000000" w:themeColor="text1"/>
-                <w:sz w:val="21"/>
-                <w:szCs w:val="21"/>
-              </w:rPr>
-            </w:pPr>
-          </w:p>
-          <w:p>
-            <w:pPr>
-              <w:snapToGrid w:val="0"/>
-              <w:spacing w:after="0" w:line="240" w:lineRule="auto"/>
-              <w:ind w:leftChars="-29" w:left="-64"/>
-              <w:contextualSpacing/>
-              <w:mirrorIndents/>
-              <w:rPr>
-                <w:rFonts w:asciiTheme="minorHAnsi" w:eastAsiaTheme="minorHAnsi" w:hAnsiTheme="minorHAnsi"/>
-                <w:color w:val="000000" w:themeColor="text1"/>
-                <w:sz w:val="21"/>
-                <w:szCs w:val="21"/>
-              </w:rPr>
-            </w:pPr>
-            <w:r>
-              <w:rPr>
-                <w:rFonts w:asciiTheme="minorHAnsi" w:eastAsiaTheme="minorHAnsi" w:hAnsiTheme="minorHAnsi" w:hint="eastAsia"/>
-                <w:color w:val="000000" w:themeColor="text1"/>
-                <w:sz w:val="21"/>
-                <w:szCs w:val="21"/>
-              </w:rPr>
-              <w:t>★</w:t>
+                <w:u w:val="single"/>
+              </w:rPr>
+              <w:t>軽微な文言修正等を行った添付書類</w:t>
             </w:r>
             <w:r>
               <w:rPr>
@@ -5884,6 +7030,411 @@
                 <w:color w:val="000000" w:themeColor="text1"/>
                 <w:sz w:val="21"/>
                 <w:szCs w:val="21"/>
+                <w:u w:val="single"/>
+              </w:rPr>
+              <w:t>の再アップロード</w:t>
+            </w:r>
+            <w:r>
+              <w:rPr>
+                <w:rFonts w:asciiTheme="minorHAnsi" w:eastAsiaTheme="minorHAnsi" w:hAnsiTheme="minorHAnsi"/>
+                <w:b/>
+                <w:bCs/>
+                <w:color w:val="000000" w:themeColor="text1"/>
+                <w:sz w:val="21"/>
+                <w:szCs w:val="21"/>
+                <w:u w:val="single"/>
+              </w:rPr>
+              <w:br/>
+            </w:r>
+            <w:r>
+              <w:rPr>
+                <w:rFonts w:asciiTheme="minorHAnsi" w:eastAsiaTheme="minorHAnsi" w:hAnsiTheme="minorHAnsi"/>
+                <w:b/>
+                <w:bCs/>
+                <w:color w:val="000000" w:themeColor="text1"/>
+                <w:sz w:val="21"/>
+                <w:szCs w:val="21"/>
+              </w:rPr>
+              <w:t>(</w:t>
+            </w:r>
+            <w:r>
+              <w:rPr>
+                <w:rFonts w:asciiTheme="minorHAnsi" w:eastAsiaTheme="minorHAnsi" w:hAnsiTheme="minorHAnsi" w:hint="eastAsia"/>
+                <w:b/>
+                <w:bCs/>
+                <w:color w:val="000000" w:themeColor="text1"/>
+                <w:sz w:val="21"/>
+                <w:szCs w:val="21"/>
+              </w:rPr>
+              <w:t>下記修正箇所をご確認いただき、必要に応じて加筆修正を行ってください。</w:t>
+            </w:r>
+            <w:r>
+              <w:rPr>
+                <w:rFonts w:asciiTheme="minorHAnsi" w:eastAsiaTheme="minorHAnsi" w:hAnsiTheme="minorHAnsi"/>
+                <w:b/>
+                <w:bCs/>
+                <w:color w:val="000000" w:themeColor="text1"/>
+                <w:sz w:val="21"/>
+                <w:szCs w:val="21"/>
+              </w:rPr>
+              <w:t>)</w:t>
+            </w:r>
+          </w:p>
+          <w:p>
+            <w:pPr>
+              <w:snapToGrid w:val="0"/>
+              <w:spacing w:after="0" w:line="240" w:lineRule="auto"/>
+              <w:ind w:leftChars="-29" w:left="-64"/>
+              <w:contextualSpacing/>
+              <w:mirrorIndents/>
+              <w:rPr>
+                <w:rFonts w:asciiTheme="minorHAnsi" w:eastAsiaTheme="minorHAnsi" w:hAnsiTheme="minorHAnsi"/>
+                <w:color w:val="000000" w:themeColor="text1"/>
+                <w:sz w:val="21"/>
+                <w:szCs w:val="21"/>
+              </w:rPr>
+            </w:pPr>
+            <w:r>
+              <w:rPr>
+                <w:rFonts w:asciiTheme="minorHAnsi" w:eastAsiaTheme="minorHAnsi" w:hAnsiTheme="minorHAnsi" w:hint="eastAsia"/>
+                <w:color w:val="000000" w:themeColor="text1"/>
+                <w:sz w:val="21"/>
+                <w:szCs w:val="21"/>
+              </w:rPr>
+              <w:t xml:space="preserve">　・同意文書、同意撤回書</w:t>
+            </w:r>
+          </w:p>
+          <w:p>
+            <w:pPr>
+              <w:snapToGrid w:val="0"/>
+              <w:spacing w:after="0" w:line="240" w:lineRule="auto"/>
+              <w:ind w:leftChars="-29" w:left="-64"/>
+              <w:contextualSpacing/>
+              <w:mirrorIndents/>
+              <w:rPr>
+                <w:rFonts w:asciiTheme="minorHAnsi" w:eastAsiaTheme="minorHAnsi" w:hAnsiTheme="minorHAnsi"/>
+                <w:color w:val="000000" w:themeColor="text1"/>
+                <w:sz w:val="21"/>
+                <w:szCs w:val="21"/>
+              </w:rPr>
+            </w:pPr>
+            <w:r>
+              <w:rPr>
+                <w:rFonts w:asciiTheme="minorHAnsi" w:eastAsiaTheme="minorHAnsi" w:hAnsiTheme="minorHAnsi" w:hint="eastAsia"/>
+                <w:color w:val="000000" w:themeColor="text1"/>
+                <w:sz w:val="21"/>
+                <w:szCs w:val="21"/>
+              </w:rPr>
+              <w:t xml:space="preserve">　・研究計画内容変更の概要・対比表</w:t>
+            </w:r>
+          </w:p>
+          <w:p>
+            <w:pPr>
+              <w:snapToGrid w:val="0"/>
+              <w:spacing w:after="0" w:line="240" w:lineRule="auto"/>
+              <w:ind w:leftChars="-29" w:left="-64"/>
+              <w:contextualSpacing/>
+              <w:mirrorIndents/>
+              <w:rPr>
+                <w:rFonts w:asciiTheme="minorHAnsi" w:eastAsiaTheme="minorHAnsi" w:hAnsiTheme="minorHAnsi"/>
+                <w:color w:val="000000" w:themeColor="text1"/>
+                <w:sz w:val="21"/>
+                <w:szCs w:val="21"/>
+              </w:rPr>
+            </w:pPr>
+          </w:p>
+          <w:p>
+            <w:pPr>
+              <w:snapToGrid w:val="0"/>
+              <w:spacing w:after="0" w:line="240" w:lineRule="auto"/>
+              <w:contextualSpacing/>
+              <w:mirrorIndents/>
+              <w:rPr>
+                <w:rFonts w:asciiTheme="minorHAnsi" w:eastAsiaTheme="minorHAnsi" w:hAnsiTheme="minorHAnsi"/>
+                <w:color w:val="000000" w:themeColor="text1"/>
+                <w:sz w:val="21"/>
+                <w:szCs w:val="21"/>
+              </w:rPr>
+            </w:pPr>
+            <w:r>
+              <w:rPr>
+                <w:rFonts w:asciiTheme="minorHAnsi" w:eastAsiaTheme="minorHAnsi" w:hAnsiTheme="minorHAnsi" w:hint="eastAsia"/>
+                <w:color w:val="000000" w:themeColor="text1"/>
+                <w:sz w:val="21"/>
+                <w:szCs w:val="21"/>
+              </w:rPr>
+              <w:t>【ご協力お願いします】</w:t>
+            </w:r>
+          </w:p>
+          <w:p>
+            <w:pPr>
+              <w:snapToGrid w:val="0"/>
+              <w:spacing w:after="0" w:line="240" w:lineRule="auto"/>
+              <w:ind w:leftChars="-29" w:left="-64" w:firstLineChars="100" w:firstLine="210"/>
+              <w:contextualSpacing/>
+              <w:mirrorIndents/>
+              <w:rPr>
+                <w:rFonts w:asciiTheme="minorHAnsi" w:eastAsiaTheme="minorHAnsi" w:hAnsiTheme="minorHAnsi"/>
+                <w:color w:val="000000" w:themeColor="text1"/>
+                <w:sz w:val="21"/>
+                <w:szCs w:val="21"/>
+                <w:u w:val="single"/>
+              </w:rPr>
+            </w:pPr>
+            <w:r>
+              <w:rPr>
+                <w:rFonts w:asciiTheme="minorHAnsi" w:eastAsiaTheme="minorHAnsi" w:hAnsiTheme="minorHAnsi" w:hint="eastAsia"/>
+                <w:color w:val="000000" w:themeColor="text1"/>
+                <w:sz w:val="21"/>
+                <w:szCs w:val="21"/>
+                <w:u w:val="single"/>
+              </w:rPr>
+              <w:t>スムーズな審査のために、上記</w:t>
+            </w:r>
+            <w:r>
+              <w:rPr>
+                <w:rFonts w:asciiTheme="minorHAnsi" w:eastAsiaTheme="minorHAnsi" w:hAnsiTheme="minorHAnsi" w:hint="eastAsia"/>
+                <w:color w:val="000000" w:themeColor="text1"/>
+                <w:sz w:val="21"/>
+                <w:szCs w:val="21"/>
+                <w:u w:val="single"/>
+              </w:rPr>
+              <w:t>B,Cの</w:t>
+            </w:r>
+            <w:r>
+              <w:rPr>
+                <w:rFonts w:asciiTheme="minorHAnsi" w:eastAsiaTheme="minorHAnsi" w:hAnsiTheme="minorHAnsi" w:hint="eastAsia"/>
+                <w:color w:val="000000" w:themeColor="text1"/>
+                <w:sz w:val="21"/>
+                <w:szCs w:val="21"/>
+                <w:u w:val="single"/>
+              </w:rPr>
+              <w:t>書類は</w:t>
+            </w:r>
+            <w:r>
+              <w:rPr>
+                <w:rFonts w:asciiTheme="minorHAnsi" w:eastAsiaTheme="minorHAnsi" w:hAnsiTheme="minorHAnsi" w:hint="eastAsia"/>
+                <w:b/>
+                <w:bCs/>
+                <w:color w:val="000000" w:themeColor="text1"/>
+                <w:sz w:val="21"/>
+                <w:szCs w:val="21"/>
+                <w:u w:val="single"/>
+              </w:rPr>
+              <w:t>「変更履歴」「コメント」</w:t>
+            </w:r>
+            <w:r>
+              <w:rPr>
+                <w:rFonts w:asciiTheme="minorHAnsi" w:eastAsiaTheme="minorHAnsi" w:hAnsiTheme="minorHAnsi" w:hint="eastAsia"/>
+                <w:color w:val="000000" w:themeColor="text1"/>
+                <w:sz w:val="21"/>
+                <w:szCs w:val="21"/>
+                <w:u w:val="single"/>
+              </w:rPr>
+              <w:t>を削除してから、システムに再アップロードをお願いします。</w:t>
+            </w:r>
+          </w:p>
+          <w:p>
+            <w:pPr>
+              <w:snapToGrid w:val="0"/>
+              <w:spacing w:after="0" w:line="240" w:lineRule="auto"/>
+              <w:ind w:leftChars="-29" w:left="-64"/>
+              <w:contextualSpacing/>
+              <w:mirrorIndents/>
+              <w:rPr>
+                <w:rFonts w:asciiTheme="minorHAnsi" w:eastAsiaTheme="minorHAnsi" w:hAnsiTheme="minorHAnsi"/>
+                <w:color w:val="000000" w:themeColor="text1"/>
+                <w:sz w:val="21"/>
+                <w:szCs w:val="21"/>
+              </w:rPr>
+            </w:pPr>
+          </w:p>
+          <w:p>
+            <w:pPr>
+              <w:snapToGrid w:val="0"/>
+              <w:spacing w:after="0" w:line="240" w:lineRule="auto"/>
+              <w:ind w:leftChars="-29" w:left="-64"/>
+              <w:contextualSpacing/>
+              <w:mirrorIndents/>
+              <w:rPr>
+                <w:rFonts w:asciiTheme="minorHAnsi" w:eastAsiaTheme="minorHAnsi" w:hAnsiTheme="minorHAnsi"/>
+                <w:color w:val="000000" w:themeColor="text1"/>
+                <w:sz w:val="21"/>
+                <w:szCs w:val="21"/>
+              </w:rPr>
+            </w:pPr>
+            <w:r>
+              <w:rPr>
+                <w:rFonts w:asciiTheme="minorHAnsi" w:eastAsiaTheme="minorHAnsi" w:hAnsiTheme="minorHAnsi" w:hint="eastAsia"/>
+                <w:color w:val="000000" w:themeColor="text1"/>
+                <w:sz w:val="21"/>
+                <w:szCs w:val="21"/>
+              </w:rPr>
+              <w:t>★</w:t>
+            </w:r>
+            <w:r>
+              <w:rPr>
+                <w:rFonts w:asciiTheme="minorHAnsi" w:eastAsiaTheme="minorHAnsi" w:hAnsiTheme="minorHAnsi" w:hint="eastAsia"/>
+                <w:b/>
+                <w:bCs/>
+                <w:color w:val="000000" w:themeColor="text1"/>
+                <w:sz w:val="21"/>
+                <w:szCs w:val="21"/>
+              </w:rPr>
+              <w:t>「変更履歴」</w:t>
+            </w:r>
+            <w:r>
+              <w:rPr>
+                <w:rFonts w:asciiTheme="minorHAnsi" w:eastAsiaTheme="minorHAnsi" w:hAnsiTheme="minorHAnsi" w:hint="eastAsia"/>
+                <w:color w:val="000000" w:themeColor="text1"/>
+                <w:sz w:val="21"/>
+                <w:szCs w:val="21"/>
+              </w:rPr>
+              <w:t>の削除方法</w:t>
+            </w:r>
+          </w:p>
+          <w:p>
+            <w:pPr>
+              <w:snapToGrid w:val="0"/>
+              <w:spacing w:after="0" w:line="240" w:lineRule="auto"/>
+              <w:ind w:leftChars="-29" w:left="-64"/>
+              <w:contextualSpacing/>
+              <w:mirrorIndents/>
+              <w:rPr>
+                <w:rFonts w:asciiTheme="minorHAnsi" w:eastAsiaTheme="minorHAnsi" w:hAnsiTheme="minorHAnsi"/>
+                <w:color w:val="000000" w:themeColor="text1"/>
+                <w:sz w:val="21"/>
+                <w:szCs w:val="21"/>
+              </w:rPr>
+            </w:pPr>
+            <w:r>
+              <w:rPr>
+                <w:rFonts w:asciiTheme="minorHAnsi" w:eastAsiaTheme="minorHAnsi" w:hAnsiTheme="minorHAnsi" w:hint="eastAsia"/>
+                <w:color w:val="000000" w:themeColor="text1"/>
+                <w:sz w:val="21"/>
+                <w:szCs w:val="21"/>
+              </w:rPr>
+              <w:t>校閲</w:t>
+            </w:r>
+            <w:r>
+              <w:rPr>
+                <w:rFonts w:asciiTheme="minorHAnsi" w:eastAsiaTheme="minorHAnsi" w:hAnsiTheme="minorHAnsi" w:hint="eastAsia"/>
+                <w:color w:val="000000" w:themeColor="text1"/>
+                <w:sz w:val="21"/>
+                <w:szCs w:val="21"/>
+              </w:rPr>
+              <w:t xml:space="preserve"> </w:t>
+            </w:r>
+            <w:r>
+              <w:rPr>
+                <w:rFonts w:asciiTheme="minorHAnsi" w:eastAsiaTheme="minorHAnsi" w:hAnsiTheme="minorHAnsi" w:hint="eastAsia"/>
+                <w:color w:val="000000" w:themeColor="text1"/>
+                <w:sz w:val="21"/>
+                <w:szCs w:val="21"/>
+              </w:rPr>
+              <w:t>＞</w:t>
+            </w:r>
+            <w:r>
+              <w:rPr>
+                <w:rFonts w:asciiTheme="minorHAnsi" w:eastAsiaTheme="minorHAnsi" w:hAnsiTheme="minorHAnsi" w:hint="eastAsia"/>
+                <w:color w:val="000000" w:themeColor="text1"/>
+                <w:sz w:val="21"/>
+                <w:szCs w:val="21"/>
+              </w:rPr>
+              <w:t xml:space="preserve"> </w:t>
+            </w:r>
+            <w:r>
+              <w:rPr>
+                <w:rFonts w:asciiTheme="minorHAnsi" w:eastAsiaTheme="minorHAnsi" w:hAnsiTheme="minorHAnsi" w:hint="eastAsia"/>
+                <w:color w:val="000000" w:themeColor="text1"/>
+                <w:sz w:val="21"/>
+                <w:szCs w:val="21"/>
+              </w:rPr>
+              <w:t>変更履歴：承諾ボタンの下向き矢印</w:t>
+            </w:r>
+            <w:r>
+              <w:rPr>
+                <w:rFonts w:asciiTheme="minorHAnsi" w:eastAsiaTheme="minorHAnsi" w:hAnsiTheme="minorHAnsi" w:hint="eastAsia"/>
+                <w:color w:val="000000" w:themeColor="text1"/>
+                <w:sz w:val="21"/>
+                <w:szCs w:val="21"/>
+              </w:rPr>
+              <w:t xml:space="preserve"> </w:t>
+            </w:r>
+            <w:r>
+              <w:rPr>
+                <w:rFonts w:asciiTheme="minorHAnsi" w:eastAsiaTheme="minorHAnsi" w:hAnsiTheme="minorHAnsi" w:hint="eastAsia"/>
+                <w:color w:val="000000" w:themeColor="text1"/>
+                <w:sz w:val="21"/>
+                <w:szCs w:val="21"/>
+              </w:rPr>
+              <w:t>＞</w:t>
+            </w:r>
+            <w:r>
+              <w:rPr>
+                <w:rFonts w:asciiTheme="minorHAnsi" w:eastAsiaTheme="minorHAnsi" w:hAnsiTheme="minorHAnsi" w:hint="eastAsia"/>
+                <w:color w:val="000000" w:themeColor="text1"/>
+                <w:sz w:val="21"/>
+                <w:szCs w:val="21"/>
+              </w:rPr>
+              <w:t xml:space="preserve"> </w:t>
+            </w:r>
+            <w:r>
+              <w:rPr>
+                <w:rFonts w:asciiTheme="minorHAnsi" w:eastAsiaTheme="minorHAnsi" w:hAnsiTheme="minorHAnsi" w:hint="eastAsia"/>
+                <w:color w:val="000000" w:themeColor="text1"/>
+                <w:sz w:val="21"/>
+                <w:szCs w:val="21"/>
+              </w:rPr>
+              <w:t>すべての変更を反映し、変更の記録を停止</w:t>
+            </w:r>
+          </w:p>
+          <w:p>
+            <w:pPr>
+              <w:snapToGrid w:val="0"/>
+              <w:spacing w:after="0" w:line="240" w:lineRule="auto"/>
+              <w:ind w:leftChars="-29" w:left="-64"/>
+              <w:contextualSpacing/>
+              <w:mirrorIndents/>
+              <w:rPr>
+                <w:rFonts w:asciiTheme="minorHAnsi" w:eastAsiaTheme="minorHAnsi" w:hAnsiTheme="minorHAnsi"/>
+                <w:color w:val="000000" w:themeColor="text1"/>
+                <w:sz w:val="21"/>
+                <w:szCs w:val="21"/>
+              </w:rPr>
+            </w:pPr>
+          </w:p>
+          <w:p>
+            <w:pPr>
+              <w:snapToGrid w:val="0"/>
+              <w:spacing w:after="0" w:line="240" w:lineRule="auto"/>
+              <w:ind w:leftChars="-29" w:left="-64"/>
+              <w:contextualSpacing/>
+              <w:mirrorIndents/>
+              <w:rPr>
+                <w:rFonts w:asciiTheme="minorHAnsi" w:eastAsiaTheme="minorHAnsi" w:hAnsiTheme="minorHAnsi"/>
+                <w:color w:val="000000" w:themeColor="text1"/>
+                <w:sz w:val="21"/>
+                <w:szCs w:val="21"/>
+              </w:rPr>
+            </w:pPr>
+            <w:r>
+              <w:rPr>
+                <w:rFonts w:asciiTheme="minorHAnsi" w:eastAsiaTheme="minorHAnsi" w:hAnsiTheme="minorHAnsi" w:hint="eastAsia"/>
+                <w:color w:val="000000" w:themeColor="text1"/>
+                <w:sz w:val="21"/>
+                <w:szCs w:val="21"/>
+              </w:rPr>
+              <w:t>★</w:t>
+            </w:r>
+            <w:r>
+              <w:rPr>
+                <w:rFonts w:asciiTheme="minorHAnsi" w:eastAsiaTheme="minorHAnsi" w:hAnsiTheme="minorHAnsi" w:hint="eastAsia"/>
+                <w:b/>
+                <w:bCs/>
+                <w:color w:val="000000" w:themeColor="text1"/>
+                <w:sz w:val="21"/>
+                <w:szCs w:val="21"/>
               </w:rPr>
               <w:t>「コメント」</w:t>
             </w:r>
@@ -5998,7 +7549,7 @@
                 <w:szCs w:val="21"/>
               </w:rPr>
               <w:drawing>
-                <wp:anchor distT="0" distB="0" distL="114300" distR="114300" simplePos="0" relativeHeight="251660288" behindDoc="0" locked="0" layoutInCell="1" allowOverlap="1" wp14:anchorId="57FEA120" wp14:editId="2C42F5BE">
+                <wp:anchor distT="0" distB="0" distL="114300" distR="114300" simplePos="0" relativeHeight="251660288" behindDoc="0" locked="0" layoutInCell="1" allowOverlap="1" wp14:anchorId="57FEA120" wp14:editId="3A1B6A1F">
                   <wp:simplePos x="0" y="0"/>
                   <wp:positionH relativeFrom="column">
                     <wp:posOffset>-4868</wp:posOffset>

</xml_diff>